<commit_message>
Review & Reflection: Todd-in-a-Can moves below the rubric, in a shaded box on its own page
Co-Authored-By: Claude Opus 5.5 <noreply@anthropic.com>
</commit_message>
<xml_diff>
--- a/week-15-review-and-share/week-15-review-reflection.docx
+++ b/week-15-review-and-share/week-15-review-reflection.docx
@@ -192,173 +192,7 @@
           <w:color w:val="1F2933"/>
           <w:sz w:val="24"/>
         </w:rPr>
-        <w:t xml:space="preserve">3. Running Todd-in-a-Can</w:t>
-      </w:r>
-    </w:p>
-    <w:p>
-      <w:pPr>
-        <w:spacing w:after="60" w:before="0" w:line="259" w:lineRule="auto"/>
-      </w:pPr>
-      <w:r>
-        <w:rPr>
-          <w:b w:val="0"/>
-          <w:i w:val="0"/>
-          <w:color w:val="1F2933"/>
-          <w:sz w:val="21"/>
-        </w:rPr>
-        <w:t xml:space="preserve">Todd-in-a-Can is a prompt, not a website. Open your AI assistant (we recommend Gemini, since you all have Pro accounts), paste the prompt below, then paste your draft underneath it and send. Run it as often as it helps, and at least once before you submit. It reviews; it will not write your paper for you. That is the point.</w:t>
-      </w:r>
-    </w:p>
-    <w:p>
-      <w:pPr>
-        <w:spacing w:after="60" w:before="0" w:line="259" w:lineRule="auto"/>
-      </w:pPr>
-      <w:r>
-        <w:rPr>
-          <w:b/>
-          <w:i w:val="0"/>
-          <w:color w:val="1F2933"/>
-          <w:sz w:val="21"/>
-        </w:rPr>
-        <w:t xml:space="preserve">Paste from here:</w:t>
-      </w:r>
-    </w:p>
-    <w:p>
-      <w:pPr>
-        <w:pStyle w:val="Quote"/>
-      </w:pPr>
-      <w:r>
-        <w:t xml:space="preserve">You are Todd-in-a-Can, the AI reviewer for the TCE 318P Final Report. I will paste in a draft of my field-investigation paper. Read it the way a careful, encouraging methods instructor would, and tell me what a close reader notices, so I can make it stronger myself. The one rule that matters most: you review, you do not write. Do not rewrite my sentences, supply prose, invent data, or add citations for me. Point to what is there and what is missing, ask questions, and hand the revision back to me.</w:t>
-      </w:r>
-    </w:p>
-    <w:p>
-      <w:pPr>
-        <w:pStyle w:val="Quote"/>
-      </w:pPr>
-      <w:r>
-        <w:t xml:space="preserve">The paper answers two questions with real evidence: what did I seek to learn, and what did I learn? It runs about 1,500 to 2,100 words across five equally weighted parts, plus a short note on how AI helped that is not counted in that range. Read the draft part by part. For each, say briefly what is working, then name the single most useful thing to push on:</w:t>
-      </w:r>
-    </w:p>
-    <w:p>
-      <w:pPr>
-        <w:pStyle w:val="Quote"/>
-      </w:pPr>
-      <w:r>
-        <w:rPr>
-          <w:b/>
-        </w:rPr>
-        <w:t xml:space="preserve">Question — </w:t>
-      </w:r>
-      <w:r>
-        <w:t xml:space="preserve">a clear guiding question, with the concept behind it, who my student(s) were, and why it mattered?</w:t>
-      </w:r>
-    </w:p>
-    <w:p>
-      <w:pPr>
-        <w:pStyle w:val="Quote"/>
-      </w:pPr>
-      <w:r>
-        <w:rPr>
-          <w:b/>
-        </w:rPr>
-        <w:t xml:space="preserve">Methods — </w:t>
-      </w:r>
-      <w:r>
-        <w:t xml:space="preserve">could a reader picture the field work: the Investigation Plan as the instrument (the Before, During, and After), what I taught, and what I collected and how?</w:t>
-      </w:r>
-    </w:p>
-    <w:p>
-      <w:pPr>
-        <w:pStyle w:val="Quote"/>
-      </w:pPr>
-      <w:r>
-        <w:rPr>
-          <w:b/>
-        </w:rPr>
-        <w:t xml:space="preserve">Collected Data (the heart) — </w:t>
-      </w:r>
-      <w:r>
-        <w:t xml:space="preserve">at least three telling pieces of student work and talk, actually shown? Is each read closely along Depth of Knowledge, Ohio standard(s), grade-level performance, and the questions it raises? Are claims tied to specific artifacts? Does the synthesis land a tentative answer, confident where the evidence supports it and honest where it stays uncertain? Is student talk treated as data, attributed to a pseudonym, with reconstructions flagged?</w:t>
-      </w:r>
-    </w:p>
-    <w:p>
-      <w:pPr>
-        <w:pStyle w:val="Quote"/>
-      </w:pPr>
-      <w:r>
-        <w:rPr>
-          <w:b/>
-        </w:rPr>
-        <w:t xml:space="preserve">What Does Research Say? — </w:t>
-      </w:r>
-      <w:r>
-        <w:t xml:space="preserve">relevant literature, cited in a standard style in text and in a reference list, connected to what my data showed?</w:t>
-      </w:r>
-    </w:p>
-    <w:p>
-      <w:pPr>
-        <w:pStyle w:val="Quote"/>
-      </w:pPr>
-      <w:r>
-        <w:rPr>
-          <w:b/>
-        </w:rPr>
-        <w:t xml:space="preserve">Next Steps — </w:t>
-      </w:r>
-      <w:r>
-        <w:t xml:space="preserve">an honest read of what one lesson with a few students can and cannot show, and a grounded next move?</w:t>
-      </w:r>
-    </w:p>
-    <w:p>
-      <w:pPr>
-        <w:pStyle w:val="Quote"/>
-      </w:pPr>
-      <w:r>
-        <w:rPr>
-          <w:b/>
-        </w:rPr>
-        <w:t xml:space="preserve">How AI helped — </w:t>
-      </w:r>
-      <w:r>
-        <w:t xml:space="preserve">a short, honest account woven in?</w:t>
-      </w:r>
-    </w:p>
-    <w:p>
-      <w:pPr>
-        <w:pStyle w:val="Quote"/>
-      </w:pPr>
-      <w:r>
-        <w:t xml:space="preserve">Also check the floor: figures labeled, captioned, numbered, and discussed where they appear; pseudonyms only and de-identified student work; word count in range.</w:t>
-      </w:r>
-    </w:p>
-    <w:p>
-      <w:pPr>
-        <w:pStyle w:val="Quote"/>
-      </w:pPr>
-      <w:r>
-        <w:t xml:space="preserve">Hold the line on honesty. This paper is graded on evidence-based reasoning and honesty about limits, not on whether it answered the question. “Here is what I saw, and here is what I still don’t know” is a strong paper. Never push me to over-claim to sound more finished. If I over-claim, say a confident conclusion three pieces of evidence cannot carry, flag it and ask me to say what the evidence can and cannot support.</w:t>
-      </w:r>
-    </w:p>
-    <w:p>
-      <w:pPr>
-        <w:pStyle w:val="Quote"/>
-      </w:pPr>
-      <w:r>
-        <w:t xml:space="preserve">Close with the one revision that would most strengthen the paper. Keep everything concrete and tied to my own evidence. Be direct and warm. Do not dump jargon, and do not do the work for me.</w:t>
-      </w:r>
-    </w:p>
-    <w:p>
-      <w:pPr>
-        <w:spacing w:after="40" w:before="140" w:line="259" w:lineRule="auto"/>
-      </w:pPr>
-      <w:r>
-        <w:rPr>
-          <w:b/>
-          <w:i w:val="0"/>
-          <w:color w:val="1F2933"/>
-          <w:sz w:val="24"/>
-        </w:rPr>
-        <w:t xml:space="preserve">4. How Will My Work Be Assessed?</w:t>
+        <w:t>3. How Will My Work Be Assessed?</w:t>
       </w:r>
     </w:p>
     <w:tbl>
@@ -619,6 +453,294 @@
         </w:tc>
       </w:tr>
     </w:tbl>
+    <w:p>
+      <w:pPr>
+        <w:keepNext/>
+        <w:pageBreakBefore/>
+        <w:spacing w:after="40" w:before="140" w:line="259" w:lineRule="auto"/>
+      </w:pPr>
+      <w:r>
+        <w:rPr>
+          <w:b/>
+          <w:i w:val="0"/>
+          <w:color w:val="1F2933"/>
+          <w:sz w:val="24"/>
+        </w:rPr>
+        <w:t>4. Running Todd-in-a-Can</w:t>
+      </w:r>
+    </w:p>
+    <w:p>
+      <w:pPr>
+        <w:keepNext/>
+        <w:spacing w:after="60" w:before="0" w:line="259" w:lineRule="auto"/>
+      </w:pPr>
+      <w:r>
+        <w:rPr>
+          <w:b w:val="0"/>
+          <w:i w:val="0"/>
+          <w:color w:val="1F2933"/>
+          <w:sz w:val="21"/>
+        </w:rPr>
+        <w:t xml:space="preserve">Todd-in-a-Can is a prompt, not a website. Open your AI assistant (we recommend Gemini, since you all have Pro accounts), paste the prompt below, then paste your draft underneath it and send. Run it as often as it helps, and at least once before you submit. It reviews; it will not write your paper for you. That is the point.</w:t>
+      </w:r>
+    </w:p>
+    <w:p>
+      <w:pPr>
+        <w:keepNext/>
+        <w:spacing w:after="60" w:before="0" w:line="259" w:lineRule="auto"/>
+      </w:pPr>
+      <w:r>
+        <w:rPr>
+          <w:b/>
+          <w:i w:val="0"/>
+          <w:color w:val="1F2933"/>
+          <w:sz w:val="21"/>
+        </w:rPr>
+        <w:t xml:space="preserve">Paste from here:</w:t>
+      </w:r>
+    </w:p>
+    <w:tbl>
+      <w:tblPr>
+        <w:tblW w:w="9936" w:type="dxa"/>
+        <w:tblInd w:w="0" w:type="dxa"/>
+        <w:tblLayout w:type="fixed"/>
+        <w:tblCellMar>
+          <w:top w:w="100" w:type="dxa"/>
+          <w:left w:w="100" w:type="dxa"/>
+          <w:bottom w:w="100" w:type="dxa"/>
+          <w:right w:w="100" w:type="dxa"/>
+        </w:tblCellMar>
+      </w:tblPr>
+      <w:tblGrid>
+        <w:gridCol w:w="9936"/>
+      </w:tblGrid>
+      <w:tr>
+        <w:trPr>
+          <w:cantSplit/>
+        </w:trPr>
+        <w:tc>
+          <w:tcPr>
+            <w:tcW w:w="9936" w:type="dxa"/>
+            <w:tcBorders>
+              <w:top w:val="single" w:sz="4" w:space="0" w:color="000000"/>
+              <w:left w:val="single" w:sz="4" w:space="0" w:color="000000"/>
+              <w:bottom w:val="single" w:sz="4" w:space="0" w:color="000000"/>
+              <w:right w:val="single" w:sz="4" w:space="0" w:color="000000"/>
+            </w:tcBorders>
+            <w:shd w:val="clear" w:color="auto" w:fill="F2F2F2"/>
+          </w:tcPr>
+          <w:p>
+            <w:pPr>
+              <w:spacing w:before="0" w:after="120" w:line="240" w:lineRule="auto"/>
+              <w:ind w:left="0" w:right="0" w:firstLine="0"/>
+            </w:pPr>
+            <w:r>
+              <w:rPr>
+                <w:rFonts w:ascii="Courier New" w:hAnsi="Courier New"/>
+                <w:i w:val="0"/>
+                <w:sz w:val="21"/>
+              </w:rPr>
+              <w:t xml:space="preserve">You are Todd-in-a-Can, the AI reviewer for the TCE 318P Final Report. I will paste in a draft of my field-investigation paper. Read it the way a careful, encouraging methods instructor would, and tell me what a close reader notices, so I can make it stronger myself. The one rule that matters most: you review, you do not write. Do not rewrite my sentences, supply prose, invent data, or add citations for me. Point to what is there and what is missing, ask questions, and hand the revision back to me.</w:t>
+            </w:r>
+          </w:p>
+          <w:p>
+            <w:pPr>
+              <w:spacing w:before="0" w:after="120" w:line="240" w:lineRule="auto"/>
+              <w:ind w:left="0" w:right="0" w:firstLine="0"/>
+            </w:pPr>
+            <w:r>
+              <w:rPr>
+                <w:rFonts w:ascii="Courier New" w:hAnsi="Courier New"/>
+                <w:i w:val="0"/>
+                <w:sz w:val="21"/>
+              </w:rPr>
+              <w:t xml:space="preserve">The paper answers two questions with real evidence: what did I seek to learn, and what did I learn? It runs about 1,500 to 2,100 words across five equally weighted parts, plus a short note on how AI helped that is not counted in that range. Read the draft part by part. For each, say briefly what is working, then name the single most useful thing to push on:</w:t>
+            </w:r>
+          </w:p>
+          <w:p>
+            <w:pPr>
+              <w:spacing w:before="0" w:after="120" w:line="240" w:lineRule="auto"/>
+              <w:ind w:left="0" w:right="0" w:firstLine="0"/>
+            </w:pPr>
+            <w:r>
+              <w:rPr>
+                <w:rFonts w:ascii="Courier New" w:hAnsi="Courier New"/>
+                <w:b/>
+                <w:i w:val="0"/>
+                <w:sz w:val="21"/>
+              </w:rPr>
+              <w:t xml:space="preserve">Question — </w:t>
+            </w:r>
+            <w:r>
+              <w:rPr>
+                <w:rFonts w:ascii="Courier New" w:hAnsi="Courier New"/>
+                <w:i w:val="0"/>
+                <w:sz w:val="21"/>
+              </w:rPr>
+              <w:t xml:space="preserve">a clear guiding question, with the concept behind it, who my student(s) were, and why it mattered?</w:t>
+            </w:r>
+          </w:p>
+          <w:p>
+            <w:pPr>
+              <w:spacing w:before="0" w:after="120" w:line="240" w:lineRule="auto"/>
+              <w:ind w:left="0" w:right="0" w:firstLine="0"/>
+            </w:pPr>
+            <w:r>
+              <w:rPr>
+                <w:rFonts w:ascii="Courier New" w:hAnsi="Courier New"/>
+                <w:b/>
+                <w:i w:val="0"/>
+                <w:sz w:val="21"/>
+              </w:rPr>
+              <w:t xml:space="preserve">Methods — </w:t>
+            </w:r>
+            <w:r>
+              <w:rPr>
+                <w:rFonts w:ascii="Courier New" w:hAnsi="Courier New"/>
+                <w:i w:val="0"/>
+                <w:sz w:val="21"/>
+              </w:rPr>
+              <w:t xml:space="preserve">could a reader picture the field work: the Investigation Plan as the instrument (the Before, During, and After), what I taught, and what I collected and how?</w:t>
+            </w:r>
+          </w:p>
+          <w:p>
+            <w:pPr>
+              <w:spacing w:before="0" w:after="120" w:line="240" w:lineRule="auto"/>
+              <w:ind w:left="0" w:right="0" w:firstLine="0"/>
+            </w:pPr>
+            <w:r>
+              <w:rPr>
+                <w:rFonts w:ascii="Courier New" w:hAnsi="Courier New"/>
+                <w:b/>
+                <w:i w:val="0"/>
+                <w:sz w:val="21"/>
+              </w:rPr>
+              <w:t xml:space="preserve">Collected Data (the heart) — </w:t>
+            </w:r>
+            <w:r>
+              <w:rPr>
+                <w:rFonts w:ascii="Courier New" w:hAnsi="Courier New"/>
+                <w:i w:val="0"/>
+                <w:sz w:val="21"/>
+              </w:rPr>
+              <w:t xml:space="preserve">at least three telling pieces of student work and talk, actually shown? Is each read closely along Depth of Knowledge, Ohio standard(s), grade-level performance, and the questions it raises? Are claims tied to specific artifacts? Does the synthesis land a tentative answer, confident where the evidence supports it and honest where it stays uncertain? Is student talk treated as data, attributed to a pseudonym, with reconstructions flagged?</w:t>
+            </w:r>
+          </w:p>
+          <w:p>
+            <w:pPr>
+              <w:spacing w:before="0" w:after="120" w:line="240" w:lineRule="auto"/>
+              <w:ind w:left="0" w:right="0" w:firstLine="0"/>
+            </w:pPr>
+            <w:r>
+              <w:rPr>
+                <w:rFonts w:ascii="Courier New" w:hAnsi="Courier New"/>
+                <w:b/>
+                <w:i w:val="0"/>
+                <w:sz w:val="21"/>
+              </w:rPr>
+              <w:t xml:space="preserve">What Does Research Say? — </w:t>
+            </w:r>
+            <w:r>
+              <w:rPr>
+                <w:rFonts w:ascii="Courier New" w:hAnsi="Courier New"/>
+                <w:i w:val="0"/>
+                <w:sz w:val="21"/>
+              </w:rPr>
+              <w:t xml:space="preserve">relevant literature, cited in a standard style in text and in a reference list, connected to what my data showed?</w:t>
+            </w:r>
+          </w:p>
+          <w:p>
+            <w:pPr>
+              <w:spacing w:before="0" w:after="120" w:line="240" w:lineRule="auto"/>
+              <w:ind w:left="0" w:right="0" w:firstLine="0"/>
+            </w:pPr>
+            <w:r>
+              <w:rPr>
+                <w:rFonts w:ascii="Courier New" w:hAnsi="Courier New"/>
+                <w:b/>
+                <w:i w:val="0"/>
+                <w:sz w:val="21"/>
+              </w:rPr>
+              <w:t xml:space="preserve">Next Steps — </w:t>
+            </w:r>
+            <w:r>
+              <w:rPr>
+                <w:rFonts w:ascii="Courier New" w:hAnsi="Courier New"/>
+                <w:i w:val="0"/>
+                <w:sz w:val="21"/>
+              </w:rPr>
+              <w:t xml:space="preserve">an honest read of what one lesson with a few students can and cannot show, and a grounded next move?</w:t>
+            </w:r>
+          </w:p>
+          <w:p>
+            <w:pPr>
+              <w:spacing w:before="0" w:after="120" w:line="240" w:lineRule="auto"/>
+              <w:ind w:left="0" w:right="0" w:firstLine="0"/>
+            </w:pPr>
+            <w:r>
+              <w:rPr>
+                <w:rFonts w:ascii="Courier New" w:hAnsi="Courier New"/>
+                <w:b/>
+                <w:i w:val="0"/>
+                <w:sz w:val="21"/>
+              </w:rPr>
+              <w:t xml:space="preserve">How AI helped — </w:t>
+            </w:r>
+            <w:r>
+              <w:rPr>
+                <w:rFonts w:ascii="Courier New" w:hAnsi="Courier New"/>
+                <w:i w:val="0"/>
+                <w:sz w:val="21"/>
+              </w:rPr>
+              <w:t xml:space="preserve">a short, honest account woven in?</w:t>
+            </w:r>
+          </w:p>
+          <w:p>
+            <w:pPr>
+              <w:spacing w:before="0" w:after="120" w:line="240" w:lineRule="auto"/>
+              <w:ind w:left="0" w:right="0" w:firstLine="0"/>
+            </w:pPr>
+            <w:r>
+              <w:rPr>
+                <w:rFonts w:ascii="Courier New" w:hAnsi="Courier New"/>
+                <w:i w:val="0"/>
+                <w:sz w:val="21"/>
+              </w:rPr>
+              <w:t xml:space="preserve">Also check the floor: figures labeled, captioned, numbered, and discussed where they appear; pseudonyms only and de-identified student work; word count in range.</w:t>
+            </w:r>
+          </w:p>
+          <w:p>
+            <w:pPr>
+              <w:spacing w:before="0" w:after="120" w:line="240" w:lineRule="auto"/>
+              <w:ind w:left="0" w:right="0" w:firstLine="0"/>
+            </w:pPr>
+            <w:r>
+              <w:rPr>
+                <w:rFonts w:ascii="Courier New" w:hAnsi="Courier New"/>
+                <w:i w:val="0"/>
+                <w:sz w:val="21"/>
+              </w:rPr>
+              <w:t xml:space="preserve">Hold the line on honesty. This paper is graded on evidence-based reasoning and honesty about limits, not on whether it answered the question. “Here is what I saw, and here is what I still don’t know” is a strong paper. Never push me to over-claim to sound more finished. If I over-claim, say a confident conclusion three pieces of evidence cannot carry, flag it and ask me to say what the evidence can and cannot support.</w:t>
+            </w:r>
+          </w:p>
+          <w:p>
+            <w:pPr>
+              <w:spacing w:before="0" w:after="120" w:line="240" w:lineRule="auto"/>
+              <w:ind w:left="0" w:right="0" w:firstLine="0"/>
+            </w:pPr>
+            <w:r>
+              <w:rPr>
+                <w:rFonts w:ascii="Courier New" w:hAnsi="Courier New"/>
+                <w:i w:val="0"/>
+                <w:sz w:val="21"/>
+              </w:rPr>
+              <w:t xml:space="preserve">Close with the one revision that would most strengthen the paper. Keep everything concrete and tied to my own evidence. Be direct and warm. Do not dump jargon, and do not do the work for me.</w:t>
+            </w:r>
+          </w:p>
+        </w:tc>
+      </w:tr>
+    </w:tbl>
+    <w:p/>
     <w:sectPr>
       <w:type w:val="nextPage"/>
       <w:pgSz w:w="12240" w:h="15840"/>

</xml_diff>

<commit_message>
Review & Reflection: larger type on page 1 (12 pt body, 14 pt headings)
Co-Authored-By: Claude Opus 5.5 <noreply@anthropic.com>
</commit_message>
<xml_diff>
--- a/week-15-review-and-share/week-15-review-reflection.docx
+++ b/week-15-review-and-share/week-15-review-reflection.docx
@@ -11,28 +11,85 @@
           <w:b/>
           <w:i w:val="0"/>
           <w:color w:val="1F2933"/>
-          <w:sz w:val="30"/>
+          <w:sz w:val="36"/>
         </w:rPr>
         <w:t xml:space="preserve">Review &amp; Reflection: How the Reads Shaped Your Paper</w:t>
       </w:r>
     </w:p>
     <w:p>
       <w:pPr>
-        <w:spacing w:after="80" w:before="0" w:line="259" w:lineRule="auto"/>
+        <w:spacing w:after="360" w:before="0" w:line="259" w:lineRule="auto"/>
       </w:pPr>
       <w:r>
         <w:rPr>
           <w:b w:val="0"/>
           <w:i/>
           <w:color w:val="1F2933"/>
-          <w:sz w:val="20"/>
+          <w:sz w:val="22"/>
         </w:rPr>
         <w:t>Week 15 · TCE 318P FA26 (Edwards) · 30 points · due Wednesday, December 9</w:t>
       </w:r>
     </w:p>
     <w:p>
       <w:pPr>
-        <w:spacing w:after="40" w:before="140" w:line="259" w:lineRule="auto"/>
+        <w:spacing w:after="80" w:before="440" w:line="259" w:lineRule="auto"/>
+      </w:pPr>
+      <w:r>
+        <w:rPr>
+          <w:b/>
+          <w:i w:val="0"/>
+          <w:color w:val="1F2933"/>
+          <w:sz w:val="28"/>
+        </w:rPr>
+        <w:t xml:space="preserve">1. What’s This All About?</w:t>
+      </w:r>
+    </w:p>
+    <w:p>
+      <w:pPr>
+        <w:spacing w:after="180" w:before="0" w:line="259" w:lineRule="auto"/>
+      </w:pPr>
+      <w:r>
+        <w:rPr>
+          <w:b w:val="0"/>
+          <w:i w:val="0"/>
+          <w:color w:val="1F2933"/>
+          <w:sz w:val="24"/>
+        </w:rPr>
+        <w:t xml:space="preserve">Your paper gets read before you finish it. In Week 15 a peer reads your draft, and you run Todd-in-a-Can, the course’s AI reviewer, at least once and as often as it helps. This assignment shows that loop: what each read surfaced and what you did about it. It’s graded on the revision and the reflection, not on the paper itself.</w:t>
+      </w:r>
+    </w:p>
+    <w:p>
+      <w:pPr>
+        <w:spacing w:after="80" w:before="440" w:line="259" w:lineRule="auto"/>
+      </w:pPr>
+      <w:r>
+        <w:rPr>
+          <w:b/>
+          <w:i w:val="0"/>
+          <w:color w:val="1F2933"/>
+          <w:sz w:val="28"/>
+        </w:rPr>
+        <w:t xml:space="preserve">2. What Do I Need to Do?</w:t>
+      </w:r>
+    </w:p>
+    <w:p>
+      <w:pPr>
+        <w:spacing w:after="180" w:before="0" w:line="259" w:lineRule="auto"/>
+      </w:pPr>
+      <w:r>
+        <w:rPr>
+          <w:b w:val="0"/>
+          <w:i w:val="0"/>
+          <w:color w:val="1F2933"/>
+          <w:sz w:val="24"/>
+        </w:rPr>
+        <w:t xml:space="preserve">Submit in Canvas:</w:t>
+      </w:r>
+    </w:p>
+    <w:p>
+      <w:pPr>
+        <w:pStyle w:val="ListBullet"/>
+        <w:spacing w:after="180" w:before="0" w:line="259" w:lineRule="auto"/>
       </w:pPr>
       <w:r>
         <w:rPr>
@@ -40,63 +97,6 @@
           <w:i w:val="0"/>
           <w:color w:val="1F2933"/>
           <w:sz w:val="24"/>
-        </w:rPr>
-        <w:t xml:space="preserve">1. What’s This All About?</w:t>
-      </w:r>
-    </w:p>
-    <w:p>
-      <w:pPr>
-        <w:spacing w:after="60" w:before="0" w:line="259" w:lineRule="auto"/>
-      </w:pPr>
-      <w:r>
-        <w:rPr>
-          <w:b w:val="0"/>
-          <w:i w:val="0"/>
-          <w:color w:val="1F2933"/>
-          <w:sz w:val="21"/>
-        </w:rPr>
-        <w:t xml:space="preserve">Your paper gets read before you finish it. In Week 15 a peer reads your draft, and you run Todd-in-a-Can, the course’s AI reviewer, at least once and as often as it helps. This assignment shows that loop: what each read surfaced and what you did about it. It’s graded on the revision and the reflection, not on the paper itself.</w:t>
-      </w:r>
-    </w:p>
-    <w:p>
-      <w:pPr>
-        <w:spacing w:after="40" w:before="140" w:line="259" w:lineRule="auto"/>
-      </w:pPr>
-      <w:r>
-        <w:rPr>
-          <w:b/>
-          <w:i w:val="0"/>
-          <w:color w:val="1F2933"/>
-          <w:sz w:val="24"/>
-        </w:rPr>
-        <w:t xml:space="preserve">2. What Do I Need to Do?</w:t>
-      </w:r>
-    </w:p>
-    <w:p>
-      <w:pPr>
-        <w:spacing w:after="60" w:before="0" w:line="259" w:lineRule="auto"/>
-      </w:pPr>
-      <w:r>
-        <w:rPr>
-          <w:b w:val="0"/>
-          <w:i w:val="0"/>
-          <w:color w:val="1F2933"/>
-          <w:sz w:val="21"/>
-        </w:rPr>
-        <w:t xml:space="preserve">Submit in Canvas:</w:t>
-      </w:r>
-    </w:p>
-    <w:p>
-      <w:pPr>
-        <w:pStyle w:val="ListBullet"/>
-        <w:spacing w:after="30" w:before="0" w:line="259" w:lineRule="auto"/>
-      </w:pPr>
-      <w:r>
-        <w:rPr>
-          <w:b/>
-          <w:i w:val="0"/>
-          <w:color w:val="1F2933"/>
-          <w:sz w:val="21"/>
         </w:rPr>
         <w:t xml:space="preserve">Your before draft: </w:t>
       </w:r>
@@ -105,7 +105,7 @@
           <w:b w:val="0"/>
           <w:i w:val="0"/>
           <w:color w:val="1F2933"/>
-          <w:sz w:val="21"/>
+          <w:sz w:val="24"/>
         </w:rPr>
         <w:t xml:space="preserve">the draft you brought to the peer read.</w:t>
       </w:r>
@@ -113,14 +113,14 @@
     <w:p>
       <w:pPr>
         <w:pStyle w:val="ListBullet"/>
-        <w:spacing w:after="30" w:before="0" w:line="259" w:lineRule="auto"/>
+        <w:spacing w:after="180" w:before="0" w:line="259" w:lineRule="auto"/>
       </w:pPr>
       <w:r>
         <w:rPr>
           <w:b/>
           <w:i w:val="0"/>
           <w:color w:val="1F2933"/>
-          <w:sz w:val="21"/>
+          <w:sz w:val="24"/>
         </w:rPr>
         <w:t xml:space="preserve">Your after draft: </w:t>
       </w:r>
@@ -129,7 +129,7 @@
           <w:b w:val="0"/>
           <w:i w:val="0"/>
           <w:color w:val="1F2933"/>
-          <w:sz w:val="21"/>
+          <w:sz w:val="24"/>
         </w:rPr>
         <w:t xml:space="preserve">your revised version. This can be your Final Report.</w:t>
       </w:r>
@@ -137,14 +137,14 @@
     <w:p>
       <w:pPr>
         <w:pStyle w:val="ListBullet"/>
-        <w:spacing w:after="30" w:before="0" w:line="259" w:lineRule="auto"/>
+        <w:spacing w:after="180" w:before="0" w:line="259" w:lineRule="auto"/>
       </w:pPr>
       <w:r>
         <w:rPr>
           <w:b/>
           <w:i w:val="0"/>
           <w:color w:val="1F2933"/>
-          <w:sz w:val="21"/>
+          <w:sz w:val="24"/>
         </w:rPr>
         <w:t xml:space="preserve">How the reads shaped this paper (~250 words): </w:t>
       </w:r>
@@ -153,21 +153,21 @@
           <w:b w:val="0"/>
           <w:i w:val="0"/>
           <w:color w:val="1F2933"/>
-          <w:sz w:val="21"/>
+          <w:sz w:val="24"/>
         </w:rPr>
         <w:t xml:space="preserve">say what each read surfaced, what you changed, what you chose not to change and why, and what Todd-in-a-Can caught and missed. “It missed the thing that mattered” is as strong an answer as praise. This is about Todd-in-a-Can, not the genAI planning partner from Weeks 7–10, which belongs in your Final Report’s AI note.</w:t>
       </w:r>
     </w:p>
     <w:p>
       <w:pPr>
-        <w:spacing w:after="60" w:before="60" w:line="259" w:lineRule="auto"/>
+        <w:spacing w:after="180" w:before="60" w:line="259" w:lineRule="auto"/>
       </w:pPr>
       <w:r>
         <w:rPr>
           <w:b/>
           <w:i w:val="0"/>
           <w:color w:val="1F2933"/>
-          <w:sz w:val="21"/>
+          <w:sz w:val="24"/>
         </w:rPr>
         <w:t xml:space="preserve">Pseudonyms only: </w:t>
       </w:r>
@@ -176,21 +176,21 @@
           <w:b w:val="0"/>
           <w:i w:val="0"/>
           <w:color w:val="1F2933"/>
-          <w:sz w:val="21"/>
+          <w:sz w:val="24"/>
         </w:rPr>
         <w:t xml:space="preserve">de-identify any student work in your drafts (FERPA).</w:t>
       </w:r>
     </w:p>
     <w:p>
       <w:pPr>
-        <w:spacing w:after="40" w:before="140" w:line="259" w:lineRule="auto"/>
+        <w:spacing w:after="80" w:before="440" w:line="259" w:lineRule="auto"/>
       </w:pPr>
       <w:r>
         <w:rPr>
           <w:b/>
           <w:i w:val="0"/>
           <w:color w:val="1F2933"/>
-          <w:sz w:val="24"/>
+          <w:sz w:val="28"/>
         </w:rPr>
         <w:t>3. How Will My Work Be Assessed?</w:t>
       </w:r>
@@ -206,8 +206,8 @@
       </w:tblPr>
       <w:tblGrid>
         <w:gridCol w:w="2088"/>
-        <w:gridCol w:w="864"/>
-        <w:gridCol w:w="6984"/>
+        <w:gridCol w:w="1100"/>
+        <w:gridCol w:w="6748"/>
       </w:tblGrid>
       <w:tr>
         <w:tc>
@@ -217,14 +217,18 @@
           </w:tcPr>
           <w:p>
             <w:pPr>
-              <w:spacing w:after="0" w:line="240" w:lineRule="auto"/>
+              <w:spacing w:after="40" w:line="240" w:lineRule="auto"/>
             </w:pPr>
-            <w:r/>
+            <w:r>
+              <w:rPr>
+                <w:sz w:val="22"/>
+              </w:rPr>
+            </w:r>
             <w:r>
               <w:rPr>
                 <w:b/>
                 <w:color w:val="1F2933"/>
-                <w:sz w:val="19"/>
+                <w:sz w:val="22"/>
               </w:rPr>
               <w:t>Criterion</w:t>
             </w:r>
@@ -232,19 +236,23 @@
         </w:tc>
         <w:tc>
           <w:tcPr>
-            <w:tcW w:type="dxa" w:w="864"/>
+            <w:tcW w:type="dxa" w:w="1100"/>
             <w:shd w:val="clear" w:color="auto" w:fill="E8EEF6"/>
           </w:tcPr>
           <w:p>
             <w:pPr>
-              <w:spacing w:after="0" w:line="240" w:lineRule="auto"/>
+              <w:spacing w:after="40" w:line="240" w:lineRule="auto"/>
             </w:pPr>
-            <w:r/>
+            <w:r>
+              <w:rPr>
+                <w:sz w:val="22"/>
+              </w:rPr>
+            </w:r>
             <w:r>
               <w:rPr>
                 <w:b/>
                 <w:color w:val="1F2933"/>
-                <w:sz w:val="19"/>
+                <w:sz w:val="22"/>
               </w:rPr>
               <w:t>Points</w:t>
             </w:r>
@@ -252,19 +260,23 @@
         </w:tc>
         <w:tc>
           <w:tcPr>
-            <w:tcW w:type="dxa" w:w="6984"/>
+            <w:tcW w:type="dxa" w:w="6748"/>
             <w:shd w:val="clear" w:color="auto" w:fill="E8EEF6"/>
           </w:tcPr>
           <w:p>
             <w:pPr>
-              <w:spacing w:after="0" w:line="240" w:lineRule="auto"/>
+              <w:spacing w:after="40" w:line="240" w:lineRule="auto"/>
             </w:pPr>
-            <w:r/>
+            <w:r>
+              <w:rPr>
+                <w:sz w:val="22"/>
+              </w:rPr>
+            </w:r>
             <w:r>
               <w:rPr>
                 <w:b/>
                 <w:color w:val="1F2933"/>
-                <w:sz w:val="19"/>
+                <w:sz w:val="22"/>
               </w:rPr>
               <w:t>What earns full credit</w:t>
             </w:r>
@@ -278,14 +290,18 @@
           </w:tcPr>
           <w:p>
             <w:pPr>
-              <w:spacing w:after="0" w:line="240" w:lineRule="auto"/>
+              <w:spacing w:after="40" w:line="240" w:lineRule="auto"/>
             </w:pPr>
-            <w:r/>
+            <w:r>
+              <w:rPr>
+                <w:sz w:val="22"/>
+              </w:rPr>
+            </w:r>
             <w:r>
               <w:rPr>
                 <w:b/>
                 <w:color w:val="1F2933"/>
-                <w:sz w:val="19"/>
+                <w:sz w:val="22"/>
               </w:rPr>
               <w:t>Revision, before to after</w:t>
             </w:r>
@@ -293,38 +309,45 @@
         </w:tc>
         <w:tc>
           <w:tcPr>
-            <w:tcW w:type="dxa" w:w="864"/>
+            <w:tcW w:type="dxa" w:w="1100"/>
           </w:tcPr>
           <w:p>
             <w:pPr>
-              <w:spacing w:after="0" w:line="240" w:lineRule="auto"/>
+              <w:spacing w:after="40" w:line="240" w:lineRule="auto"/>
             </w:pPr>
             <w:r>
+              <w:rPr>
+                <w:sz w:val="22"/>
+              </w:rPr>
               <w:t>15</w:t>
             </w:r>
             <w:r>
               <w:rPr>
                 <w:b w:val="0"/>
                 <w:color w:val="1F2933"/>
-                <w:sz w:val="19"/>
+                <w:sz w:val="22"/>
               </w:rPr>
             </w:r>
           </w:p>
         </w:tc>
         <w:tc>
           <w:tcPr>
-            <w:tcW w:type="dxa" w:w="6984"/>
+            <w:tcW w:type="dxa" w:w="6748"/>
           </w:tcPr>
           <w:p>
             <w:pPr>
-              <w:spacing w:after="0" w:line="240" w:lineRule="auto"/>
+              <w:spacing w:after="40" w:line="240" w:lineRule="auto"/>
             </w:pPr>
-            <w:r/>
+            <w:r>
+              <w:rPr>
+                <w:sz w:val="22"/>
+              </w:rPr>
+            </w:r>
             <w:r>
               <w:rPr>
                 <w:b w:val="0"/>
                 <w:color w:val="1F2933"/>
-                <w:sz w:val="19"/>
+                <w:sz w:val="22"/>
               </w:rPr>
               <w:t>The paper shows real change driven by the reads (a claim tightened, evidence added, an overreach pulled back), not cosmetic edits. Your before draft lets us see it.</w:t>
             </w:r>
@@ -338,14 +361,18 @@
           </w:tcPr>
           <w:p>
             <w:pPr>
-              <w:spacing w:after="0" w:line="240" w:lineRule="auto"/>
+              <w:spacing w:after="40" w:line="240" w:lineRule="auto"/>
             </w:pPr>
-            <w:r/>
+            <w:r>
+              <w:rPr>
+                <w:sz w:val="22"/>
+              </w:rPr>
+            </w:r>
             <w:r>
               <w:rPr>
                 <w:b/>
                 <w:color w:val="1F2933"/>
-                <w:sz w:val="19"/>
+                <w:sz w:val="22"/>
               </w:rPr>
               <w:t>How the reads shaped this paper</w:t>
             </w:r>
@@ -353,18 +380,22 @@
         </w:tc>
         <w:tc>
           <w:tcPr>
-            <w:tcW w:type="dxa" w:w="864"/>
+            <w:tcW w:type="dxa" w:w="1100"/>
           </w:tcPr>
           <w:p>
             <w:pPr>
-              <w:spacing w:after="0" w:line="240" w:lineRule="auto"/>
+              <w:spacing w:after="40" w:line="240" w:lineRule="auto"/>
             </w:pPr>
-            <w:r/>
+            <w:r>
+              <w:rPr>
+                <w:sz w:val="22"/>
+              </w:rPr>
+            </w:r>
             <w:r>
               <w:rPr>
                 <w:b w:val="0"/>
                 <w:color w:val="1F2933"/>
-                <w:sz w:val="19"/>
+                <w:sz w:val="22"/>
               </w:rPr>
               <w:t>15</w:t>
             </w:r>
@@ -372,18 +403,22 @@
         </w:tc>
         <w:tc>
           <w:tcPr>
-            <w:tcW w:type="dxa" w:w="6984"/>
+            <w:tcW w:type="dxa" w:w="6748"/>
           </w:tcPr>
           <w:p>
             <w:pPr>
-              <w:spacing w:after="0" w:line="240" w:lineRule="auto"/>
+              <w:spacing w:after="40" w:line="240" w:lineRule="auto"/>
             </w:pPr>
-            <w:r/>
+            <w:r>
+              <w:rPr>
+                <w:sz w:val="22"/>
+              </w:rPr>
+            </w:r>
             <w:r>
               <w:rPr>
                 <w:b w:val="0"/>
                 <w:color w:val="1F2933"/>
-                <w:sz w:val="19"/>
+                <w:sz w:val="22"/>
               </w:rPr>
               <w:t>Specific about what the peer and Todd-in-a-Can flagged and what you did about it, and honest about how Todd-in-a-Can worked as a reviewer: what it caught, missed, changed, and what you rejected. We’re grading the judgment you brought to the feedback, not proof that you received it.</w:t>
             </w:r>
@@ -398,14 +433,18 @@
           </w:tcPr>
           <w:p>
             <w:pPr>
-              <w:spacing w:after="0" w:line="240" w:lineRule="auto"/>
+              <w:spacing w:after="40" w:line="240" w:lineRule="auto"/>
             </w:pPr>
-            <w:r/>
+            <w:r>
+              <w:rPr>
+                <w:sz w:val="22"/>
+              </w:rPr>
+            </w:r>
             <w:r>
               <w:rPr>
                 <w:b/>
                 <w:color w:val="1F2933"/>
-                <w:sz w:val="19"/>
+                <w:sz w:val="22"/>
               </w:rPr>
               <w:t>Total</w:t>
             </w:r>
@@ -413,40 +452,47 @@
         </w:tc>
         <w:tc>
           <w:tcPr>
-            <w:tcW w:type="dxa" w:w="864"/>
+            <w:tcW w:type="dxa" w:w="1100"/>
             <w:shd w:val="clear" w:color="auto" w:fill="E8EEF6"/>
           </w:tcPr>
           <w:p>
             <w:pPr>
-              <w:spacing w:after="0" w:line="240" w:lineRule="auto"/>
+              <w:spacing w:after="40" w:line="240" w:lineRule="auto"/>
             </w:pPr>
             <w:r>
+              <w:rPr>
+                <w:sz w:val="22"/>
+              </w:rPr>
               <w:t>30</w:t>
             </w:r>
             <w:r>
               <w:rPr>
                 <w:b/>
                 <w:color w:val="1F2933"/>
-                <w:sz w:val="19"/>
+                <w:sz w:val="22"/>
               </w:rPr>
             </w:r>
           </w:p>
         </w:tc>
         <w:tc>
           <w:tcPr>
-            <w:tcW w:type="dxa" w:w="6984"/>
+            <w:tcW w:type="dxa" w:w="6748"/>
             <w:shd w:val="clear" w:color="auto" w:fill="E8EEF6"/>
           </w:tcPr>
           <w:p>
             <w:pPr>
-              <w:spacing w:after="0" w:line="240" w:lineRule="auto"/>
+              <w:spacing w:after="40" w:line="240" w:lineRule="auto"/>
             </w:pPr>
-            <w:r/>
+            <w:r>
+              <w:rPr>
+                <w:sz w:val="22"/>
+              </w:rPr>
+            </w:r>
             <w:r>
               <w:rPr>
                 <w:b w:val="0"/>
                 <w:color w:val="1F2933"/>
-                <w:sz w:val="19"/>
+                <w:sz w:val="22"/>
               </w:rPr>
             </w:r>
           </w:p>
@@ -457,14 +503,14 @@
       <w:pPr>
         <w:keepNext/>
         <w:pageBreakBefore/>
-        <w:spacing w:after="40" w:before="140" w:line="259" w:lineRule="auto"/>
+        <w:spacing w:after="80" w:before="0" w:line="259" w:lineRule="auto"/>
       </w:pPr>
       <w:r>
         <w:rPr>
           <w:b/>
           <w:i w:val="0"/>
           <w:color w:val="1F2933"/>
-          <w:sz w:val="24"/>
+          <w:sz w:val="28"/>
         </w:rPr>
         <w:t>4. Running Todd-in-a-Can</w:t>
       </w:r>
@@ -472,14 +518,14 @@
     <w:p>
       <w:pPr>
         <w:keepNext/>
-        <w:spacing w:after="60" w:before="0" w:line="259" w:lineRule="auto"/>
+        <w:spacing w:after="80" w:before="0" w:line="259" w:lineRule="auto"/>
       </w:pPr>
       <w:r>
         <w:rPr>
           <w:b w:val="0"/>
           <w:i w:val="0"/>
           <w:color w:val="1F2933"/>
-          <w:sz w:val="21"/>
+          <w:sz w:val="22"/>
         </w:rPr>
         <w:t xml:space="preserve">Todd-in-a-Can is a prompt, not a website. Open your AI assistant (we recommend Gemini, since you all have Pro accounts), paste the prompt below, then paste your draft underneath it and send. Run it as often as it helps, and at least once before you submit. It reviews; it will not write your paper for you. That is the point.</w:t>
       </w:r>
@@ -487,14 +533,14 @@
     <w:p>
       <w:pPr>
         <w:keepNext/>
-        <w:spacing w:after="60" w:before="0" w:line="259" w:lineRule="auto"/>
+        <w:spacing w:after="80" w:before="0" w:line="259" w:lineRule="auto"/>
       </w:pPr>
       <w:r>
         <w:rPr>
           <w:b/>
           <w:i w:val="0"/>
           <w:color w:val="1F2933"/>
-          <w:sz w:val="21"/>
+          <w:sz w:val="22"/>
         </w:rPr>
         <w:t xml:space="preserve">Paste from here:</w:t>
       </w:r>

</xml_diff>

<commit_message>
Review & Reflection: Todd's edits (subtitle on two lines, no Total row, Todd-in-a-Can highlighted)
Co-Authored-By: Claude Opus 5.5 <noreply@anthropic.com>
</commit_message>
<xml_diff>
--- a/week-15-review-and-share/week-15-review-reflection.docx
+++ b/week-15-review-and-share/week-15-review-reflection.docx
@@ -1,100 +1,152 @@
 
 <file path=word/document.xml><?xml version="1.0" encoding="utf-8"?>
-<w:document xmlns:wpc="http://schemas.microsoft.com/office/word/2010/wordprocessingCanvas" xmlns:mc="http://schemas.openxmlformats.org/markup-compatibility/2006" xmlns:o="urn:schemas-microsoft-com:office:office" xmlns:r="http://schemas.openxmlformats.org/officeDocument/2006/relationships" xmlns:m="http://schemas.openxmlformats.org/officeDocument/2006/math" xmlns:v="urn:schemas-microsoft-com:vml" xmlns:wp14="http://schemas.microsoft.com/office/word/2010/wordprocessingDrawing" xmlns:wp="http://schemas.openxmlformats.org/drawingml/2006/wordprocessingDrawing" xmlns:w10="urn:schemas-microsoft-com:office:word" xmlns:w="http://schemas.openxmlformats.org/wordprocessingml/2006/main" xmlns:w14="http://schemas.microsoft.com/office/word/2010/wordml" xmlns:w15="http://schemas.microsoft.com/office/word/2012/wordml" xmlns:w16se="http://schemas.microsoft.com/office/word/2015/wordml/symex" xmlns:w16cid="http://schemas.microsoft.com/office/word/2016/wordml/cid" xmlns:w16="http://schemas.microsoft.com/office/word/2018/wordml" xmlns:w16cex="http://schemas.microsoft.com/office/word/2018/wordml/cex" xmlns:w16sdtdh="http://schemas.microsoft.com/office/word/2020/wordml/sdtdatahash" xmlns:wne="http://schemas.microsoft.com/office/word/2006/wordml" xmlns:wpg="http://schemas.microsoft.com/office/word/2010/wordprocessingGroup" xmlns:wps="http://schemas.microsoft.com/office/word/2010/wordprocessingShape" mc:Ignorable="w14 w15 w16se w16cid w16 w16cex w16sdtdh wp14">
+<w:document xmlns:o="urn:schemas-microsoft-com:office:office" xmlns:r="http://schemas.openxmlformats.org/officeDocument/2006/relationships" xmlns:v="urn:schemas-microsoft-com:vml" xmlns:w="http://schemas.openxmlformats.org/wordprocessingml/2006/main" xmlns:w10="urn:schemas-microsoft-com:office:word" xmlns:wp="http://schemas.openxmlformats.org/drawingml/2006/wordprocessingDrawing" xmlns:wps="http://schemas.microsoft.com/office/word/2010/wordprocessingShape" xmlns:wpg="http://schemas.microsoft.com/office/word/2010/wordprocessingGroup" xmlns:mc="http://schemas.openxmlformats.org/markup-compatibility/2006" xmlns:wp14="http://schemas.microsoft.com/office/word/2010/wordprocessingDrawing" xmlns:w14="http://schemas.microsoft.com/office/word/2010/wordml" xmlns:w15="http://schemas.microsoft.com/office/word/2012/wordml" mc:Ignorable="w14 wp14 w15">
   <w:body>
     <w:p>
       <w:pPr>
-        <w:spacing w:after="0" w:before="0" w:line="259" w:lineRule="auto"/>
+        <w:pStyle w:val="Normal"/>
+        <w:spacing w:lineRule="auto" w:line="259" w:before="0" w:after="0"/>
+        <w:rPr>
+          <w:sz w:val="24"/>
+          <w:szCs w:val="24"/>
+        </w:rPr>
       </w:pPr>
       <w:r>
         <w:rPr>
           <w:b/>
-          <w:i w:val="0"/>
+          <w:i w:val="false"/>
           <w:color w:val="1F2933"/>
-          <w:sz w:val="36"/>
+          <w:sz w:val="24"/>
+          <w:szCs w:val="24"/>
         </w:rPr>
-        <w:t xml:space="preserve">Review &amp; Reflection: How the Reads Shaped Your Paper</w:t>
+        <w:t>Review &amp; Reflection: How the Reads Shaped Your Paper</w:t>
       </w:r>
     </w:p>
     <w:p>
       <w:pPr>
-        <w:spacing w:after="360" w:before="0" w:line="259" w:lineRule="auto"/>
+        <w:pStyle w:val="Normal"/>
+        <w:spacing w:lineRule="auto" w:line="259" w:before="0" w:after="0"/>
+        <w:rPr>
+          <w:b/>
+          <w:bCs/>
+          <w:sz w:val="24"/>
+          <w:szCs w:val="24"/>
+        </w:rPr>
       </w:pPr>
       <w:r>
         <w:rPr>
-          <w:b w:val="0"/>
+          <w:b/>
+          <w:bCs/>
           <w:i/>
           <w:color w:val="1F2933"/>
-          <w:sz w:val="22"/>
+          <w:sz w:val="24"/>
+          <w:szCs w:val="24"/>
         </w:rPr>
-        <w:t>Week 15 · TCE 318P FA26 (Edwards) · 30 points · due Wednesday, December 9</w:t>
+        <w:t xml:space="preserve">Week 15 · TCE 318P FA26 (Edwards) </w:t>
       </w:r>
     </w:p>
     <w:p>
       <w:pPr>
-        <w:spacing w:after="80" w:before="440" w:line="259" w:lineRule="auto"/>
+        <w:pStyle w:val="Normal"/>
+        <w:spacing w:lineRule="auto" w:line="259" w:before="0" w:after="0"/>
+        <w:rPr>
+          <w:b/>
+          <w:bCs/>
+          <w:sz w:val="24"/>
+          <w:szCs w:val="24"/>
+        </w:rPr>
       </w:pPr>
       <w:r>
         <w:rPr>
           <w:b/>
-          <w:i w:val="0"/>
+          <w:bCs/>
+          <w:i/>
+          <w:color w:val="1F2933"/>
+          <w:sz w:val="24"/>
+          <w:szCs w:val="24"/>
+        </w:rPr>
+        <w:t>30 points · due Wednesday, December 9</w:t>
+      </w:r>
+    </w:p>
+    <w:p>
+      <w:pPr>
+        <w:pStyle w:val="Normal"/>
+        <w:spacing w:lineRule="auto" w:line="259" w:before="440" w:after="80"/>
+        <w:rPr/>
+      </w:pPr>
+      <w:r>
+        <w:rPr>
+          <w:b/>
+          <w:i w:val="false"/>
           <w:color w:val="1F2933"/>
           <w:sz w:val="28"/>
         </w:rPr>
-        <w:t xml:space="preserve">1. What’s This All About?</w:t>
+        <w:t>1. What’s This All About?</w:t>
       </w:r>
     </w:p>
     <w:p>
       <w:pPr>
-        <w:spacing w:after="180" w:before="0" w:line="259" w:lineRule="auto"/>
+        <w:pStyle w:val="Normal"/>
+        <w:spacing w:lineRule="auto" w:line="259" w:before="0" w:after="180"/>
+        <w:rPr/>
       </w:pPr>
       <w:r>
         <w:rPr>
-          <w:b w:val="0"/>
-          <w:i w:val="0"/>
+          <w:b w:val="false"/>
+          <w:i w:val="false"/>
           <w:color w:val="1F2933"/>
           <w:sz w:val="24"/>
         </w:rPr>
-        <w:t xml:space="preserve">Your paper gets read before you finish it. In Week 15 a peer reads your draft, and you run Todd-in-a-Can, the course’s AI reviewer, at least once and as often as it helps. This assignment shows that loop: what each read surfaced and what you did about it. It’s graded on the revision and the reflection, not on the paper itself.</w:t>
+        <w:t>Your paper gets read before you finish it. In Week 15 a peer reads your draft, and you run Todd-in-a-Can, the course’s AI reviewer, at least once and as often as it helps. This assignment shows that loop: what each read surfaced and what you did about it. It’s graded on the revision and the reflection, not on the paper itself.</w:t>
       </w:r>
     </w:p>
     <w:p>
       <w:pPr>
-        <w:spacing w:after="80" w:before="440" w:line="259" w:lineRule="auto"/>
+        <w:pStyle w:val="Normal"/>
+        <w:spacing w:lineRule="auto" w:line="259" w:before="0" w:after="86"/>
+        <w:rPr/>
       </w:pPr>
       <w:r>
         <w:rPr>
           <w:b/>
-          <w:i w:val="0"/>
+          <w:i w:val="false"/>
           <w:color w:val="1F2933"/>
           <w:sz w:val="28"/>
         </w:rPr>
-        <w:t xml:space="preserve">2. What Do I Need to Do?</w:t>
+        <w:t>2. What Do I Need to Do?</w:t>
       </w:r>
     </w:p>
     <w:p>
       <w:pPr>
-        <w:spacing w:after="180" w:before="0" w:line="259" w:lineRule="auto"/>
+        <w:pStyle w:val="Normal"/>
+        <w:spacing w:lineRule="auto" w:line="259" w:before="0" w:after="180"/>
+        <w:rPr/>
       </w:pPr>
       <w:r>
         <w:rPr>
-          <w:b w:val="0"/>
-          <w:i w:val="0"/>
+          <w:b w:val="false"/>
+          <w:i w:val="false"/>
           <w:color w:val="1F2933"/>
           <w:sz w:val="24"/>
         </w:rPr>
-        <w:t xml:space="preserve">Submit in Canvas:</w:t>
+        <w:t>Submit in Canvas:</w:t>
       </w:r>
     </w:p>
     <w:p>
       <w:pPr>
         <w:pStyle w:val="ListBullet"/>
-        <w:spacing w:after="180" w:before="0" w:line="259" w:lineRule="auto"/>
+        <w:numPr>
+          <w:ilvl w:val="0"/>
+          <w:numId w:val="1"/>
+        </w:numPr>
+        <w:spacing w:lineRule="auto" w:line="259" w:before="0" w:after="180"/>
+        <w:contextualSpacing/>
+        <w:rPr/>
       </w:pPr>
       <w:r>
         <w:rPr>
           <w:b/>
-          <w:i w:val="0"/>
+          <w:i w:val="false"/>
           <w:color w:val="1F2933"/>
           <w:sz w:val="24"/>
         </w:rPr>
@@ -102,23 +154,29 @@
       </w:r>
       <w:r>
         <w:rPr>
-          <w:b w:val="0"/>
-          <w:i w:val="0"/>
+          <w:b w:val="false"/>
+          <w:i w:val="false"/>
           <w:color w:val="1F2933"/>
           <w:sz w:val="24"/>
         </w:rPr>
-        <w:t xml:space="preserve">the draft you brought to the peer read.</w:t>
+        <w:t>the draft you brought to the peer read.</w:t>
       </w:r>
     </w:p>
     <w:p>
       <w:pPr>
         <w:pStyle w:val="ListBullet"/>
-        <w:spacing w:after="180" w:before="0" w:line="259" w:lineRule="auto"/>
+        <w:numPr>
+          <w:ilvl w:val="0"/>
+          <w:numId w:val="1"/>
+        </w:numPr>
+        <w:spacing w:lineRule="auto" w:line="259" w:before="0" w:after="180"/>
+        <w:contextualSpacing/>
+        <w:rPr/>
       </w:pPr>
       <w:r>
         <w:rPr>
           <w:b/>
-          <w:i w:val="0"/>
+          <w:i w:val="false"/>
           <w:color w:val="1F2933"/>
           <w:sz w:val="24"/>
         </w:rPr>
@@ -126,23 +184,29 @@
       </w:r>
       <w:r>
         <w:rPr>
-          <w:b w:val="0"/>
-          <w:i w:val="0"/>
+          <w:b w:val="false"/>
+          <w:i w:val="false"/>
           <w:color w:val="1F2933"/>
           <w:sz w:val="24"/>
         </w:rPr>
-        <w:t xml:space="preserve">your revised version. This can be your Final Report.</w:t>
+        <w:t>your revised version. This can be your Final Report.</w:t>
       </w:r>
     </w:p>
     <w:p>
       <w:pPr>
         <w:pStyle w:val="ListBullet"/>
-        <w:spacing w:after="180" w:before="0" w:line="259" w:lineRule="auto"/>
+        <w:numPr>
+          <w:ilvl w:val="0"/>
+          <w:numId w:val="1"/>
+        </w:numPr>
+        <w:spacing w:lineRule="auto" w:line="259" w:before="0" w:after="180"/>
+        <w:contextualSpacing/>
+        <w:rPr/>
       </w:pPr>
       <w:r>
         <w:rPr>
           <w:b/>
-          <w:i w:val="0"/>
+          <w:i w:val="false"/>
           <w:color w:val="1F2933"/>
           <w:sz w:val="24"/>
         </w:rPr>
@@ -150,22 +214,44 @@
       </w:r>
       <w:r>
         <w:rPr>
-          <w:b w:val="0"/>
-          <w:i w:val="0"/>
+          <w:b w:val="false"/>
+          <w:i w:val="false"/>
           <w:color w:val="1F2933"/>
           <w:sz w:val="24"/>
         </w:rPr>
-        <w:t xml:space="preserve">say what each read surfaced, what you changed, what you chose not to change and why, and what Todd-in-a-Can caught and missed. “It missed the thing that mattered” is as strong an answer as praise. This is about Todd-in-a-Can, not the genAI planning partner from Weeks 7–10, which belongs in your Final Report’s AI note.</w:t>
+        <w:t xml:space="preserve">say what each read surfaced, what you changed, what you chose not to change and why, and what </w:t>
+      </w:r>
+      <w:r>
+        <w:rPr>
+          <w:b/>
+          <w:bCs/>
+          <w:i w:val="false"/>
+          <w:color w:val="1F2933"/>
+          <w:sz w:val="24"/>
+          <w:shd w:fill="FFFF00" w:val="clear"/>
+        </w:rPr>
+        <w:t>Todd-in-a-Can</w:t>
+      </w:r>
+      <w:r>
+        <w:rPr>
+          <w:b w:val="false"/>
+          <w:i w:val="false"/>
+          <w:color w:val="1F2933"/>
+          <w:sz w:val="24"/>
+        </w:rPr>
+        <w:t xml:space="preserve"> caught and missed. “It missed the thing that mattered” is as strong an answer as praise. This is about Todd-in-a-Can, not the genAI planning partner from Weeks 7–10, which belongs in your Final Report’s AI note.</w:t>
       </w:r>
     </w:p>
     <w:p>
       <w:pPr>
-        <w:spacing w:after="180" w:before="60" w:line="259" w:lineRule="auto"/>
+        <w:pStyle w:val="Normal"/>
+        <w:spacing w:lineRule="auto" w:line="259" w:before="60" w:after="180"/>
+        <w:rPr/>
       </w:pPr>
       <w:r>
         <w:rPr>
           <w:b/>
-          <w:i w:val="0"/>
+          <w:i w:val="false"/>
           <w:color w:val="1F2933"/>
           <w:sz w:val="24"/>
         </w:rPr>
@@ -173,22 +259,24 @@
       </w:r>
       <w:r>
         <w:rPr>
-          <w:b w:val="0"/>
-          <w:i w:val="0"/>
+          <w:b w:val="false"/>
+          <w:i w:val="false"/>
           <w:color w:val="1F2933"/>
           <w:sz w:val="24"/>
         </w:rPr>
-        <w:t xml:space="preserve">de-identify any student work in your drafts (FERPA).</w:t>
+        <w:t>de-identify any student work in your drafts (FERPA).</w:t>
       </w:r>
     </w:p>
     <w:p>
       <w:pPr>
-        <w:spacing w:after="80" w:before="440" w:line="259" w:lineRule="auto"/>
+        <w:pStyle w:val="Normal"/>
+        <w:spacing w:lineRule="auto" w:line="259" w:before="0" w:after="86"/>
+        <w:rPr/>
       </w:pPr>
       <w:r>
         <w:rPr>
           <w:b/>
-          <w:i w:val="0"/>
+          <w:i w:val="false"/>
           <w:color w:val="1F2933"/>
           <w:sz w:val="28"/>
         </w:rPr>
@@ -198,32 +286,40 @@
     <w:tbl>
       <w:tblPr>
         <w:tblStyle w:val="TableGrid"/>
-        <w:tblW w:type="auto" w:w="0"/>
+        <w:tblW w:w="9936" w:type="dxa"/>
         <w:jc w:val="center"/>
+        <w:tblInd w:w="0" w:type="dxa"/>
         <w:tblLayout w:type="fixed"/>
-        <w:tblLook w:firstColumn="1" w:firstRow="1" w:lastColumn="0" w:lastRow="0" w:noHBand="0" w:noVBand="1" w:val="04A0"/>
-        <w:tblLayout w:type="fixed"/>
+        <w:tblCellMar>
+          <w:top w:w="173" w:type="dxa"/>
+          <w:left w:w="173" w:type="dxa"/>
+          <w:bottom w:w="173" w:type="dxa"/>
+          <w:right w:w="173" w:type="dxa"/>
+        </w:tblCellMar>
+        <w:tblLook w:val="04a0" w:noHBand="0" w:noVBand="1" w:firstColumn="1" w:lastRow="0" w:lastColumn="0" w:firstRow="1"/>
       </w:tblPr>
       <w:tblGrid>
-        <w:gridCol w:w="2088"/>
-        <w:gridCol w:w="1100"/>
+        <w:gridCol w:w="2087"/>
+        <w:gridCol w:w="1101"/>
         <w:gridCol w:w="6748"/>
       </w:tblGrid>
       <w:tr>
+        <w:trPr/>
         <w:tc>
           <w:tcPr>
-            <w:tcW w:type="dxa" w:w="2088"/>
-            <w:shd w:val="clear" w:color="auto" w:fill="E8EEF6"/>
+            <w:tcW w:w="2087" w:type="dxa"/>
+            <w:tcBorders>
+              <w:right w:val="nil"/>
+            </w:tcBorders>
+            <w:shd w:color="auto" w:fill="E8EEF6" w:val="clear"/>
           </w:tcPr>
           <w:p>
             <w:pPr>
-              <w:spacing w:after="40" w:line="240" w:lineRule="auto"/>
+              <w:pStyle w:val="Normal"/>
+              <w:suppressAutoHyphens w:val="true"/>
+              <w:spacing w:lineRule="auto" w:line="240" w:before="0" w:after="40"/>
+              <w:rPr/>
             </w:pPr>
-            <w:r>
-              <w:rPr>
-                <w:sz w:val="22"/>
-              </w:rPr>
-            </w:r>
             <w:r>
               <w:rPr>
                 <w:b/>
@@ -236,18 +332,19 @@
         </w:tc>
         <w:tc>
           <w:tcPr>
-            <w:tcW w:type="dxa" w:w="1100"/>
-            <w:shd w:val="clear" w:color="auto" w:fill="E8EEF6"/>
+            <w:tcW w:w="1101" w:type="dxa"/>
+            <w:tcBorders>
+              <w:right w:val="nil"/>
+            </w:tcBorders>
+            <w:shd w:color="auto" w:fill="E8EEF6" w:val="clear"/>
           </w:tcPr>
           <w:p>
             <w:pPr>
-              <w:spacing w:after="40" w:line="240" w:lineRule="auto"/>
+              <w:pStyle w:val="Normal"/>
+              <w:suppressAutoHyphens w:val="true"/>
+              <w:spacing w:lineRule="auto" w:line="240" w:before="0" w:after="40"/>
+              <w:rPr/>
             </w:pPr>
-            <w:r>
-              <w:rPr>
-                <w:sz w:val="22"/>
-              </w:rPr>
-            </w:r>
             <w:r>
               <w:rPr>
                 <w:b/>
@@ -260,18 +357,17 @@
         </w:tc>
         <w:tc>
           <w:tcPr>
-            <w:tcW w:type="dxa" w:w="6748"/>
-            <w:shd w:val="clear" w:color="auto" w:fill="E8EEF6"/>
+            <w:tcW w:w="6748" w:type="dxa"/>
+            <w:tcBorders/>
+            <w:shd w:color="auto" w:fill="E8EEF6" w:val="clear"/>
           </w:tcPr>
           <w:p>
             <w:pPr>
-              <w:spacing w:after="40" w:line="240" w:lineRule="auto"/>
+              <w:pStyle w:val="Normal"/>
+              <w:suppressAutoHyphens w:val="true"/>
+              <w:spacing w:lineRule="auto" w:line="240" w:before="0" w:after="40"/>
+              <w:rPr/>
             </w:pPr>
-            <w:r>
-              <w:rPr>
-                <w:sz w:val="22"/>
-              </w:rPr>
-            </w:r>
             <w:r>
               <w:rPr>
                 <w:b/>
@@ -284,19 +380,21 @@
         </w:tc>
       </w:tr>
       <w:tr>
+        <w:trPr/>
         <w:tc>
           <w:tcPr>
-            <w:tcW w:type="dxa" w:w="2088"/>
+            <w:tcW w:w="2087" w:type="dxa"/>
+            <w:tcBorders>
+              <w:right w:val="nil"/>
+            </w:tcBorders>
           </w:tcPr>
           <w:p>
             <w:pPr>
-              <w:spacing w:after="40" w:line="240" w:lineRule="auto"/>
+              <w:pStyle w:val="Normal"/>
+              <w:suppressAutoHyphens w:val="true"/>
+              <w:spacing w:lineRule="auto" w:line="240" w:before="0" w:after="40"/>
+              <w:rPr/>
             </w:pPr>
-            <w:r>
-              <w:rPr>
-                <w:sz w:val="22"/>
-              </w:rPr>
-            </w:r>
             <w:r>
               <w:rPr>
                 <w:b/>
@@ -309,11 +407,17 @@
         </w:tc>
         <w:tc>
           <w:tcPr>
-            <w:tcW w:type="dxa" w:w="1100"/>
+            <w:tcW w:w="1101" w:type="dxa"/>
+            <w:tcBorders>
+              <w:right w:val="nil"/>
+            </w:tcBorders>
           </w:tcPr>
           <w:p>
             <w:pPr>
-              <w:spacing w:after="40" w:line="240" w:lineRule="auto"/>
+              <w:pStyle w:val="Normal"/>
+              <w:suppressAutoHyphens w:val="true"/>
+              <w:spacing w:lineRule="auto" w:line="240" w:before="0" w:after="40"/>
+              <w:rPr/>
             </w:pPr>
             <w:r>
               <w:rPr>
@@ -321,31 +425,23 @@
               </w:rPr>
               <w:t>15</w:t>
             </w:r>
-            <w:r>
-              <w:rPr>
-                <w:b w:val="0"/>
-                <w:color w:val="1F2933"/>
-                <w:sz w:val="22"/>
-              </w:rPr>
-            </w:r>
           </w:p>
         </w:tc>
         <w:tc>
           <w:tcPr>
-            <w:tcW w:type="dxa" w:w="6748"/>
+            <w:tcW w:w="6748" w:type="dxa"/>
+            <w:tcBorders/>
           </w:tcPr>
           <w:p>
             <w:pPr>
-              <w:spacing w:after="40" w:line="240" w:lineRule="auto"/>
+              <w:pStyle w:val="Normal"/>
+              <w:suppressAutoHyphens w:val="true"/>
+              <w:spacing w:lineRule="auto" w:line="240" w:before="0" w:after="40"/>
+              <w:rPr/>
             </w:pPr>
             <w:r>
               <w:rPr>
-                <w:sz w:val="22"/>
-              </w:rPr>
-            </w:r>
-            <w:r>
-              <w:rPr>
-                <w:b w:val="0"/>
+                <w:b w:val="false"/>
                 <w:color w:val="1F2933"/>
                 <w:sz w:val="22"/>
               </w:rPr>
@@ -355,19 +451,22 @@
         </w:tc>
       </w:tr>
       <w:tr>
+        <w:trPr/>
         <w:tc>
           <w:tcPr>
-            <w:tcW w:type="dxa" w:w="2088"/>
+            <w:tcW w:w="2087" w:type="dxa"/>
+            <w:tcBorders>
+              <w:top w:val="nil"/>
+              <w:right w:val="nil"/>
+            </w:tcBorders>
           </w:tcPr>
           <w:p>
             <w:pPr>
-              <w:spacing w:after="40" w:line="240" w:lineRule="auto"/>
+              <w:pStyle w:val="Normal"/>
+              <w:suppressAutoHyphens w:val="true"/>
+              <w:spacing w:lineRule="auto" w:line="240" w:before="0" w:after="40"/>
+              <w:rPr/>
             </w:pPr>
-            <w:r>
-              <w:rPr>
-                <w:sz w:val="22"/>
-              </w:rPr>
-            </w:r>
             <w:r>
               <w:rPr>
                 <w:b/>
@@ -380,20 +479,22 @@
         </w:tc>
         <w:tc>
           <w:tcPr>
-            <w:tcW w:type="dxa" w:w="1100"/>
+            <w:tcW w:w="1101" w:type="dxa"/>
+            <w:tcBorders>
+              <w:top w:val="nil"/>
+              <w:right w:val="nil"/>
+            </w:tcBorders>
           </w:tcPr>
           <w:p>
             <w:pPr>
-              <w:spacing w:after="40" w:line="240" w:lineRule="auto"/>
+              <w:pStyle w:val="Normal"/>
+              <w:suppressAutoHyphens w:val="true"/>
+              <w:spacing w:lineRule="auto" w:line="240" w:before="0" w:after="40"/>
+              <w:rPr/>
             </w:pPr>
             <w:r>
               <w:rPr>
-                <w:sz w:val="22"/>
-              </w:rPr>
-            </w:r>
-            <w:r>
-              <w:rPr>
-                <w:b w:val="0"/>
+                <w:b w:val="false"/>
                 <w:color w:val="1F2933"/>
                 <w:sz w:val="22"/>
               </w:rPr>
@@ -403,97 +504,43 @@
         </w:tc>
         <w:tc>
           <w:tcPr>
-            <w:tcW w:type="dxa" w:w="6748"/>
+            <w:tcW w:w="6748" w:type="dxa"/>
+            <w:tcBorders>
+              <w:top w:val="nil"/>
+            </w:tcBorders>
           </w:tcPr>
           <w:p>
             <w:pPr>
-              <w:spacing w:after="40" w:line="240" w:lineRule="auto"/>
+              <w:pStyle w:val="Normal"/>
+              <w:suppressAutoHyphens w:val="true"/>
+              <w:spacing w:lineRule="auto" w:line="240" w:before="0" w:after="40"/>
+              <w:rPr/>
             </w:pPr>
             <w:r>
               <w:rPr>
-                <w:sz w:val="22"/>
-              </w:rPr>
-            </w:r>
-            <w:r>
-              <w:rPr>
-                <w:b w:val="0"/>
+                <w:b w:val="false"/>
                 <w:color w:val="1F2933"/>
                 <w:sz w:val="22"/>
               </w:rPr>
-              <w:t>Specific about what the peer and Todd-in-a-Can flagged and what you did about it, and honest about how Todd-in-a-Can worked as a reviewer: what it caught, missed, changed, and what you rejected. We’re grading the judgment you brought to the feedback, not proof that you received it.</w:t>
-            </w:r>
-          </w:p>
-        </w:tc>
-      </w:tr>
-      <w:tr>
-        <w:tc>
-          <w:tcPr>
-            <w:tcW w:type="dxa" w:w="2088"/>
-            <w:shd w:val="clear" w:color="auto" w:fill="E8EEF6"/>
-          </w:tcPr>
-          <w:p>
-            <w:pPr>
-              <w:spacing w:after="40" w:line="240" w:lineRule="auto"/>
-            </w:pPr>
-            <w:r>
-              <w:rPr>
-                <w:sz w:val="22"/>
-              </w:rPr>
+              <w:t xml:space="preserve">Specific about what the peer and </w:t>
             </w:r>
             <w:r>
               <w:rPr>
                 <w:b/>
+                <w:bCs/>
+                <w:color w:val="1F2933"/>
+                <w:sz w:val="22"/>
+                <w:shd w:fill="FFFF00" w:val="clear"/>
+              </w:rPr>
+              <w:t>Todd-in-a-Can</w:t>
+            </w:r>
+            <w:r>
+              <w:rPr>
+                <w:b w:val="false"/>
                 <w:color w:val="1F2933"/>
                 <w:sz w:val="22"/>
               </w:rPr>
-              <w:t>Total</w:t>
-            </w:r>
-          </w:p>
-        </w:tc>
-        <w:tc>
-          <w:tcPr>
-            <w:tcW w:type="dxa" w:w="1100"/>
-            <w:shd w:val="clear" w:color="auto" w:fill="E8EEF6"/>
-          </w:tcPr>
-          <w:p>
-            <w:pPr>
-              <w:spacing w:after="40" w:line="240" w:lineRule="auto"/>
-            </w:pPr>
-            <w:r>
-              <w:rPr>
-                <w:sz w:val="22"/>
-              </w:rPr>
-              <w:t>30</w:t>
-            </w:r>
-            <w:r>
-              <w:rPr>
-                <w:b/>
-                <w:color w:val="1F2933"/>
-                <w:sz w:val="22"/>
-              </w:rPr>
-            </w:r>
-          </w:p>
-        </w:tc>
-        <w:tc>
-          <w:tcPr>
-            <w:tcW w:type="dxa" w:w="6748"/>
-            <w:shd w:val="clear" w:color="auto" w:fill="E8EEF6"/>
-          </w:tcPr>
-          <w:p>
-            <w:pPr>
-              <w:spacing w:after="40" w:line="240" w:lineRule="auto"/>
-            </w:pPr>
-            <w:r>
-              <w:rPr>
-                <w:sz w:val="22"/>
-              </w:rPr>
-            </w:r>
-            <w:r>
-              <w:rPr>
-                <w:b w:val="0"/>
-                <w:color w:val="1F2933"/>
-                <w:sz w:val="22"/>
-              </w:rPr>
+              <w:t xml:space="preserve"> flagged and what you did about it, and honest about how Todd-in-a-Can worked as a reviewer: what it caught, missed, changed, and what you rejected. We’re grading the judgment you brought to the feedback, not proof that you received it.</w:t>
             </w:r>
           </w:p>
         </w:tc>
@@ -501,14 +548,18 @@
     </w:tbl>
     <w:p>
       <w:pPr>
-        <w:keepNext/>
-        <w:pageBreakBefore/>
-        <w:spacing w:after="80" w:before="0" w:line="259" w:lineRule="auto"/>
-      </w:pPr>
+        <w:pStyle w:val="Normal"/>
+        <w:keepNext w:val="true"/>
+        <w:spacing w:lineRule="auto" w:line="259" w:before="0" w:after="80"/>
+        <w:rPr/>
+      </w:pPr>
+      <w:r>
+        <w:br w:type="page"/>
+      </w:r>
       <w:r>
         <w:rPr>
           <w:b/>
-          <w:i w:val="0"/>
+          <w:i w:val="false"/>
           <w:color w:val="1F2933"/>
           <w:sz w:val="28"/>
         </w:rPr>
@@ -517,37 +568,42 @@
     </w:p>
     <w:p>
       <w:pPr>
-        <w:keepNext/>
-        <w:spacing w:after="80" w:before="0" w:line="259" w:lineRule="auto"/>
+        <w:pStyle w:val="Normal"/>
+        <w:keepNext w:val="true"/>
+        <w:spacing w:lineRule="auto" w:line="259" w:before="0" w:after="80"/>
+        <w:rPr/>
       </w:pPr>
       <w:r>
         <w:rPr>
-          <w:b w:val="0"/>
-          <w:i w:val="0"/>
+          <w:b w:val="false"/>
+          <w:i w:val="false"/>
           <w:color w:val="1F2933"/>
           <w:sz w:val="22"/>
         </w:rPr>
-        <w:t xml:space="preserve">Todd-in-a-Can is a prompt, not a website. Open your AI assistant (we recommend Gemini, since you all have Pro accounts), paste the prompt below, then paste your draft underneath it and send. Run it as often as it helps, and at least once before you submit. It reviews; it will not write your paper for you. That is the point.</w:t>
+        <w:t>Todd-in-a-Can is a prompt, not a website. Open your AI assistant (we recommend Gemini, since you all have Pro accounts), paste the prompt below, then paste your draft underneath it and send. Run it as often as it helps, and at least once before you submit. It reviews; it will not write your paper for you. That is the point.</w:t>
       </w:r>
     </w:p>
     <w:p>
       <w:pPr>
-        <w:keepNext/>
-        <w:spacing w:after="80" w:before="0" w:line="259" w:lineRule="auto"/>
+        <w:pStyle w:val="Normal"/>
+        <w:keepNext w:val="true"/>
+        <w:spacing w:lineRule="auto" w:line="259" w:before="0" w:after="80"/>
+        <w:rPr/>
       </w:pPr>
       <w:r>
         <w:rPr>
           <w:b/>
-          <w:i w:val="0"/>
+          <w:i w:val="false"/>
           <w:color w:val="1F2933"/>
           <w:sz w:val="22"/>
         </w:rPr>
-        <w:t xml:space="preserve">Paste from here:</w:t>
+        <w:t>Paste from here:</w:t>
       </w:r>
     </w:p>
     <w:tbl>
       <w:tblPr>
         <w:tblW w:w="9936" w:type="dxa"/>
+        <w:jc w:val="left"/>
         <w:tblInd w:w="0" w:type="dxa"/>
         <w:tblLayout w:type="fixed"/>
         <w:tblCellMar>
@@ -562,7 +618,7 @@
       </w:tblGrid>
       <w:tr>
         <w:trPr>
-          <w:cantSplit/>
+          <w:cantSplit w:val="true"/>
         </w:trPr>
         <w:tc>
           <w:tcPr>
@@ -573,46 +629,52 @@
               <w:bottom w:val="single" w:sz="4" w:space="0" w:color="000000"/>
               <w:right w:val="single" w:sz="4" w:space="0" w:color="000000"/>
             </w:tcBorders>
-            <w:shd w:val="clear" w:color="auto" w:fill="F2F2F2"/>
+            <w:shd w:color="auto" w:fill="F2F2F2" w:val="clear"/>
           </w:tcPr>
           <w:p>
             <w:pPr>
-              <w:spacing w:before="0" w:after="120" w:line="240" w:lineRule="auto"/>
-              <w:ind w:left="0" w:right="0" w:firstLine="0"/>
+              <w:pStyle w:val="Normal"/>
+              <w:spacing w:lineRule="auto" w:line="240" w:before="0" w:after="120"/>
+              <w:ind w:hanging="0" w:left="0" w:right="0"/>
+              <w:rPr/>
             </w:pPr>
             <w:r>
               <w:rPr>
                 <w:rFonts w:ascii="Courier New" w:hAnsi="Courier New"/>
-                <w:i w:val="0"/>
+                <w:i w:val="false"/>
                 <w:sz w:val="21"/>
               </w:rPr>
-              <w:t xml:space="preserve">You are Todd-in-a-Can, the AI reviewer for the TCE 318P Final Report. I will paste in a draft of my field-investigation paper. Read it the way a careful, encouraging methods instructor would, and tell me what a close reader notices, so I can make it stronger myself. The one rule that matters most: you review, you do not write. Do not rewrite my sentences, supply prose, invent data, or add citations for me. Point to what is there and what is missing, ask questions, and hand the revision back to me.</w:t>
+              <w:t>You are Todd-in-a-Can, the AI reviewer for the TCE 318P Final Report. I will paste in a draft of my field-investigation paper. Read it the way a careful, encouraging methods instructor would, and tell me what a close reader notices, so I can make it stronger myself. The one rule that matters most: you review, you do not write. Do not rewrite my sentences, supply prose, invent data, or add citations for me. Point to what is there and what is missing, ask questions, and hand the revision back to me.</w:t>
             </w:r>
           </w:p>
           <w:p>
             <w:pPr>
-              <w:spacing w:before="0" w:after="120" w:line="240" w:lineRule="auto"/>
-              <w:ind w:left="0" w:right="0" w:firstLine="0"/>
+              <w:pStyle w:val="Normal"/>
+              <w:spacing w:lineRule="auto" w:line="240" w:before="0" w:after="120"/>
+              <w:ind w:hanging="0" w:left="0" w:right="0"/>
+              <w:rPr/>
             </w:pPr>
             <w:r>
               <w:rPr>
                 <w:rFonts w:ascii="Courier New" w:hAnsi="Courier New"/>
-                <w:i w:val="0"/>
+                <w:i w:val="false"/>
                 <w:sz w:val="21"/>
               </w:rPr>
-              <w:t xml:space="preserve">The paper answers two questions with real evidence: what did I seek to learn, and what did I learn? It runs about 1,500 to 2,100 words across five equally weighted parts, plus a short note on how AI helped that is not counted in that range. Read the draft part by part. For each, say briefly what is working, then name the single most useful thing to push on:</w:t>
+              <w:t>The paper answers two questions with real evidence: what did I seek to learn, and what did I learn? It runs about 1,500 to 2,100 words across five equally weighted parts, plus a short note on how AI helped that is not counted in that range. Read the draft part by part. For each, say briefly what is working, then name the single most useful thing to push on:</w:t>
             </w:r>
           </w:p>
           <w:p>
             <w:pPr>
-              <w:spacing w:before="0" w:after="120" w:line="240" w:lineRule="auto"/>
-              <w:ind w:left="0" w:right="0" w:firstLine="0"/>
+              <w:pStyle w:val="Normal"/>
+              <w:spacing w:lineRule="auto" w:line="240" w:before="0" w:after="120"/>
+              <w:ind w:hanging="0" w:left="0" w:right="0"/>
+              <w:rPr/>
             </w:pPr>
             <w:r>
               <w:rPr>
                 <w:rFonts w:ascii="Courier New" w:hAnsi="Courier New"/>
                 <w:b/>
-                <w:i w:val="0"/>
+                <w:i w:val="false"/>
                 <w:sz w:val="21"/>
               </w:rPr>
               <w:t xml:space="preserve">Question — </w:t>
@@ -620,22 +682,24 @@
             <w:r>
               <w:rPr>
                 <w:rFonts w:ascii="Courier New" w:hAnsi="Courier New"/>
-                <w:i w:val="0"/>
+                <w:i w:val="false"/>
                 <w:sz w:val="21"/>
               </w:rPr>
-              <w:t xml:space="preserve">a clear guiding question, with the concept behind it, who my student(s) were, and why it mattered?</w:t>
+              <w:t>a clear guiding question, with the concept behind it, who my student(s) were, and why it mattered?</w:t>
             </w:r>
           </w:p>
           <w:p>
             <w:pPr>
-              <w:spacing w:before="0" w:after="120" w:line="240" w:lineRule="auto"/>
-              <w:ind w:left="0" w:right="0" w:firstLine="0"/>
+              <w:pStyle w:val="Normal"/>
+              <w:spacing w:lineRule="auto" w:line="240" w:before="0" w:after="120"/>
+              <w:ind w:hanging="0" w:left="0" w:right="0"/>
+              <w:rPr/>
             </w:pPr>
             <w:r>
               <w:rPr>
                 <w:rFonts w:ascii="Courier New" w:hAnsi="Courier New"/>
                 <w:b/>
-                <w:i w:val="0"/>
+                <w:i w:val="false"/>
                 <w:sz w:val="21"/>
               </w:rPr>
               <w:t xml:space="preserve">Methods — </w:t>
@@ -643,22 +707,24 @@
             <w:r>
               <w:rPr>
                 <w:rFonts w:ascii="Courier New" w:hAnsi="Courier New"/>
-                <w:i w:val="0"/>
+                <w:i w:val="false"/>
                 <w:sz w:val="21"/>
               </w:rPr>
-              <w:t xml:space="preserve">could a reader picture the field work: the Investigation Plan as the instrument (the Before, During, and After), what I taught, and what I collected and how?</w:t>
+              <w:t>could a reader picture the field work: the Investigation Plan as the instrument (the Before, During, and After), what I taught, and what I collected and how?</w:t>
             </w:r>
           </w:p>
           <w:p>
             <w:pPr>
-              <w:spacing w:before="0" w:after="120" w:line="240" w:lineRule="auto"/>
-              <w:ind w:left="0" w:right="0" w:firstLine="0"/>
+              <w:pStyle w:val="Normal"/>
+              <w:spacing w:lineRule="auto" w:line="240" w:before="0" w:after="120"/>
+              <w:ind w:hanging="0" w:left="0" w:right="0"/>
+              <w:rPr/>
             </w:pPr>
             <w:r>
               <w:rPr>
                 <w:rFonts w:ascii="Courier New" w:hAnsi="Courier New"/>
                 <w:b/>
-                <w:i w:val="0"/>
+                <w:i w:val="false"/>
                 <w:sz w:val="21"/>
               </w:rPr>
               <w:t xml:space="preserve">Collected Data (the heart) — </w:t>
@@ -666,22 +732,24 @@
             <w:r>
               <w:rPr>
                 <w:rFonts w:ascii="Courier New" w:hAnsi="Courier New"/>
-                <w:i w:val="0"/>
+                <w:i w:val="false"/>
                 <w:sz w:val="21"/>
               </w:rPr>
-              <w:t xml:space="preserve">at least three telling pieces of student work and talk, actually shown? Is each read closely along Depth of Knowledge, Ohio standard(s), grade-level performance, and the questions it raises? Are claims tied to specific artifacts? Does the synthesis land a tentative answer, confident where the evidence supports it and honest where it stays uncertain? Is student talk treated as data, attributed to a pseudonym, with reconstructions flagged?</w:t>
+              <w:t>at least three telling pieces of student work and talk, actually shown? Is each read closely along Depth of Knowledge, Ohio standard(s), grade-level performance, and the questions it raises? Are claims tied to specific artifacts? Does the synthesis land a tentative answer, confident where the evidence supports it and honest where it stays uncertain? Is student talk treated as data, attributed to a pseudonym, with reconstructions flagged?</w:t>
             </w:r>
           </w:p>
           <w:p>
             <w:pPr>
-              <w:spacing w:before="0" w:after="120" w:line="240" w:lineRule="auto"/>
-              <w:ind w:left="0" w:right="0" w:firstLine="0"/>
+              <w:pStyle w:val="Normal"/>
+              <w:spacing w:lineRule="auto" w:line="240" w:before="0" w:after="120"/>
+              <w:ind w:hanging="0" w:left="0" w:right="0"/>
+              <w:rPr/>
             </w:pPr>
             <w:r>
               <w:rPr>
                 <w:rFonts w:ascii="Courier New" w:hAnsi="Courier New"/>
                 <w:b/>
-                <w:i w:val="0"/>
+                <w:i w:val="false"/>
                 <w:sz w:val="21"/>
               </w:rPr>
               <w:t xml:space="preserve">What Does Research Say? — </w:t>
@@ -689,22 +757,24 @@
             <w:r>
               <w:rPr>
                 <w:rFonts w:ascii="Courier New" w:hAnsi="Courier New"/>
-                <w:i w:val="0"/>
+                <w:i w:val="false"/>
                 <w:sz w:val="21"/>
               </w:rPr>
-              <w:t xml:space="preserve">relevant literature, cited in a standard style in text and in a reference list, connected to what my data showed?</w:t>
+              <w:t>relevant literature, cited in a standard style in text and in a reference list, connected to what my data showed?</w:t>
             </w:r>
           </w:p>
           <w:p>
             <w:pPr>
-              <w:spacing w:before="0" w:after="120" w:line="240" w:lineRule="auto"/>
-              <w:ind w:left="0" w:right="0" w:firstLine="0"/>
+              <w:pStyle w:val="Normal"/>
+              <w:spacing w:lineRule="auto" w:line="240" w:before="0" w:after="120"/>
+              <w:ind w:hanging="0" w:left="0" w:right="0"/>
+              <w:rPr/>
             </w:pPr>
             <w:r>
               <w:rPr>
                 <w:rFonts w:ascii="Courier New" w:hAnsi="Courier New"/>
                 <w:b/>
-                <w:i w:val="0"/>
+                <w:i w:val="false"/>
                 <w:sz w:val="21"/>
               </w:rPr>
               <w:t xml:space="preserve">Next Steps — </w:t>
@@ -712,22 +782,24 @@
             <w:r>
               <w:rPr>
                 <w:rFonts w:ascii="Courier New" w:hAnsi="Courier New"/>
-                <w:i w:val="0"/>
+                <w:i w:val="false"/>
                 <w:sz w:val="21"/>
               </w:rPr>
-              <w:t xml:space="preserve">an honest read of what one lesson with a few students can and cannot show, and a grounded next move?</w:t>
+              <w:t>an honest read of what one lesson with a few students can and cannot show, and a grounded next move?</w:t>
             </w:r>
           </w:p>
           <w:p>
             <w:pPr>
-              <w:spacing w:before="0" w:after="120" w:line="240" w:lineRule="auto"/>
-              <w:ind w:left="0" w:right="0" w:firstLine="0"/>
+              <w:pStyle w:val="Normal"/>
+              <w:spacing w:lineRule="auto" w:line="240" w:before="0" w:after="120"/>
+              <w:ind w:hanging="0" w:left="0" w:right="0"/>
+              <w:rPr/>
             </w:pPr>
             <w:r>
               <w:rPr>
                 <w:rFonts w:ascii="Courier New" w:hAnsi="Courier New"/>
                 <w:b/>
-                <w:i w:val="0"/>
+                <w:i w:val="false"/>
                 <w:sz w:val="21"/>
               </w:rPr>
               <w:t xml:space="preserve">How AI helped — </w:t>
@@ -735,62 +807,79 @@
             <w:r>
               <w:rPr>
                 <w:rFonts w:ascii="Courier New" w:hAnsi="Courier New"/>
-                <w:i w:val="0"/>
+                <w:i w:val="false"/>
                 <w:sz w:val="21"/>
               </w:rPr>
-              <w:t xml:space="preserve">a short, honest account woven in?</w:t>
+              <w:t>a short, honest account woven in?</w:t>
             </w:r>
           </w:p>
           <w:p>
             <w:pPr>
-              <w:spacing w:before="0" w:after="120" w:line="240" w:lineRule="auto"/>
-              <w:ind w:left="0" w:right="0" w:firstLine="0"/>
+              <w:pStyle w:val="Normal"/>
+              <w:spacing w:lineRule="auto" w:line="240" w:before="0" w:after="120"/>
+              <w:ind w:hanging="0" w:left="0" w:right="0"/>
+              <w:rPr/>
             </w:pPr>
             <w:r>
               <w:rPr>
                 <w:rFonts w:ascii="Courier New" w:hAnsi="Courier New"/>
-                <w:i w:val="0"/>
+                <w:i w:val="false"/>
                 <w:sz w:val="21"/>
               </w:rPr>
-              <w:t xml:space="preserve">Also check the floor: figures labeled, captioned, numbered, and discussed where they appear; pseudonyms only and de-identified student work; word count in range.</w:t>
+              <w:t>Also check the floor: figures labeled, captioned, numbered, and discussed where they appear; pseudonyms only and de-identified student work; word count in range.</w:t>
             </w:r>
           </w:p>
           <w:p>
             <w:pPr>
-              <w:spacing w:before="0" w:after="120" w:line="240" w:lineRule="auto"/>
-              <w:ind w:left="0" w:right="0" w:firstLine="0"/>
+              <w:pStyle w:val="Normal"/>
+              <w:spacing w:lineRule="auto" w:line="240" w:before="0" w:after="120"/>
+              <w:ind w:hanging="0" w:left="0" w:right="0"/>
+              <w:rPr/>
             </w:pPr>
             <w:r>
               <w:rPr>
                 <w:rFonts w:ascii="Courier New" w:hAnsi="Courier New"/>
-                <w:i w:val="0"/>
+                <w:i w:val="false"/>
                 <w:sz w:val="21"/>
               </w:rPr>
-              <w:t xml:space="preserve">Hold the line on honesty. This paper is graded on evidence-based reasoning and honesty about limits, not on whether it answered the question. “Here is what I saw, and here is what I still don’t know” is a strong paper. Never push me to over-claim to sound more finished. If I over-claim, say a confident conclusion three pieces of evidence cannot carry, flag it and ask me to say what the evidence can and cannot support.</w:t>
+              <w:t>Hold the line on honesty. This paper is graded on evidence-based reasoning and honesty about limits, not on whether it answered the question. “Here is what I saw, and here is what I still don’t know” is a strong paper. Never push me to over-claim to sound more finished. If I over-claim, say a confident conclusion three pieces of evidence cannot carry, flag it and ask me to say what the evidence can and cannot support.</w:t>
             </w:r>
           </w:p>
           <w:p>
             <w:pPr>
-              <w:spacing w:before="0" w:after="120" w:line="240" w:lineRule="auto"/>
-              <w:ind w:left="0" w:right="0" w:firstLine="0"/>
+              <w:pStyle w:val="Normal"/>
+              <w:spacing w:lineRule="auto" w:line="240" w:before="0" w:after="120"/>
+              <w:ind w:hanging="0" w:left="0" w:right="0"/>
+              <w:rPr/>
             </w:pPr>
             <w:r>
               <w:rPr>
                 <w:rFonts w:ascii="Courier New" w:hAnsi="Courier New"/>
-                <w:i w:val="0"/>
+                <w:i w:val="false"/>
                 <w:sz w:val="21"/>
               </w:rPr>
-              <w:t xml:space="preserve">Close with the one revision that would most strengthen the paper. Keep everything concrete and tied to my own evidence. Be direct and warm. Do not dump jargon, and do not do the work for me.</w:t>
+              <w:t>Close with the one revision that would most strengthen the paper. Keep everything concrete and tied to my own evidence. Be direct and warm. Do not dump jargon, and do not do the work for me.</w:t>
             </w:r>
           </w:p>
         </w:tc>
       </w:tr>
     </w:tbl>
-    <w:p/>
+    <w:p>
+      <w:pPr>
+        <w:pStyle w:val="Normal"/>
+        <w:rPr/>
+      </w:pPr>
+      <w:r>
+        <w:rPr/>
+      </w:r>
+    </w:p>
     <w:sectPr>
       <w:type w:val="nextPage"/>
       <w:pgSz w:w="12240" w:h="15840"/>
-      <w:pgMar w:top="864" w:right="1152" w:bottom="864" w:left="1152" w:header="0" w:footer="0" w:gutter="0"/>
+      <w:pgMar w:left="1152" w:right="1152" w:gutter="0" w:header="0" w:top="864" w:footer="0" w:bottom="864"/>
+      <w:pgNumType w:fmt="decimal"/>
+      <w:formProt w:val="false"/>
+      <w:textDirection w:val="lrTb"/>
       <w:docGrid w:type="default" w:linePitch="360" w:charSpace="0"/>
     </w:sectPr>
   </w:body>
@@ -804,12 +893,12 @@
       <w:start w:val="1"/>
       <w:numFmt w:val="bullet"/>
       <w:lvlText w:val=""/>
-      <w:lvlJc w:val="start"/>
+      <w:lvlJc w:val="left"/>
       <w:pPr>
         <w:tabs>
           <w:tab w:val="num" w:pos="360"/>
         </w:tabs>
-        <w:ind w:start="360" w:hanging="360"/>
+        <w:ind w:left="360" w:hanging="360"/>
       </w:pPr>
       <w:rPr>
         <w:rFonts w:ascii="Symbol" w:hAnsi="Symbol" w:cs="Symbol" w:hint="default"/>
@@ -819,97 +908,105 @@
       <w:start w:val="1"/>
       <w:numFmt w:val="decimal"/>
       <w:lvlText w:val="%2."/>
-      <w:lvlJc w:val="start"/>
+      <w:lvlJc w:val="left"/>
       <w:pPr>
         <w:tabs>
           <w:tab w:val="num" w:pos="1080"/>
         </w:tabs>
-        <w:ind w:start="1080" w:hanging="360"/>
-      </w:pPr>
+        <w:ind w:left="1080" w:hanging="360"/>
+      </w:pPr>
+      <w:rPr/>
     </w:lvl>
     <w:lvl w:ilvl="2">
       <w:start w:val="1"/>
       <w:numFmt w:val="decimal"/>
       <w:lvlText w:val="%3."/>
-      <w:lvlJc w:val="start"/>
+      <w:lvlJc w:val="left"/>
       <w:pPr>
         <w:tabs>
           <w:tab w:val="num" w:pos="1440"/>
         </w:tabs>
-        <w:ind w:start="1440" w:hanging="360"/>
-      </w:pPr>
+        <w:ind w:left="1440" w:hanging="360"/>
+      </w:pPr>
+      <w:rPr/>
     </w:lvl>
     <w:lvl w:ilvl="3">
       <w:start w:val="1"/>
       <w:numFmt w:val="decimal"/>
       <w:lvlText w:val="%4."/>
-      <w:lvlJc w:val="start"/>
+      <w:lvlJc w:val="left"/>
       <w:pPr>
         <w:tabs>
           <w:tab w:val="num" w:pos="1800"/>
         </w:tabs>
-        <w:ind w:start="1800" w:hanging="360"/>
-      </w:pPr>
+        <w:ind w:left="1800" w:hanging="360"/>
+      </w:pPr>
+      <w:rPr/>
     </w:lvl>
     <w:lvl w:ilvl="4">
       <w:start w:val="1"/>
       <w:numFmt w:val="decimal"/>
       <w:lvlText w:val="%5."/>
-      <w:lvlJc w:val="start"/>
+      <w:lvlJc w:val="left"/>
       <w:pPr>
         <w:tabs>
           <w:tab w:val="num" w:pos="2160"/>
         </w:tabs>
-        <w:ind w:start="2160" w:hanging="360"/>
-      </w:pPr>
+        <w:ind w:left="2160" w:hanging="360"/>
+      </w:pPr>
+      <w:rPr/>
     </w:lvl>
     <w:lvl w:ilvl="5">
       <w:start w:val="1"/>
       <w:numFmt w:val="decimal"/>
       <w:lvlText w:val="%6."/>
-      <w:lvlJc w:val="start"/>
+      <w:lvlJc w:val="left"/>
       <w:pPr>
         <w:tabs>
           <w:tab w:val="num" w:pos="2520"/>
         </w:tabs>
-        <w:ind w:start="2520" w:hanging="360"/>
-      </w:pPr>
+        <w:ind w:left="2520" w:hanging="360"/>
+      </w:pPr>
+      <w:rPr/>
     </w:lvl>
     <w:lvl w:ilvl="6">
       <w:start w:val="1"/>
       <w:numFmt w:val="decimal"/>
       <w:lvlText w:val="%7."/>
-      <w:lvlJc w:val="start"/>
+      <w:lvlJc w:val="left"/>
       <w:pPr>
         <w:tabs>
           <w:tab w:val="num" w:pos="2880"/>
         </w:tabs>
-        <w:ind w:start="2880" w:hanging="360"/>
-      </w:pPr>
+        <w:ind w:left="2880" w:hanging="360"/>
+      </w:pPr>
+      <w:rPr/>
     </w:lvl>
     <w:lvl w:ilvl="7">
       <w:start w:val="1"/>
       <w:numFmt w:val="decimal"/>
       <w:lvlText w:val="%8."/>
-      <w:lvlJc w:val="start"/>
+      <w:lvlJc w:val="left"/>
       <w:pPr>
         <w:tabs>
           <w:tab w:val="num" w:pos="3240"/>
         </w:tabs>
-        <w:ind w:start="3240" w:hanging="360"/>
-      </w:pPr>
+        <w:ind w:left="3240" w:hanging="360"/>
+      </w:pPr>
+      <w:rPr/>
     </w:lvl>
     <w:lvl w:ilvl="8">
       <w:start w:val="1"/>
       <w:numFmt w:val="decimal"/>
       <w:lvlText w:val="%9."/>
-      <w:lvlJc w:val="start"/>
+      <w:lvlJc w:val="left"/>
       <w:pPr>
         <w:tabs>
           <w:tab w:val="num" w:pos="3600"/>
         </w:tabs>
-        <w:ind w:start="3600" w:hanging="360"/>
-      </w:pPr>
+        <w:ind w:left="3600" w:hanging="360"/>
+      </w:pPr>
+      <w:rPr/>
     </w:lvl>
   </w:abstractNum>
   <w:abstractNum w:abstractNumId="2">
@@ -917,12 +1014,12 @@
       <w:start w:val="1"/>
       <w:numFmt w:val="bullet"/>
       <w:lvlText w:val=""/>
-      <w:lvlJc w:val="start"/>
+      <w:lvlJc w:val="left"/>
       <w:pPr>
         <w:tabs>
           <w:tab w:val="num" w:pos="720"/>
         </w:tabs>
-        <w:ind w:start="720" w:hanging="360"/>
+        <w:ind w:left="720" w:hanging="360"/>
       </w:pPr>
       <w:rPr>
         <w:rFonts w:ascii="Symbol" w:hAnsi="Symbol" w:cs="Symbol" w:hint="default"/>
@@ -932,97 +1029,105 @@
       <w:start w:val="1"/>
       <w:numFmt w:val="decimal"/>
       <w:lvlText w:val="%2."/>
-      <w:lvlJc w:val="start"/>
+      <w:lvlJc w:val="left"/>
       <w:pPr>
         <w:tabs>
           <w:tab w:val="num" w:pos="1080"/>
         </w:tabs>
-        <w:ind w:start="1080" w:hanging="360"/>
-      </w:pPr>
+        <w:ind w:left="1080" w:hanging="360"/>
+      </w:pPr>
+      <w:rPr/>
     </w:lvl>
     <w:lvl w:ilvl="2">
       <w:start w:val="1"/>
       <w:numFmt w:val="decimal"/>
       <w:lvlText w:val="%3."/>
-      <w:lvlJc w:val="start"/>
+      <w:lvlJc w:val="left"/>
       <w:pPr>
         <w:tabs>
           <w:tab w:val="num" w:pos="1440"/>
         </w:tabs>
-        <w:ind w:start="1440" w:hanging="360"/>
-      </w:pPr>
+        <w:ind w:left="1440" w:hanging="360"/>
+      </w:pPr>
+      <w:rPr/>
     </w:lvl>
     <w:lvl w:ilvl="3">
       <w:start w:val="1"/>
       <w:numFmt w:val="decimal"/>
       <w:lvlText w:val="%4."/>
-      <w:lvlJc w:val="start"/>
+      <w:lvlJc w:val="left"/>
       <w:pPr>
         <w:tabs>
           <w:tab w:val="num" w:pos="1800"/>
         </w:tabs>
-        <w:ind w:start="1800" w:hanging="360"/>
-      </w:pPr>
+        <w:ind w:left="1800" w:hanging="360"/>
+      </w:pPr>
+      <w:rPr/>
     </w:lvl>
     <w:lvl w:ilvl="4">
       <w:start w:val="1"/>
       <w:numFmt w:val="decimal"/>
       <w:lvlText w:val="%5."/>
-      <w:lvlJc w:val="start"/>
+      <w:lvlJc w:val="left"/>
       <w:pPr>
         <w:tabs>
           <w:tab w:val="num" w:pos="2160"/>
         </w:tabs>
-        <w:ind w:start="2160" w:hanging="360"/>
-      </w:pPr>
+        <w:ind w:left="2160" w:hanging="360"/>
+      </w:pPr>
+      <w:rPr/>
     </w:lvl>
     <w:lvl w:ilvl="5">
       <w:start w:val="1"/>
       <w:numFmt w:val="decimal"/>
       <w:lvlText w:val="%6."/>
-      <w:lvlJc w:val="start"/>
+      <w:lvlJc w:val="left"/>
       <w:pPr>
         <w:tabs>
           <w:tab w:val="num" w:pos="2520"/>
         </w:tabs>
-        <w:ind w:start="2520" w:hanging="360"/>
-      </w:pPr>
+        <w:ind w:left="2520" w:hanging="360"/>
+      </w:pPr>
+      <w:rPr/>
     </w:lvl>
     <w:lvl w:ilvl="6">
       <w:start w:val="1"/>
       <w:numFmt w:val="decimal"/>
       <w:lvlText w:val="%7."/>
-      <w:lvlJc w:val="start"/>
+      <w:lvlJc w:val="left"/>
       <w:pPr>
         <w:tabs>
           <w:tab w:val="num" w:pos="2880"/>
         </w:tabs>
-        <w:ind w:start="2880" w:hanging="360"/>
-      </w:pPr>
+        <w:ind w:left="2880" w:hanging="360"/>
+      </w:pPr>
+      <w:rPr/>
     </w:lvl>
     <w:lvl w:ilvl="7">
       <w:start w:val="1"/>
       <w:numFmt w:val="decimal"/>
       <w:lvlText w:val="%8."/>
-      <w:lvlJc w:val="start"/>
+      <w:lvlJc w:val="left"/>
       <w:pPr>
         <w:tabs>
           <w:tab w:val="num" w:pos="3240"/>
         </w:tabs>
-        <w:ind w:start="3240" w:hanging="360"/>
-      </w:pPr>
+        <w:ind w:left="3240" w:hanging="360"/>
+      </w:pPr>
+      <w:rPr/>
     </w:lvl>
     <w:lvl w:ilvl="8">
       <w:start w:val="1"/>
       <w:numFmt w:val="decimal"/>
       <w:lvlText w:val="%9."/>
-      <w:lvlJc w:val="start"/>
+      <w:lvlJc w:val="left"/>
       <w:pPr>
         <w:tabs>
           <w:tab w:val="num" w:pos="3600"/>
         </w:tabs>
-        <w:ind w:start="3600" w:hanging="360"/>
-      </w:pPr>
+        <w:ind w:left="3600" w:hanging="360"/>
+      </w:pPr>
+      <w:rPr/>
     </w:lvl>
   </w:abstractNum>
   <w:abstractNum w:abstractNumId="3">
@@ -1030,12 +1135,12 @@
       <w:start w:val="1"/>
       <w:numFmt w:val="bullet"/>
       <w:lvlText w:val=""/>
-      <w:lvlJc w:val="start"/>
+      <w:lvlJc w:val="left"/>
       <w:pPr>
         <w:tabs>
           <w:tab w:val="num" w:pos="1080"/>
         </w:tabs>
-        <w:ind w:start="1080" w:hanging="360"/>
+        <w:ind w:left="1080" w:hanging="360"/>
       </w:pPr>
       <w:rPr>
         <w:rFonts w:ascii="Symbol" w:hAnsi="Symbol" w:cs="Symbol" w:hint="default"/>
@@ -1045,97 +1150,105 @@
       <w:start w:val="1"/>
       <w:numFmt w:val="decimal"/>
       <w:lvlText w:val="%2."/>
-      <w:lvlJc w:val="start"/>
+      <w:lvlJc w:val="left"/>
       <w:pPr>
         <w:tabs>
           <w:tab w:val="num" w:pos="1080"/>
         </w:tabs>
-        <w:ind w:start="1080" w:hanging="360"/>
-      </w:pPr>
+        <w:ind w:left="1080" w:hanging="360"/>
+      </w:pPr>
+      <w:rPr/>
     </w:lvl>
     <w:lvl w:ilvl="2">
       <w:start w:val="1"/>
       <w:numFmt w:val="decimal"/>
       <w:lvlText w:val="%3."/>
-      <w:lvlJc w:val="start"/>
+      <w:lvlJc w:val="left"/>
       <w:pPr>
         <w:tabs>
           <w:tab w:val="num" w:pos="1440"/>
         </w:tabs>
-        <w:ind w:start="1440" w:hanging="360"/>
-      </w:pPr>
+        <w:ind w:left="1440" w:hanging="360"/>
+      </w:pPr>
+      <w:rPr/>
     </w:lvl>
     <w:lvl w:ilvl="3">
       <w:start w:val="1"/>
       <w:numFmt w:val="decimal"/>
       <w:lvlText w:val="%4."/>
-      <w:lvlJc w:val="start"/>
+      <w:lvlJc w:val="left"/>
       <w:pPr>
         <w:tabs>
           <w:tab w:val="num" w:pos="1800"/>
         </w:tabs>
-        <w:ind w:start="1800" w:hanging="360"/>
-      </w:pPr>
+        <w:ind w:left="1800" w:hanging="360"/>
+      </w:pPr>
+      <w:rPr/>
     </w:lvl>
     <w:lvl w:ilvl="4">
       <w:start w:val="1"/>
       <w:numFmt w:val="decimal"/>
       <w:lvlText w:val="%5."/>
-      <w:lvlJc w:val="start"/>
+      <w:lvlJc w:val="left"/>
       <w:pPr>
         <w:tabs>
           <w:tab w:val="num" w:pos="2160"/>
         </w:tabs>
-        <w:ind w:start="2160" w:hanging="360"/>
-      </w:pPr>
+        <w:ind w:left="2160" w:hanging="360"/>
+      </w:pPr>
+      <w:rPr/>
     </w:lvl>
     <w:lvl w:ilvl="5">
       <w:start w:val="1"/>
       <w:numFmt w:val="decimal"/>
       <w:lvlText w:val="%6."/>
-      <w:lvlJc w:val="start"/>
+      <w:lvlJc w:val="left"/>
       <w:pPr>
         <w:tabs>
           <w:tab w:val="num" w:pos="2520"/>
         </w:tabs>
-        <w:ind w:start="2520" w:hanging="360"/>
-      </w:pPr>
+        <w:ind w:left="2520" w:hanging="360"/>
+      </w:pPr>
+      <w:rPr/>
     </w:lvl>
     <w:lvl w:ilvl="6">
       <w:start w:val="1"/>
       <w:numFmt w:val="decimal"/>
       <w:lvlText w:val="%7."/>
-      <w:lvlJc w:val="start"/>
+      <w:lvlJc w:val="left"/>
       <w:pPr>
         <w:tabs>
           <w:tab w:val="num" w:pos="2880"/>
         </w:tabs>
-        <w:ind w:start="2880" w:hanging="360"/>
-      </w:pPr>
+        <w:ind w:left="2880" w:hanging="360"/>
+      </w:pPr>
+      <w:rPr/>
     </w:lvl>
     <w:lvl w:ilvl="7">
       <w:start w:val="1"/>
       <w:numFmt w:val="decimal"/>
       <w:lvlText w:val="%8."/>
-      <w:lvlJc w:val="start"/>
+      <w:lvlJc w:val="left"/>
       <w:pPr>
         <w:tabs>
           <w:tab w:val="num" w:pos="3240"/>
         </w:tabs>
-        <w:ind w:start="3240" w:hanging="360"/>
-      </w:pPr>
+        <w:ind w:left="3240" w:hanging="360"/>
+      </w:pPr>
+      <w:rPr/>
     </w:lvl>
     <w:lvl w:ilvl="8">
       <w:start w:val="1"/>
       <w:numFmt w:val="decimal"/>
       <w:lvlText w:val="%9."/>
-      <w:lvlJc w:val="start"/>
+      <w:lvlJc w:val="left"/>
       <w:pPr>
         <w:tabs>
           <w:tab w:val="num" w:pos="3600"/>
         </w:tabs>
-        <w:ind w:start="3600" w:hanging="360"/>
-      </w:pPr>
+        <w:ind w:left="3600" w:hanging="360"/>
+      </w:pPr>
+      <w:rPr/>
     </w:lvl>
   </w:abstractNum>
   <w:abstractNum w:abstractNumId="4">
@@ -1143,12 +1256,12 @@
       <w:start w:val="1"/>
       <w:numFmt w:val="decimal"/>
       <w:lvlText w:val="%1."/>
-      <w:lvlJc w:val="start"/>
+      <w:lvlJc w:val="left"/>
       <w:pPr>
         <w:tabs>
           <w:tab w:val="num" w:pos="360"/>
         </w:tabs>
-        <w:ind w:start="360" w:hanging="360"/>
+        <w:ind w:left="360" w:hanging="360"/>
       </w:pPr>
       <w:rPr/>
     </w:lvl>
@@ -1156,97 +1269,105 @@
       <w:start w:val="1"/>
       <w:numFmt w:val="decimal"/>
       <w:lvlText w:val="%2."/>
-      <w:lvlJc w:val="start"/>
+      <w:lvlJc w:val="left"/>
       <w:pPr>
         <w:tabs>
           <w:tab w:val="num" w:pos="1080"/>
         </w:tabs>
-        <w:ind w:start="1080" w:hanging="360"/>
-      </w:pPr>
+        <w:ind w:left="1080" w:hanging="360"/>
+      </w:pPr>
+      <w:rPr/>
     </w:lvl>
     <w:lvl w:ilvl="2">
       <w:start w:val="1"/>
       <w:numFmt w:val="decimal"/>
       <w:lvlText w:val="%3."/>
-      <w:lvlJc w:val="start"/>
+      <w:lvlJc w:val="left"/>
       <w:pPr>
         <w:tabs>
           <w:tab w:val="num" w:pos="1440"/>
         </w:tabs>
-        <w:ind w:start="1440" w:hanging="360"/>
-      </w:pPr>
+        <w:ind w:left="1440" w:hanging="360"/>
+      </w:pPr>
+      <w:rPr/>
     </w:lvl>
     <w:lvl w:ilvl="3">
       <w:start w:val="1"/>
       <w:numFmt w:val="decimal"/>
       <w:lvlText w:val="%4."/>
-      <w:lvlJc w:val="start"/>
+      <w:lvlJc w:val="left"/>
       <w:pPr>
         <w:tabs>
           <w:tab w:val="num" w:pos="1800"/>
         </w:tabs>
-        <w:ind w:start="1800" w:hanging="360"/>
-      </w:pPr>
+        <w:ind w:left="1800" w:hanging="360"/>
+      </w:pPr>
+      <w:rPr/>
     </w:lvl>
     <w:lvl w:ilvl="4">
       <w:start w:val="1"/>
       <w:numFmt w:val="decimal"/>
       <w:lvlText w:val="%5."/>
-      <w:lvlJc w:val="start"/>
+      <w:lvlJc w:val="left"/>
       <w:pPr>
         <w:tabs>
           <w:tab w:val="num" w:pos="2160"/>
         </w:tabs>
-        <w:ind w:start="2160" w:hanging="360"/>
-      </w:pPr>
+        <w:ind w:left="2160" w:hanging="360"/>
+      </w:pPr>
+      <w:rPr/>
     </w:lvl>
     <w:lvl w:ilvl="5">
       <w:start w:val="1"/>
       <w:numFmt w:val="decimal"/>
       <w:lvlText w:val="%6."/>
-      <w:lvlJc w:val="start"/>
+      <w:lvlJc w:val="left"/>
       <w:pPr>
         <w:tabs>
           <w:tab w:val="num" w:pos="2520"/>
         </w:tabs>
-        <w:ind w:start="2520" w:hanging="360"/>
-      </w:pPr>
+        <w:ind w:left="2520" w:hanging="360"/>
+      </w:pPr>
+      <w:rPr/>
     </w:lvl>
     <w:lvl w:ilvl="6">
       <w:start w:val="1"/>
       <w:numFmt w:val="decimal"/>
       <w:lvlText w:val="%7."/>
-      <w:lvlJc w:val="start"/>
+      <w:lvlJc w:val="left"/>
       <w:pPr>
         <w:tabs>
           <w:tab w:val="num" w:pos="2880"/>
         </w:tabs>
-        <w:ind w:start="2880" w:hanging="360"/>
-      </w:pPr>
+        <w:ind w:left="2880" w:hanging="360"/>
+      </w:pPr>
+      <w:rPr/>
     </w:lvl>
     <w:lvl w:ilvl="7">
       <w:start w:val="1"/>
       <w:numFmt w:val="decimal"/>
       <w:lvlText w:val="%8."/>
-      <w:lvlJc w:val="start"/>
+      <w:lvlJc w:val="left"/>
       <w:pPr>
         <w:tabs>
           <w:tab w:val="num" w:pos="3240"/>
         </w:tabs>
-        <w:ind w:start="3240" w:hanging="360"/>
-      </w:pPr>
+        <w:ind w:left="3240" w:hanging="360"/>
+      </w:pPr>
+      <w:rPr/>
     </w:lvl>
     <w:lvl w:ilvl="8">
       <w:start w:val="1"/>
       <w:numFmt w:val="decimal"/>
       <w:lvlText w:val="%9."/>
-      <w:lvlJc w:val="start"/>
+      <w:lvlJc w:val="left"/>
       <w:pPr>
         <w:tabs>
           <w:tab w:val="num" w:pos="3600"/>
         </w:tabs>
-        <w:ind w:start="3600" w:hanging="360"/>
-      </w:pPr>
+        <w:ind w:left="3600" w:hanging="360"/>
+      </w:pPr>
+      <w:rPr/>
     </w:lvl>
   </w:abstractNum>
   <w:abstractNum w:abstractNumId="5">
@@ -1254,12 +1375,12 @@
       <w:start w:val="1"/>
       <w:numFmt w:val="decimal"/>
       <w:lvlText w:val="%1."/>
-      <w:lvlJc w:val="start"/>
+      <w:lvlJc w:val="left"/>
       <w:pPr>
         <w:tabs>
           <w:tab w:val="num" w:pos="720"/>
         </w:tabs>
-        <w:ind w:start="720" w:hanging="360"/>
+        <w:ind w:left="720" w:hanging="360"/>
       </w:pPr>
       <w:rPr/>
     </w:lvl>
@@ -1267,97 +1388,105 @@
       <w:start w:val="1"/>
       <w:numFmt w:val="decimal"/>
       <w:lvlText w:val="%2."/>
-      <w:lvlJc w:val="start"/>
+      <w:lvlJc w:val="left"/>
       <w:pPr>
         <w:tabs>
           <w:tab w:val="num" w:pos="1080"/>
         </w:tabs>
-        <w:ind w:start="1080" w:hanging="360"/>
-      </w:pPr>
+        <w:ind w:left="1080" w:hanging="360"/>
+      </w:pPr>
+      <w:rPr/>
     </w:lvl>
     <w:lvl w:ilvl="2">
       <w:start w:val="1"/>
       <w:numFmt w:val="decimal"/>
       <w:lvlText w:val="%3."/>
-      <w:lvlJc w:val="start"/>
+      <w:lvlJc w:val="left"/>
       <w:pPr>
         <w:tabs>
           <w:tab w:val="num" w:pos="1440"/>
         </w:tabs>
-        <w:ind w:start="1440" w:hanging="360"/>
-      </w:pPr>
+        <w:ind w:left="1440" w:hanging="360"/>
+      </w:pPr>
+      <w:rPr/>
     </w:lvl>
     <w:lvl w:ilvl="3">
       <w:start w:val="1"/>
       <w:numFmt w:val="decimal"/>
       <w:lvlText w:val="%4."/>
-      <w:lvlJc w:val="start"/>
+      <w:lvlJc w:val="left"/>
       <w:pPr>
         <w:tabs>
           <w:tab w:val="num" w:pos="1800"/>
         </w:tabs>
-        <w:ind w:start="1800" w:hanging="360"/>
-      </w:pPr>
+        <w:ind w:left="1800" w:hanging="360"/>
+      </w:pPr>
+      <w:rPr/>
     </w:lvl>
     <w:lvl w:ilvl="4">
       <w:start w:val="1"/>
       <w:numFmt w:val="decimal"/>
       <w:lvlText w:val="%5."/>
-      <w:lvlJc w:val="start"/>
+      <w:lvlJc w:val="left"/>
       <w:pPr>
         <w:tabs>
           <w:tab w:val="num" w:pos="2160"/>
         </w:tabs>
-        <w:ind w:start="2160" w:hanging="360"/>
-      </w:pPr>
+        <w:ind w:left="2160" w:hanging="360"/>
+      </w:pPr>
+      <w:rPr/>
     </w:lvl>
     <w:lvl w:ilvl="5">
       <w:start w:val="1"/>
       <w:numFmt w:val="decimal"/>
       <w:lvlText w:val="%6."/>
-      <w:lvlJc w:val="start"/>
+      <w:lvlJc w:val="left"/>
       <w:pPr>
         <w:tabs>
           <w:tab w:val="num" w:pos="2520"/>
         </w:tabs>
-        <w:ind w:start="2520" w:hanging="360"/>
-      </w:pPr>
+        <w:ind w:left="2520" w:hanging="360"/>
+      </w:pPr>
+      <w:rPr/>
     </w:lvl>
     <w:lvl w:ilvl="6">
       <w:start w:val="1"/>
       <w:numFmt w:val="decimal"/>
       <w:lvlText w:val="%7."/>
-      <w:lvlJc w:val="start"/>
+      <w:lvlJc w:val="left"/>
       <w:pPr>
         <w:tabs>
           <w:tab w:val="num" w:pos="2880"/>
         </w:tabs>
-        <w:ind w:start="2880" w:hanging="360"/>
-      </w:pPr>
+        <w:ind w:left="2880" w:hanging="360"/>
+      </w:pPr>
+      <w:rPr/>
     </w:lvl>
     <w:lvl w:ilvl="7">
       <w:start w:val="1"/>
       <w:numFmt w:val="decimal"/>
       <w:lvlText w:val="%8."/>
-      <w:lvlJc w:val="start"/>
+      <w:lvlJc w:val="left"/>
       <w:pPr>
         <w:tabs>
           <w:tab w:val="num" w:pos="3240"/>
         </w:tabs>
-        <w:ind w:start="3240" w:hanging="360"/>
-      </w:pPr>
+        <w:ind w:left="3240" w:hanging="360"/>
+      </w:pPr>
+      <w:rPr/>
     </w:lvl>
     <w:lvl w:ilvl="8">
       <w:start w:val="1"/>
       <w:numFmt w:val="decimal"/>
       <w:lvlText w:val="%9."/>
-      <w:lvlJc w:val="start"/>
+      <w:lvlJc w:val="left"/>
       <w:pPr>
         <w:tabs>
           <w:tab w:val="num" w:pos="3600"/>
         </w:tabs>
-        <w:ind w:start="3600" w:hanging="360"/>
-      </w:pPr>
+        <w:ind w:left="3600" w:hanging="360"/>
+      </w:pPr>
+      <w:rPr/>
     </w:lvl>
   </w:abstractNum>
   <w:abstractNum w:abstractNumId="6">
@@ -1365,12 +1494,12 @@
       <w:start w:val="1"/>
       <w:numFmt w:val="decimal"/>
       <w:lvlText w:val="%1."/>
-      <w:lvlJc w:val="start"/>
+      <w:lvlJc w:val="left"/>
       <w:pPr>
         <w:tabs>
           <w:tab w:val="num" w:pos="1080"/>
         </w:tabs>
-        <w:ind w:start="1080" w:hanging="360"/>
+        <w:ind w:left="1080" w:hanging="360"/>
       </w:pPr>
       <w:rPr/>
     </w:lvl>
@@ -1378,97 +1507,105 @@
       <w:start w:val="1"/>
       <w:numFmt w:val="decimal"/>
       <w:lvlText w:val="%2."/>
-      <w:lvlJc w:val="start"/>
+      <w:lvlJc w:val="left"/>
       <w:pPr>
         <w:tabs>
           <w:tab w:val="num" w:pos="1080"/>
         </w:tabs>
-        <w:ind w:start="1080" w:hanging="360"/>
-      </w:pPr>
+        <w:ind w:left="1080" w:hanging="360"/>
+      </w:pPr>
+      <w:rPr/>
     </w:lvl>
     <w:lvl w:ilvl="2">
       <w:start w:val="1"/>
       <w:numFmt w:val="decimal"/>
       <w:lvlText w:val="%3."/>
-      <w:lvlJc w:val="start"/>
+      <w:lvlJc w:val="left"/>
       <w:pPr>
         <w:tabs>
           <w:tab w:val="num" w:pos="1440"/>
         </w:tabs>
-        <w:ind w:start="1440" w:hanging="360"/>
-      </w:pPr>
+        <w:ind w:left="1440" w:hanging="360"/>
+      </w:pPr>
+      <w:rPr/>
     </w:lvl>
     <w:lvl w:ilvl="3">
       <w:start w:val="1"/>
       <w:numFmt w:val="decimal"/>
       <w:lvlText w:val="%4."/>
-      <w:lvlJc w:val="start"/>
+      <w:lvlJc w:val="left"/>
       <w:pPr>
         <w:tabs>
           <w:tab w:val="num" w:pos="1800"/>
         </w:tabs>
-        <w:ind w:start="1800" w:hanging="360"/>
-      </w:pPr>
+        <w:ind w:left="1800" w:hanging="360"/>
+      </w:pPr>
+      <w:rPr/>
     </w:lvl>
     <w:lvl w:ilvl="4">
       <w:start w:val="1"/>
       <w:numFmt w:val="decimal"/>
       <w:lvlText w:val="%5."/>
-      <w:lvlJc w:val="start"/>
+      <w:lvlJc w:val="left"/>
       <w:pPr>
         <w:tabs>
           <w:tab w:val="num" w:pos="2160"/>
         </w:tabs>
-        <w:ind w:start="2160" w:hanging="360"/>
-      </w:pPr>
+        <w:ind w:left="2160" w:hanging="360"/>
+      </w:pPr>
+      <w:rPr/>
     </w:lvl>
     <w:lvl w:ilvl="5">
       <w:start w:val="1"/>
       <w:numFmt w:val="decimal"/>
       <w:lvlText w:val="%6."/>
-      <w:lvlJc w:val="start"/>
+      <w:lvlJc w:val="left"/>
       <w:pPr>
         <w:tabs>
           <w:tab w:val="num" w:pos="2520"/>
         </w:tabs>
-        <w:ind w:start="2520" w:hanging="360"/>
-      </w:pPr>
+        <w:ind w:left="2520" w:hanging="360"/>
+      </w:pPr>
+      <w:rPr/>
     </w:lvl>
     <w:lvl w:ilvl="6">
       <w:start w:val="1"/>
       <w:numFmt w:val="decimal"/>
       <w:lvlText w:val="%7."/>
-      <w:lvlJc w:val="start"/>
+      <w:lvlJc w:val="left"/>
       <w:pPr>
         <w:tabs>
           <w:tab w:val="num" w:pos="2880"/>
         </w:tabs>
-        <w:ind w:start="2880" w:hanging="360"/>
-      </w:pPr>
+        <w:ind w:left="2880" w:hanging="360"/>
+      </w:pPr>
+      <w:rPr/>
     </w:lvl>
     <w:lvl w:ilvl="7">
       <w:start w:val="1"/>
       <w:numFmt w:val="decimal"/>
       <w:lvlText w:val="%8."/>
-      <w:lvlJc w:val="start"/>
+      <w:lvlJc w:val="left"/>
       <w:pPr>
         <w:tabs>
           <w:tab w:val="num" w:pos="3240"/>
         </w:tabs>
-        <w:ind w:start="3240" w:hanging="360"/>
-      </w:pPr>
+        <w:ind w:left="3240" w:hanging="360"/>
+      </w:pPr>
+      <w:rPr/>
     </w:lvl>
     <w:lvl w:ilvl="8">
       <w:start w:val="1"/>
       <w:numFmt w:val="decimal"/>
       <w:lvlText w:val="%9."/>
-      <w:lvlJc w:val="start"/>
+      <w:lvlJc w:val="left"/>
       <w:pPr>
         <w:tabs>
           <w:tab w:val="num" w:pos="3600"/>
         </w:tabs>
-        <w:ind w:start="3600" w:hanging="360"/>
-      </w:pPr>
+        <w:ind w:left="3600" w:hanging="360"/>
+      </w:pPr>
+      <w:rPr/>
     </w:lvl>
   </w:abstractNum>
   <w:abstractNum w:abstractNumId="7">
@@ -1477,12 +1614,12 @@
       <w:numFmt w:val="none"/>
       <w:suff w:val="nothing"/>
       <w:lvlText w:val=""/>
-      <w:lvlJc w:val="start"/>
+      <w:lvlJc w:val="left"/>
       <w:pPr>
         <w:tabs>
           <w:tab w:val="num" w:pos="0"/>
         </w:tabs>
-        <w:ind w:start="0" w:hanging="0"/>
+        <w:ind w:left="0" w:hanging="0"/>
       </w:pPr>
     </w:lvl>
     <w:lvl w:ilvl="1">
@@ -1490,12 +1627,12 @@
       <w:numFmt w:val="none"/>
       <w:suff w:val="nothing"/>
       <w:lvlText w:val=""/>
-      <w:lvlJc w:val="start"/>
+      <w:lvlJc w:val="left"/>
       <w:pPr>
         <w:tabs>
           <w:tab w:val="num" w:pos="0"/>
         </w:tabs>
-        <w:ind w:start="0" w:hanging="0"/>
+        <w:ind w:left="0" w:hanging="0"/>
       </w:pPr>
     </w:lvl>
     <w:lvl w:ilvl="2">
@@ -1503,12 +1640,12 @@
       <w:numFmt w:val="none"/>
       <w:suff w:val="nothing"/>
       <w:lvlText w:val=""/>
-      <w:lvlJc w:val="start"/>
+      <w:lvlJc w:val="left"/>
       <w:pPr>
         <w:tabs>
           <w:tab w:val="num" w:pos="0"/>
         </w:tabs>
-        <w:ind w:start="0" w:hanging="0"/>
+        <w:ind w:left="0" w:hanging="0"/>
       </w:pPr>
     </w:lvl>
     <w:lvl w:ilvl="3">
@@ -1516,12 +1653,12 @@
       <w:numFmt w:val="none"/>
       <w:suff w:val="nothing"/>
       <w:lvlText w:val=""/>
-      <w:lvlJc w:val="start"/>
+      <w:lvlJc w:val="left"/>
       <w:pPr>
         <w:tabs>
           <w:tab w:val="num" w:pos="0"/>
         </w:tabs>
-        <w:ind w:start="0" w:hanging="0"/>
+        <w:ind w:left="0" w:hanging="0"/>
       </w:pPr>
     </w:lvl>
     <w:lvl w:ilvl="4">
@@ -1529,12 +1666,12 @@
       <w:numFmt w:val="none"/>
       <w:suff w:val="nothing"/>
       <w:lvlText w:val=""/>
-      <w:lvlJc w:val="start"/>
+      <w:lvlJc w:val="left"/>
       <w:pPr>
         <w:tabs>
           <w:tab w:val="num" w:pos="0"/>
         </w:tabs>
-        <w:ind w:start="0" w:hanging="0"/>
+        <w:ind w:left="0" w:hanging="0"/>
       </w:pPr>
     </w:lvl>
     <w:lvl w:ilvl="5">
@@ -1542,12 +1679,12 @@
       <w:numFmt w:val="none"/>
       <w:suff w:val="nothing"/>
       <w:lvlText w:val=""/>
-      <w:lvlJc w:val="start"/>
+      <w:lvlJc w:val="left"/>
       <w:pPr>
         <w:tabs>
           <w:tab w:val="num" w:pos="0"/>
         </w:tabs>
-        <w:ind w:start="0" w:hanging="0"/>
+        <w:ind w:left="0" w:hanging="0"/>
       </w:pPr>
     </w:lvl>
     <w:lvl w:ilvl="6">
@@ -1555,12 +1692,12 @@
       <w:numFmt w:val="none"/>
       <w:suff w:val="nothing"/>
       <w:lvlText w:val=""/>
-      <w:lvlJc w:val="start"/>
+      <w:lvlJc w:val="left"/>
       <w:pPr>
         <w:tabs>
           <w:tab w:val="num" w:pos="0"/>
         </w:tabs>
-        <w:ind w:start="0" w:hanging="0"/>
+        <w:ind w:left="0" w:hanging="0"/>
       </w:pPr>
     </w:lvl>
     <w:lvl w:ilvl="7">
@@ -1568,12 +1705,12 @@
       <w:numFmt w:val="none"/>
       <w:suff w:val="nothing"/>
       <w:lvlText w:val=""/>
-      <w:lvlJc w:val="start"/>
+      <w:lvlJc w:val="left"/>
       <w:pPr>
         <w:tabs>
           <w:tab w:val="num" w:pos="0"/>
         </w:tabs>
-        <w:ind w:start="0" w:hanging="0"/>
+        <w:ind w:left="0" w:hanging="0"/>
       </w:pPr>
     </w:lvl>
     <w:lvl w:ilvl="8">
@@ -1581,12 +1718,12 @@
       <w:numFmt w:val="none"/>
       <w:suff w:val="nothing"/>
       <w:lvlText w:val=""/>
-      <w:lvlJc w:val="start"/>
+      <w:lvlJc w:val="left"/>
       <w:pPr>
         <w:tabs>
           <w:tab w:val="num" w:pos="0"/>
         </w:tabs>
-        <w:ind w:start="0" w:hanging="0"/>
+        <w:ind w:left="0" w:hanging="0"/>
       </w:pPr>
     </w:lvl>
   </w:abstractNum>
@@ -1619,7 +1756,7 @@
   <w:docDefaults>
     <w:rPrDefault>
       <w:rPr>
-        <w:rFonts w:ascii="Cambria" w:hAnsi="Cambria" w:eastAsia="ＭＳ 明朝" w:cs="" w:asciiTheme="minorHAnsi" w:cstheme="minorBidi" w:eastAsiaTheme="minorEastAsia" w:hAnsiTheme="minorHAnsi"/>
+        <w:rFonts w:ascii="Cambria" w:hAnsi="Cambria" w:eastAsia="" w:cs="" w:asciiTheme="minorHAnsi" w:cstheme="minorBidi" w:eastAsiaTheme="minorEastAsia" w:hAnsiTheme="minorHAnsi"/>
         <w:sz w:val="22"/>
         <w:szCs w:val="22"/>
         <w:lang w:val="en-US" w:eastAsia="en-US" w:bidi="ar-SA"/>
@@ -1776,9 +1913,10 @@
     <w:rsid w:val="00fc693f"/>
     <w:pPr>
       <w:widowControl/>
+      <w:suppressAutoHyphens w:val="true"/>
       <w:bidi w:val="0"/>
       <w:spacing w:lineRule="auto" w:line="240" w:before="0" w:after="0"/>
-      <w:jc w:val="start"/>
+      <w:jc w:val="left"/>
     </w:pPr>
     <w:rPr>
       <w:rFonts w:ascii="Calibri" w:hAnsi="Calibri" w:eastAsia="ＭＳ 明朝" w:cs=""/>
@@ -1790,7 +1928,7 @@
     </w:rPr>
   </w:style>
   <w:style w:type="paragraph" w:styleId="Heading1">
-    <w:name w:val="heading 1"/>
+    <w:name w:val="Heading 1"/>
     <w:basedOn w:val="Normal"/>
     <w:next w:val="Normal"/>
     <w:link w:val="Heading1Char"/>
@@ -1804,7 +1942,7 @@
       <w:outlineLvl w:val="0"/>
     </w:pPr>
     <w:rPr>
-      <w:rFonts w:ascii="Calibri" w:hAnsi="Calibri" w:eastAsia="ＭＳ ゴシック" w:cs="" w:asciiTheme="majorHAnsi" w:cstheme="majorBidi" w:eastAsiaTheme="majorEastAsia" w:hAnsiTheme="majorHAnsi"/>
+      <w:rFonts w:ascii="Calibri" w:hAnsi="Calibri" w:eastAsia="" w:cs="" w:asciiTheme="majorHAnsi" w:cstheme="majorBidi" w:eastAsiaTheme="majorEastAsia" w:hAnsiTheme="majorHAnsi"/>
       <w:b/>
       <w:bCs/>
       <w:color w:themeColor="accent1" w:themeShade="bf" w:val="365F91"/>
@@ -1813,7 +1951,7 @@
     </w:rPr>
   </w:style>
   <w:style w:type="paragraph" w:styleId="Heading2">
-    <w:name w:val="heading 2"/>
+    <w:name w:val="Heading 2"/>
     <w:basedOn w:val="Normal"/>
     <w:next w:val="Normal"/>
     <w:link w:val="Heading2Char"/>
@@ -1828,7 +1966,7 @@
       <w:outlineLvl w:val="1"/>
     </w:pPr>
     <w:rPr>
-      <w:rFonts w:ascii="Calibri" w:hAnsi="Calibri" w:eastAsia="ＭＳ ゴシック" w:cs="" w:asciiTheme="majorHAnsi" w:cstheme="majorBidi" w:eastAsiaTheme="majorEastAsia" w:hAnsiTheme="majorHAnsi"/>
+      <w:rFonts w:ascii="Calibri" w:hAnsi="Calibri" w:eastAsia="" w:cs="" w:asciiTheme="majorHAnsi" w:cstheme="majorBidi" w:eastAsiaTheme="majorEastAsia" w:hAnsiTheme="majorHAnsi"/>
       <w:b/>
       <w:bCs/>
       <w:color w:themeColor="accent1" w:val="4F81BD"/>
@@ -1837,7 +1975,7 @@
     </w:rPr>
   </w:style>
   <w:style w:type="paragraph" w:styleId="Heading3">
-    <w:name w:val="heading 3"/>
+    <w:name w:val="Heading 3"/>
     <w:basedOn w:val="Normal"/>
     <w:next w:val="Normal"/>
     <w:link w:val="Heading3Char"/>
@@ -1852,14 +1990,14 @@
       <w:outlineLvl w:val="2"/>
     </w:pPr>
     <w:rPr>
-      <w:rFonts w:ascii="Calibri" w:hAnsi="Calibri" w:eastAsia="ＭＳ ゴシック" w:cs="" w:asciiTheme="majorHAnsi" w:cstheme="majorBidi" w:eastAsiaTheme="majorEastAsia" w:hAnsiTheme="majorHAnsi"/>
+      <w:rFonts w:ascii="Calibri" w:hAnsi="Calibri" w:eastAsia="" w:cs="" w:asciiTheme="majorHAnsi" w:cstheme="majorBidi" w:eastAsiaTheme="majorEastAsia" w:hAnsiTheme="majorHAnsi"/>
       <w:b/>
       <w:bCs/>
       <w:color w:themeColor="accent1" w:val="4F81BD"/>
     </w:rPr>
   </w:style>
   <w:style w:type="paragraph" w:styleId="Heading4">
-    <w:name w:val="heading 4"/>
+    <w:name w:val="Heading 4"/>
     <w:basedOn w:val="Normal"/>
     <w:next w:val="Normal"/>
     <w:link w:val="Heading4Char"/>
@@ -1875,7 +2013,7 @@
       <w:outlineLvl w:val="3"/>
     </w:pPr>
     <w:rPr>
-      <w:rFonts w:ascii="Calibri" w:hAnsi="Calibri" w:eastAsia="ＭＳ ゴシック" w:cs="" w:asciiTheme="majorHAnsi" w:cstheme="majorBidi" w:eastAsiaTheme="majorEastAsia" w:hAnsiTheme="majorHAnsi"/>
+      <w:rFonts w:ascii="Calibri" w:hAnsi="Calibri" w:eastAsia="" w:cs="" w:asciiTheme="majorHAnsi" w:cstheme="majorBidi" w:eastAsiaTheme="majorEastAsia" w:hAnsiTheme="majorHAnsi"/>
       <w:b/>
       <w:bCs/>
       <w:i/>
@@ -1884,7 +2022,7 @@
     </w:rPr>
   </w:style>
   <w:style w:type="paragraph" w:styleId="Heading5">
-    <w:name w:val="heading 5"/>
+    <w:name w:val="Heading 5"/>
     <w:basedOn w:val="Normal"/>
     <w:next w:val="Normal"/>
     <w:link w:val="Heading5Char"/>
@@ -1900,12 +2038,12 @@
       <w:outlineLvl w:val="4"/>
     </w:pPr>
     <w:rPr>
-      <w:rFonts w:ascii="Calibri" w:hAnsi="Calibri" w:eastAsia="ＭＳ ゴシック" w:cs="" w:asciiTheme="majorHAnsi" w:cstheme="majorBidi" w:eastAsiaTheme="majorEastAsia" w:hAnsiTheme="majorHAnsi"/>
+      <w:rFonts w:ascii="Calibri" w:hAnsi="Calibri" w:eastAsia="" w:cs="" w:asciiTheme="majorHAnsi" w:cstheme="majorBidi" w:eastAsiaTheme="majorEastAsia" w:hAnsiTheme="majorHAnsi"/>
       <w:color w:themeColor="accent1" w:themeShade="7f" w:val="243F60"/>
     </w:rPr>
   </w:style>
   <w:style w:type="paragraph" w:styleId="Heading6">
-    <w:name w:val="heading 6"/>
+    <w:name w:val="Heading 6"/>
     <w:basedOn w:val="Normal"/>
     <w:next w:val="Normal"/>
     <w:link w:val="Heading6Char"/>
@@ -1921,14 +2059,14 @@
       <w:outlineLvl w:val="5"/>
     </w:pPr>
     <w:rPr>
-      <w:rFonts w:ascii="Calibri" w:hAnsi="Calibri" w:eastAsia="ＭＳ ゴシック" w:cs="" w:asciiTheme="majorHAnsi" w:cstheme="majorBidi" w:eastAsiaTheme="majorEastAsia" w:hAnsiTheme="majorHAnsi"/>
+      <w:rFonts w:ascii="Calibri" w:hAnsi="Calibri" w:eastAsia="" w:cs="" w:asciiTheme="majorHAnsi" w:cstheme="majorBidi" w:eastAsiaTheme="majorEastAsia" w:hAnsiTheme="majorHAnsi"/>
       <w:i/>
       <w:iCs/>
       <w:color w:themeColor="accent1" w:themeShade="7f" w:val="243F60"/>
     </w:rPr>
   </w:style>
   <w:style w:type="paragraph" w:styleId="Heading7">
-    <w:name w:val="heading 7"/>
+    <w:name w:val="Heading 7"/>
     <w:basedOn w:val="Normal"/>
     <w:next w:val="Normal"/>
     <w:link w:val="Heading7Char"/>
@@ -1944,14 +2082,14 @@
       <w:outlineLvl w:val="6"/>
     </w:pPr>
     <w:rPr>
-      <w:rFonts w:ascii="Calibri" w:hAnsi="Calibri" w:eastAsia="ＭＳ ゴシック" w:cs="" w:asciiTheme="majorHAnsi" w:cstheme="majorBidi" w:eastAsiaTheme="majorEastAsia" w:hAnsiTheme="majorHAnsi"/>
+      <w:rFonts w:ascii="Calibri" w:hAnsi="Calibri" w:eastAsia="" w:cs="" w:asciiTheme="majorHAnsi" w:cstheme="majorBidi" w:eastAsiaTheme="majorEastAsia" w:hAnsiTheme="majorHAnsi"/>
       <w:i/>
       <w:iCs/>
       <w:color w:themeColor="text1" w:themeTint="bf" w:val="404040"/>
     </w:rPr>
   </w:style>
   <w:style w:type="paragraph" w:styleId="Heading8">
-    <w:name w:val="heading 8"/>
+    <w:name w:val="Heading 8"/>
     <w:basedOn w:val="Normal"/>
     <w:next w:val="Normal"/>
     <w:link w:val="Heading8Char"/>
@@ -1967,14 +2105,14 @@
       <w:outlineLvl w:val="7"/>
     </w:pPr>
     <w:rPr>
-      <w:rFonts w:ascii="Calibri" w:hAnsi="Calibri" w:eastAsia="ＭＳ ゴシック" w:cs="" w:asciiTheme="majorHAnsi" w:cstheme="majorBidi" w:eastAsiaTheme="majorEastAsia" w:hAnsiTheme="majorHAnsi"/>
+      <w:rFonts w:ascii="Calibri" w:hAnsi="Calibri" w:eastAsia="" w:cs="" w:asciiTheme="majorHAnsi" w:cstheme="majorBidi" w:eastAsiaTheme="majorEastAsia" w:hAnsiTheme="majorHAnsi"/>
       <w:color w:themeColor="accent1" w:val="4F81BD"/>
       <w:sz w:val="20"/>
       <w:szCs w:val="20"/>
     </w:rPr>
   </w:style>
   <w:style w:type="paragraph" w:styleId="Heading9">
-    <w:name w:val="heading 9"/>
+    <w:name w:val="Heading 9"/>
     <w:basedOn w:val="Normal"/>
     <w:next w:val="Normal"/>
     <w:link w:val="Heading9Char"/>
@@ -1990,7 +2128,7 @@
       <w:outlineLvl w:val="8"/>
     </w:pPr>
     <w:rPr>
-      <w:rFonts w:ascii="Calibri" w:hAnsi="Calibri" w:eastAsia="ＭＳ ゴシック" w:cs="" w:asciiTheme="majorHAnsi" w:cstheme="majorBidi" w:eastAsiaTheme="majorEastAsia" w:hAnsiTheme="majorHAnsi"/>
+      <w:rFonts w:ascii="Calibri" w:hAnsi="Calibri" w:eastAsia="" w:cs="" w:asciiTheme="majorHAnsi" w:cstheme="majorBidi" w:eastAsiaTheme="majorEastAsia" w:hAnsiTheme="majorHAnsi"/>
       <w:i/>
       <w:iCs/>
       <w:color w:themeColor="text1" w:themeTint="bf" w:val="404040"/>
@@ -2032,7 +2170,7 @@
     <w:qFormat/>
     <w:rsid w:val="00fc693f"/>
     <w:rPr>
-      <w:rFonts w:ascii="Calibri" w:hAnsi="Calibri" w:eastAsia="ＭＳ ゴシック" w:cs="" w:asciiTheme="majorHAnsi" w:cstheme="majorBidi" w:eastAsiaTheme="majorEastAsia" w:hAnsiTheme="majorHAnsi"/>
+      <w:rFonts w:ascii="Calibri" w:hAnsi="Calibri" w:eastAsia="" w:cs="" w:asciiTheme="majorHAnsi" w:cstheme="majorBidi" w:eastAsiaTheme="majorEastAsia" w:hAnsiTheme="majorHAnsi"/>
       <w:b/>
       <w:bCs/>
       <w:color w:themeColor="accent1" w:themeShade="bf" w:val="365F91"/>
@@ -2048,7 +2186,7 @@
     <w:qFormat/>
     <w:rsid w:val="00fc693f"/>
     <w:rPr>
-      <w:rFonts w:ascii="Calibri" w:hAnsi="Calibri" w:eastAsia="ＭＳ ゴシック" w:cs="" w:asciiTheme="majorHAnsi" w:cstheme="majorBidi" w:eastAsiaTheme="majorEastAsia" w:hAnsiTheme="majorHAnsi"/>
+      <w:rFonts w:ascii="Calibri" w:hAnsi="Calibri" w:eastAsia="" w:cs="" w:asciiTheme="majorHAnsi" w:cstheme="majorBidi" w:eastAsiaTheme="majorEastAsia" w:hAnsiTheme="majorHAnsi"/>
       <w:b/>
       <w:bCs/>
       <w:color w:themeColor="accent1" w:val="4F81BD"/>
@@ -2064,7 +2202,7 @@
     <w:qFormat/>
     <w:rsid w:val="00fc693f"/>
     <w:rPr>
-      <w:rFonts w:ascii="Calibri" w:hAnsi="Calibri" w:eastAsia="ＭＳ ゴシック" w:cs="" w:asciiTheme="majorHAnsi" w:cstheme="majorBidi" w:eastAsiaTheme="majorEastAsia" w:hAnsiTheme="majorHAnsi"/>
+      <w:rFonts w:ascii="Calibri" w:hAnsi="Calibri" w:eastAsia="" w:cs="" w:asciiTheme="majorHAnsi" w:cstheme="majorBidi" w:eastAsiaTheme="majorEastAsia" w:hAnsiTheme="majorHAnsi"/>
       <w:b/>
       <w:bCs/>
       <w:color w:themeColor="accent1" w:val="4F81BD"/>
@@ -2078,7 +2216,7 @@
     <w:qFormat/>
     <w:rsid w:val="00fc693f"/>
     <w:rPr>
-      <w:rFonts w:ascii="Calibri" w:hAnsi="Calibri" w:eastAsia="ＭＳ ゴシック" w:cs="" w:asciiTheme="majorHAnsi" w:cstheme="majorBidi" w:eastAsiaTheme="majorEastAsia" w:hAnsiTheme="majorHAnsi"/>
+      <w:rFonts w:ascii="Calibri" w:hAnsi="Calibri" w:eastAsia="" w:cs="" w:asciiTheme="majorHAnsi" w:cstheme="majorBidi" w:eastAsiaTheme="majorEastAsia" w:hAnsiTheme="majorHAnsi"/>
       <w:color w:themeColor="text2" w:themeShade="bf" w:val="17365D"/>
       <w:spacing w:val="5"/>
       <w:kern w:val="2"/>
@@ -2094,7 +2232,7 @@
     <w:qFormat/>
     <w:rsid w:val="00fc693f"/>
     <w:rPr>
-      <w:rFonts w:ascii="Calibri" w:hAnsi="Calibri" w:eastAsia="ＭＳ ゴシック" w:cs="" w:asciiTheme="majorHAnsi" w:cstheme="majorBidi" w:eastAsiaTheme="majorEastAsia" w:hAnsiTheme="majorHAnsi"/>
+      <w:rFonts w:ascii="Calibri" w:hAnsi="Calibri" w:eastAsia="" w:cs="" w:asciiTheme="majorHAnsi" w:cstheme="majorBidi" w:eastAsiaTheme="majorEastAsia" w:hAnsiTheme="majorHAnsi"/>
       <w:i/>
       <w:iCs/>
       <w:color w:themeColor="accent1" w:val="4F81BD"/>
@@ -2135,7 +2273,7 @@
   <w:style w:type="character" w:styleId="MacroTextChar" w:customStyle="1">
     <w:name w:val="Macro Text Char"/>
     <w:basedOn w:val="DefaultParagraphFont"/>
-    <w:link w:val="MacroText"/>
+    <w:link w:val="macro"/>
     <w:uiPriority w:val="99"/>
     <w:qFormat/>
     <w:rsid w:val="0029639d"/>
@@ -2167,7 +2305,7 @@
     <w:qFormat/>
     <w:rsid w:val="00fc693f"/>
     <w:rPr>
-      <w:rFonts w:ascii="Calibri" w:hAnsi="Calibri" w:eastAsia="ＭＳ ゴシック" w:cs="" w:asciiTheme="majorHAnsi" w:cstheme="majorBidi" w:eastAsiaTheme="majorEastAsia" w:hAnsiTheme="majorHAnsi"/>
+      <w:rFonts w:ascii="Calibri" w:hAnsi="Calibri" w:eastAsia="" w:cs="" w:asciiTheme="majorHAnsi" w:cstheme="majorBidi" w:eastAsiaTheme="majorEastAsia" w:hAnsiTheme="majorHAnsi"/>
       <w:b/>
       <w:bCs/>
       <w:i/>
@@ -2184,7 +2322,7 @@
     <w:qFormat/>
     <w:rsid w:val="00fc693f"/>
     <w:rPr>
-      <w:rFonts w:ascii="Calibri" w:hAnsi="Calibri" w:eastAsia="ＭＳ ゴシック" w:cs="" w:asciiTheme="majorHAnsi" w:cstheme="majorBidi" w:eastAsiaTheme="majorEastAsia" w:hAnsiTheme="majorHAnsi"/>
+      <w:rFonts w:ascii="Calibri" w:hAnsi="Calibri" w:eastAsia="" w:cs="" w:asciiTheme="majorHAnsi" w:cstheme="majorBidi" w:eastAsiaTheme="majorEastAsia" w:hAnsiTheme="majorHAnsi"/>
       <w:color w:themeColor="accent1" w:themeShade="7f" w:val="243F60"/>
     </w:rPr>
   </w:style>
@@ -2197,7 +2335,7 @@
     <w:qFormat/>
     <w:rsid w:val="00fc693f"/>
     <w:rPr>
-      <w:rFonts w:ascii="Calibri" w:hAnsi="Calibri" w:eastAsia="ＭＳ ゴシック" w:cs="" w:asciiTheme="majorHAnsi" w:cstheme="majorBidi" w:eastAsiaTheme="majorEastAsia" w:hAnsiTheme="majorHAnsi"/>
+      <w:rFonts w:ascii="Calibri" w:hAnsi="Calibri" w:eastAsia="" w:cs="" w:asciiTheme="majorHAnsi" w:cstheme="majorBidi" w:eastAsiaTheme="majorEastAsia" w:hAnsiTheme="majorHAnsi"/>
       <w:i/>
       <w:iCs/>
       <w:color w:themeColor="accent1" w:themeShade="7f" w:val="243F60"/>
@@ -2212,7 +2350,7 @@
     <w:qFormat/>
     <w:rsid w:val="00fc693f"/>
     <w:rPr>
-      <w:rFonts w:ascii="Calibri" w:hAnsi="Calibri" w:eastAsia="ＭＳ ゴシック" w:cs="" w:asciiTheme="majorHAnsi" w:cstheme="majorBidi" w:eastAsiaTheme="majorEastAsia" w:hAnsiTheme="majorHAnsi"/>
+      <w:rFonts w:ascii="Calibri" w:hAnsi="Calibri" w:eastAsia="" w:cs="" w:asciiTheme="majorHAnsi" w:cstheme="majorBidi" w:eastAsiaTheme="majorEastAsia" w:hAnsiTheme="majorHAnsi"/>
       <w:i/>
       <w:iCs/>
       <w:color w:themeColor="text1" w:themeTint="bf" w:val="404040"/>
@@ -2227,7 +2365,7 @@
     <w:qFormat/>
     <w:rsid w:val="00fc693f"/>
     <w:rPr>
-      <w:rFonts w:ascii="Calibri" w:hAnsi="Calibri" w:eastAsia="ＭＳ ゴシック" w:cs="" w:asciiTheme="majorHAnsi" w:cstheme="majorBidi" w:eastAsiaTheme="majorEastAsia" w:hAnsiTheme="majorHAnsi"/>
+      <w:rFonts w:ascii="Calibri" w:hAnsi="Calibri" w:eastAsia="" w:cs="" w:asciiTheme="majorHAnsi" w:cstheme="majorBidi" w:eastAsiaTheme="majorEastAsia" w:hAnsiTheme="majorHAnsi"/>
       <w:color w:themeColor="accent1" w:val="4F81BD"/>
       <w:sz w:val="20"/>
       <w:szCs w:val="20"/>
@@ -2242,7 +2380,7 @@
     <w:qFormat/>
     <w:rsid w:val="00fc693f"/>
     <w:rPr>
-      <w:rFonts w:ascii="Calibri" w:hAnsi="Calibri" w:eastAsia="ＭＳ ゴシック" w:cs="" w:asciiTheme="majorHAnsi" w:cstheme="majorBidi" w:eastAsiaTheme="majorEastAsia" w:hAnsiTheme="majorHAnsi"/>
+      <w:rFonts w:ascii="Calibri" w:hAnsi="Calibri" w:eastAsia="" w:cs="" w:asciiTheme="majorHAnsi" w:cstheme="majorBidi" w:eastAsiaTheme="majorEastAsia" w:hAnsiTheme="majorHAnsi"/>
       <w:i/>
       <w:iCs/>
       <w:color w:themeColor="text1" w:themeTint="bf" w:val="404040"/>
@@ -2388,13 +2526,13 @@
     <w:rsid w:val="00aa1d8d"/>
     <w:pPr>
       <w:spacing w:before="0" w:after="0"/>
-      <w:ind w:hanging="360" w:start="360"/>
+      <w:ind w:hanging="360" w:left="360"/>
       <w:contextualSpacing/>
     </w:pPr>
     <w:rPr/>
   </w:style>
   <w:style w:type="paragraph" w:styleId="Caption">
-    <w:name w:val="caption"/>
+    <w:name w:val="Caption"/>
     <w:basedOn w:val="Normal"/>
     <w:next w:val="Normal"/>
     <w:uiPriority w:val="35"/>
@@ -2432,7 +2570,7 @@
     <w:rPr/>
   </w:style>
   <w:style w:type="paragraph" w:styleId="Header">
-    <w:name w:val="header"/>
+    <w:name w:val="Header"/>
     <w:basedOn w:val="Normal"/>
     <w:link w:val="HeaderChar"/>
     <w:uiPriority w:val="99"/>
@@ -2449,7 +2587,7 @@
     <w:rPr/>
   </w:style>
   <w:style w:type="paragraph" w:styleId="Footer">
-    <w:name w:val="footer"/>
+    <w:name w:val="Footer"/>
     <w:basedOn w:val="Normal"/>
     <w:link w:val="FooterChar"/>
     <w:uiPriority w:val="99"/>
@@ -2472,12 +2610,13 @@
     <w:rsid w:val="00fc693f"/>
     <w:pPr>
       <w:widowControl/>
+      <w:suppressAutoHyphens w:val="true"/>
       <w:bidi w:val="0"/>
       <w:spacing w:lineRule="auto" w:line="240" w:before="0" w:after="0"/>
-      <w:jc w:val="start"/>
+      <w:jc w:val="left"/>
     </w:pPr>
     <w:rPr>
-      <w:rFonts w:ascii="Cambria" w:hAnsi="Cambria" w:eastAsia="ＭＳ 明朝" w:cs="" w:asciiTheme="minorHAnsi" w:cstheme="minorBidi" w:eastAsiaTheme="minorEastAsia" w:hAnsiTheme="minorHAnsi"/>
+      <w:rFonts w:ascii="Cambria" w:hAnsi="Cambria" w:eastAsia="" w:cs="" w:asciiTheme="minorHAnsi" w:cstheme="minorBidi" w:eastAsiaTheme="minorEastAsia" w:hAnsiTheme="minorHAnsi"/>
       <w:color w:val="auto"/>
       <w:kern w:val="0"/>
       <w:sz w:val="22"/>
@@ -2501,7 +2640,7 @@
       <w:contextualSpacing/>
     </w:pPr>
     <w:rPr>
-      <w:rFonts w:ascii="Calibri" w:hAnsi="Calibri" w:eastAsia="ＭＳ ゴシック" w:cs="" w:asciiTheme="majorHAnsi" w:cstheme="majorBidi" w:eastAsiaTheme="majorEastAsia" w:hAnsiTheme="majorHAnsi"/>
+      <w:rFonts w:ascii="Calibri" w:hAnsi="Calibri" w:eastAsia="" w:cs="" w:asciiTheme="majorHAnsi" w:cstheme="majorBidi" w:eastAsiaTheme="majorEastAsia" w:hAnsiTheme="majorHAnsi"/>
       <w:color w:themeColor="text2" w:themeShade="bf" w:val="17365D"/>
       <w:spacing w:val="5"/>
       <w:kern w:val="2"/>
@@ -2519,7 +2658,7 @@
     <w:rsid w:val="00fc693f"/>
     <w:pPr/>
     <w:rPr>
-      <w:rFonts w:ascii="Calibri" w:hAnsi="Calibri" w:eastAsia="ＭＳ ゴシック" w:cs="" w:asciiTheme="majorHAnsi" w:cstheme="majorBidi" w:eastAsiaTheme="majorEastAsia" w:hAnsiTheme="majorHAnsi"/>
+      <w:rFonts w:ascii="Calibri" w:hAnsi="Calibri" w:eastAsia="" w:cs="" w:asciiTheme="majorHAnsi" w:cstheme="majorBidi" w:eastAsiaTheme="majorEastAsia" w:hAnsiTheme="majorHAnsi"/>
       <w:i/>
       <w:iCs/>
       <w:color w:themeColor="accent1" w:val="4F81BD"/>
@@ -2536,7 +2675,7 @@
     <w:rsid w:val="00fc693f"/>
     <w:pPr>
       <w:spacing w:before="0" w:after="0"/>
-      <w:ind w:start="720"/>
+      <w:ind w:left="720"/>
       <w:contextualSpacing/>
     </w:pPr>
     <w:rPr/>
@@ -2579,7 +2718,7 @@
     <w:rsid w:val="00326f90"/>
     <w:pPr>
       <w:spacing w:before="0" w:after="0"/>
-      <w:ind w:hanging="360" w:start="720"/>
+      <w:ind w:hanging="360" w:left="720"/>
       <w:contextualSpacing/>
     </w:pPr>
     <w:rPr/>
@@ -2593,7 +2732,7 @@
     <w:rsid w:val="00326f90"/>
     <w:pPr>
       <w:spacing w:before="0" w:after="0"/>
-      <w:ind w:hanging="360" w:start="1080"/>
+      <w:ind w:hanging="360" w:left="1080"/>
       <w:contextualSpacing/>
     </w:pPr>
     <w:rPr/>
@@ -2702,7 +2841,7 @@
     <w:rsid w:val="0029639d"/>
     <w:pPr>
       <w:spacing w:before="0" w:after="120"/>
-      <w:ind w:start="360"/>
+      <w:ind w:left="360"/>
       <w:contextualSpacing/>
     </w:pPr>
     <w:rPr/>
@@ -2715,7 +2854,7 @@
     <w:rsid w:val="0029639d"/>
     <w:pPr>
       <w:spacing w:before="0" w:after="120"/>
-      <w:ind w:start="720"/>
+      <w:ind w:left="720"/>
       <w:contextualSpacing/>
     </w:pPr>
     <w:rPr/>
@@ -2728,12 +2867,12 @@
     <w:rsid w:val="0029639d"/>
     <w:pPr>
       <w:spacing w:before="0" w:after="120"/>
-      <w:ind w:start="1080"/>
+      <w:ind w:left="1080"/>
       <w:contextualSpacing/>
     </w:pPr>
     <w:rPr/>
   </w:style>
-  <w:style w:type="paragraph" w:styleId="MacroText">
+  <w:style w:type="paragraph" w:styleId="macro">
     <w:name w:val="macro"/>
     <w:link w:val="MacroTextChar"/>
     <w:uiPriority w:val="99"/>
@@ -2752,12 +2891,13 @@
         <w:tab w:val="left" w:pos="3456" w:leader="none"/>
         <w:tab w:val="left" w:pos="4032" w:leader="none"/>
       </w:tabs>
+      <w:suppressAutoHyphens w:val="true"/>
       <w:bidi w:val="0"/>
       <w:spacing w:lineRule="auto" w:line="276" w:before="0" w:after="200"/>
-      <w:jc w:val="start"/>
+      <w:jc w:val="left"/>
     </w:pPr>
     <w:rPr>
-      <w:rFonts w:ascii="Courier" w:hAnsi="Courier" w:eastAsia="ＭＳ 明朝" w:cs="" w:cstheme="minorBidi" w:eastAsiaTheme="minorEastAsia"/>
+      <w:rFonts w:ascii="Courier" w:hAnsi="Courier" w:eastAsia="" w:cs="" w:cstheme="minorBidi" w:eastAsiaTheme="minorEastAsia"/>
       <w:color w:val="auto"/>
       <w:kern w:val="0"/>
       <w:sz w:val="20"/>
@@ -2774,7 +2914,7 @@
     <w:qFormat/>
     <w:rsid w:val="00fc693f"/>
     <w:pPr>
-      <w:spacing w:after="80"/>
+      <w:spacing w:before="0" w:after="80"/>
       <w:ind w:left="360"/>
     </w:pPr>
     <w:rPr>
@@ -2796,7 +2936,7 @@
         <w:bottom w:val="single" w:sz="4" w:space="4" w:color="4F81BD" w:themeColor="accent1"/>
       </w:pBdr>
       <w:spacing w:before="200" w:after="280"/>
-      <w:ind w:start="936" w:end="936"/>
+      <w:ind w:left="936" w:right="936"/>
     </w:pPr>
     <w:rPr>
       <w:b/>
@@ -2807,7 +2947,7 @@
     </w:rPr>
   </w:style>
   <w:style w:type="paragraph" w:styleId="IndexHeading">
-    <w:name w:val="index heading"/>
+    <w:name w:val="Index Heading"/>
     <w:basedOn w:val="Heading"/>
     <w:pPr/>
     <w:rPr/>
@@ -2825,6 +2965,29 @@
       <w:outlineLvl w:val="9"/>
     </w:pPr>
     <w:rPr/>
+  </w:style>
+  <w:style w:type="paragraph" w:styleId="TableContents">
+    <w:name w:val="Table Contents"/>
+    <w:basedOn w:val="Normal"/>
+    <w:qFormat/>
+    <w:pPr>
+      <w:widowControl w:val="false"/>
+      <w:suppressLineNumbers/>
+    </w:pPr>
+    <w:rPr/>
+  </w:style>
+  <w:style w:type="paragraph" w:styleId="TableHeading">
+    <w:name w:val="Table Heading"/>
+    <w:basedOn w:val="TableContents"/>
+    <w:qFormat/>
+    <w:pPr>
+      <w:suppressLineNumbers/>
+      <w:jc w:val="center"/>
+    </w:pPr>
+    <w:rPr>
+      <w:b/>
+      <w:bCs/>
+    </w:rPr>
   </w:style>
   <w:style w:type="numbering" w:styleId="NoList" w:default="1">
     <w:name w:val="No List"/>
@@ -2881,7 +3044,7 @@
       <w:spacing w:after="0" w:line="240" w:lineRule="auto"/>
     </w:pPr>
     <w:rPr>
-      <w:color w:val="000000" w:themeColor="text1" w:themeShade="bf"/>
+      <w:color w:themeColor="text1" w:themeShade="bf"/>
     </w:rPr>
     <w:tblPr>
       <w:tblStyleRowBandSize w:val="1"/>
@@ -2985,7 +3148,7 @@
       <w:spacing w:after="0" w:line="240" w:lineRule="auto"/>
     </w:pPr>
     <w:rPr>
-      <w:color w:val="365f91" w:themeColor="accent1" w:themeShade="bf"/>
+      <w:color w:themeColor="accent1" w:themeShade="bf"/>
     </w:rPr>
     <w:tblPr>
       <w:tblStyleRowBandSize w:val="1"/>
@@ -3089,7 +3252,7 @@
       <w:spacing w:after="0" w:line="240" w:lineRule="auto"/>
     </w:pPr>
     <w:rPr>
-      <w:color w:val="943634" w:themeColor="accent2" w:themeShade="bf"/>
+      <w:color w:themeColor="accent2" w:themeShade="bf"/>
     </w:rPr>
     <w:tblPr>
       <w:tblStyleRowBandSize w:val="1"/>
@@ -3193,7 +3356,7 @@
       <w:spacing w:after="0" w:line="240" w:lineRule="auto"/>
     </w:pPr>
     <w:rPr>
-      <w:color w:val="76923c" w:themeColor="accent3" w:themeShade="bf"/>
+      <w:color w:themeColor="accent3" w:themeShade="bf"/>
     </w:rPr>
     <w:tblPr>
       <w:tblStyleRowBandSize w:val="1"/>
@@ -3297,7 +3460,7 @@
       <w:spacing w:after="0" w:line="240" w:lineRule="auto"/>
     </w:pPr>
     <w:rPr>
-      <w:color w:val="5f497a" w:themeColor="accent4" w:themeShade="bf"/>
+      <w:color w:themeColor="accent4" w:themeShade="bf"/>
     </w:rPr>
     <w:tblPr>
       <w:tblStyleRowBandSize w:val="1"/>
@@ -3401,7 +3564,7 @@
       <w:spacing w:after="0" w:line="240" w:lineRule="auto"/>
     </w:pPr>
     <w:rPr>
-      <w:color w:val="31849b" w:themeColor="accent5" w:themeShade="bf"/>
+      <w:color w:themeColor="accent5" w:themeShade="bf"/>
     </w:rPr>
     <w:tblPr>
       <w:tblStyleRowBandSize w:val="1"/>
@@ -3505,7 +3668,7 @@
       <w:spacing w:after="0" w:line="240" w:lineRule="auto"/>
     </w:pPr>
     <w:rPr>
-      <w:color w:val="e36c0a" w:themeColor="accent6" w:themeShade="bf"/>
+      <w:color w:themeColor="accent6" w:themeShade="bf"/>
     </w:rPr>
     <w:tblPr>
       <w:tblStyleRowBandSize w:val="1"/>
@@ -3631,7 +3794,7 @@
       <w:rPr>
         <w:b/>
         <w:bCs/>
-        <w:color w:val="ffffff" w:themeColor="background1"/>
+        <w:color w:themeColor="background1"/>
       </w:rPr>
       <w:tblPr/>
       <w:tcPr>
@@ -3724,7 +3887,7 @@
       <w:rPr>
         <w:b/>
         <w:bCs/>
-        <w:color w:val="ffffff" w:themeColor="background1"/>
+        <w:color w:themeColor="background1"/>
       </w:rPr>
       <w:tblPr/>
       <w:tcPr>
@@ -3817,7 +3980,7 @@
       <w:rPr>
         <w:b/>
         <w:bCs/>
-        <w:color w:val="ffffff" w:themeColor="background1"/>
+        <w:color w:themeColor="background1"/>
       </w:rPr>
       <w:tblPr/>
       <w:tcPr>
@@ -3910,7 +4073,7 @@
       <w:rPr>
         <w:b/>
         <w:bCs/>
-        <w:color w:val="ffffff" w:themeColor="background1"/>
+        <w:color w:themeColor="background1"/>
       </w:rPr>
       <w:tblPr/>
       <w:tcPr>
@@ -4003,7 +4166,7 @@
       <w:rPr>
         <w:b/>
         <w:bCs/>
-        <w:color w:val="ffffff" w:themeColor="background1"/>
+        <w:color w:themeColor="background1"/>
       </w:rPr>
       <w:tblPr/>
       <w:tcPr>
@@ -4096,7 +4259,7 @@
       <w:rPr>
         <w:b/>
         <w:bCs/>
-        <w:color w:val="ffffff" w:themeColor="background1"/>
+        <w:color w:themeColor="background1"/>
       </w:rPr>
       <w:tblPr/>
       <w:tcPr>
@@ -4189,7 +4352,7 @@
       <w:rPr>
         <w:b/>
         <w:bCs/>
-        <w:color w:val="ffffff" w:themeColor="background1"/>
+        <w:color w:themeColor="background1"/>
       </w:rPr>
       <w:tblPr/>
       <w:tcPr>
@@ -5193,7 +5356,7 @@
       <w:rPr>
         <w:b/>
         <w:bCs/>
-        <w:color w:val="ffffff" w:themeColor="background1"/>
+        <w:color w:themeColor="background1"/>
       </w:rPr>
       <w:tblPr/>
       <w:tcPr>
@@ -5300,7 +5463,7 @@
       <w:rPr>
         <w:b/>
         <w:bCs/>
-        <w:color w:val="ffffff" w:themeColor="background1"/>
+        <w:color w:themeColor="background1"/>
       </w:rPr>
       <w:tblPr/>
       <w:tcPr>
@@ -5407,7 +5570,7 @@
       <w:rPr>
         <w:b/>
         <w:bCs/>
-        <w:color w:val="ffffff" w:themeColor="background1"/>
+        <w:color w:themeColor="background1"/>
       </w:rPr>
       <w:tblPr/>
       <w:tcPr>
@@ -5514,7 +5677,7 @@
       <w:rPr>
         <w:b/>
         <w:bCs/>
-        <w:color w:val="ffffff" w:themeColor="background1"/>
+        <w:color w:themeColor="background1"/>
       </w:rPr>
       <w:tblPr/>
       <w:tcPr>
@@ -5621,7 +5784,7 @@
       <w:rPr>
         <w:b/>
         <w:bCs/>
-        <w:color w:val="ffffff" w:themeColor="background1"/>
+        <w:color w:themeColor="background1"/>
       </w:rPr>
       <w:tblPr/>
       <w:tcPr>
@@ -5728,7 +5891,7 @@
       <w:rPr>
         <w:b/>
         <w:bCs/>
-        <w:color w:val="ffffff" w:themeColor="background1"/>
+        <w:color w:themeColor="background1"/>
       </w:rPr>
       <w:tblPr/>
       <w:tcPr>
@@ -5835,7 +5998,7 @@
       <w:rPr>
         <w:b/>
         <w:bCs/>
-        <w:color w:val="ffffff" w:themeColor="background1"/>
+        <w:color w:themeColor="background1"/>
       </w:rPr>
       <w:tblPr/>
       <w:tcPr>
@@ -5939,7 +6102,7 @@
       <w:rPr>
         <w:b/>
         <w:bCs/>
-        <w:color w:val="ffffff" w:themeColor="background1"/>
+        <w:color w:themeColor="background1"/>
       </w:rPr>
       <w:tblPr/>
       <w:tcPr>
@@ -5958,7 +6121,6 @@
       <w:pPr>
         <w:spacing w:before="0" w:after="0" w:line="240" w:lineRule="auto"/>
       </w:pPr>
-      <w:rPr/>
       <w:tblPr/>
       <w:tcPr>
         <w:tcBorders>
@@ -5976,7 +6138,7 @@
       <w:rPr>
         <w:b/>
         <w:bCs/>
-        <w:color w:val="ffffff" w:themeColor="background1"/>
+        <w:color w:themeColor="background1"/>
       </w:rPr>
       <w:tblPr/>
       <w:tcPr>
@@ -5995,7 +6157,7 @@
       <w:rPr>
         <w:b/>
         <w:bCs/>
-        <w:color w:val="ffffff" w:themeColor="background1"/>
+        <w:color w:themeColor="background1"/>
       </w:rPr>
       <w:tblPr/>
       <w:tcPr>
@@ -6041,7 +6203,7 @@
     </w:tblStylePr>
     <w:tblStylePr w:type="nwCell">
       <w:rPr>
-        <w:color w:val="ffffff" w:themeColor="background1"/>
+        <w:color w:themeColor="background1"/>
       </w:rPr>
       <w:tblPr/>
       <w:tcPr>
@@ -6085,7 +6247,7 @@
       <w:rPr>
         <w:b/>
         <w:bCs/>
-        <w:color w:val="ffffff" w:themeColor="background1"/>
+        <w:color w:themeColor="background1"/>
       </w:rPr>
       <w:tblPr/>
       <w:tcPr>
@@ -6104,7 +6266,6 @@
       <w:pPr>
         <w:spacing w:before="0" w:after="0" w:line="240" w:lineRule="auto"/>
       </w:pPr>
-      <w:rPr/>
       <w:tblPr/>
       <w:tcPr>
         <w:tcBorders>
@@ -6122,7 +6283,7 @@
       <w:rPr>
         <w:b/>
         <w:bCs/>
-        <w:color w:val="ffffff" w:themeColor="background1"/>
+        <w:color w:themeColor="background1"/>
       </w:rPr>
       <w:tblPr/>
       <w:tcPr>
@@ -6141,7 +6302,7 @@
       <w:rPr>
         <w:b/>
         <w:bCs/>
-        <w:color w:val="ffffff" w:themeColor="background1"/>
+        <w:color w:themeColor="background1"/>
       </w:rPr>
       <w:tblPr/>
       <w:tcPr>
@@ -6187,7 +6348,7 @@
     </w:tblStylePr>
     <w:tblStylePr w:type="nwCell">
       <w:rPr>
-        <w:color w:val="ffffff" w:themeColor="background1"/>
+        <w:color w:themeColor="background1"/>
       </w:rPr>
       <w:tblPr/>
       <w:tcPr>
@@ -6231,7 +6392,7 @@
       <w:rPr>
         <w:b/>
         <w:bCs/>
-        <w:color w:val="ffffff" w:themeColor="background1"/>
+        <w:color w:themeColor="background1"/>
       </w:rPr>
       <w:tblPr/>
       <w:tcPr>
@@ -6250,7 +6411,6 @@
       <w:pPr>
         <w:spacing w:before="0" w:after="0" w:line="240" w:lineRule="auto"/>
       </w:pPr>
-      <w:rPr/>
       <w:tblPr/>
       <w:tcPr>
         <w:tcBorders>
@@ -6268,7 +6428,7 @@
       <w:rPr>
         <w:b/>
         <w:bCs/>
-        <w:color w:val="ffffff" w:themeColor="background1"/>
+        <w:color w:themeColor="background1"/>
       </w:rPr>
       <w:tblPr/>
       <w:tcPr>
@@ -6287,7 +6447,7 @@
       <w:rPr>
         <w:b/>
         <w:bCs/>
-        <w:color w:val="ffffff" w:themeColor="background1"/>
+        <w:color w:themeColor="background1"/>
       </w:rPr>
       <w:tblPr/>
       <w:tcPr>
@@ -6333,7 +6493,7 @@
     </w:tblStylePr>
     <w:tblStylePr w:type="nwCell">
       <w:rPr>
-        <w:color w:val="ffffff" w:themeColor="background1"/>
+        <w:color w:themeColor="background1"/>
       </w:rPr>
       <w:tblPr/>
       <w:tcPr>
@@ -6377,7 +6537,7 @@
       <w:rPr>
         <w:b/>
         <w:bCs/>
-        <w:color w:val="ffffff" w:themeColor="background1"/>
+        <w:color w:themeColor="background1"/>
       </w:rPr>
       <w:tblPr/>
       <w:tcPr>
@@ -6396,7 +6556,6 @@
       <w:pPr>
         <w:spacing w:before="0" w:after="0" w:line="240" w:lineRule="auto"/>
       </w:pPr>
-      <w:rPr/>
       <w:tblPr/>
       <w:tcPr>
         <w:tcBorders>
@@ -6414,7 +6573,7 @@
       <w:rPr>
         <w:b/>
         <w:bCs/>
-        <w:color w:val="ffffff" w:themeColor="background1"/>
+        <w:color w:themeColor="background1"/>
       </w:rPr>
       <w:tblPr/>
       <w:tcPr>
@@ -6433,7 +6592,7 @@
       <w:rPr>
         <w:b/>
         <w:bCs/>
-        <w:color w:val="ffffff" w:themeColor="background1"/>
+        <w:color w:themeColor="background1"/>
       </w:rPr>
       <w:tblPr/>
       <w:tcPr>
@@ -6479,7 +6638,7 @@
     </w:tblStylePr>
     <w:tblStylePr w:type="nwCell">
       <w:rPr>
-        <w:color w:val="ffffff" w:themeColor="background1"/>
+        <w:color w:themeColor="background1"/>
       </w:rPr>
       <w:tblPr/>
       <w:tcPr>
@@ -6523,7 +6682,7 @@
       <w:rPr>
         <w:b/>
         <w:bCs/>
-        <w:color w:val="ffffff" w:themeColor="background1"/>
+        <w:color w:themeColor="background1"/>
       </w:rPr>
       <w:tblPr/>
       <w:tcPr>
@@ -6542,7 +6701,6 @@
       <w:pPr>
         <w:spacing w:before="0" w:after="0" w:line="240" w:lineRule="auto"/>
       </w:pPr>
-      <w:rPr/>
       <w:tblPr/>
       <w:tcPr>
         <w:tcBorders>
@@ -6560,7 +6718,7 @@
       <w:rPr>
         <w:b/>
         <w:bCs/>
-        <w:color w:val="ffffff" w:themeColor="background1"/>
+        <w:color w:themeColor="background1"/>
       </w:rPr>
       <w:tblPr/>
       <w:tcPr>
@@ -6579,7 +6737,7 @@
       <w:rPr>
         <w:b/>
         <w:bCs/>
-        <w:color w:val="ffffff" w:themeColor="background1"/>
+        <w:color w:themeColor="background1"/>
       </w:rPr>
       <w:tblPr/>
       <w:tcPr>
@@ -6625,7 +6783,7 @@
     </w:tblStylePr>
     <w:tblStylePr w:type="nwCell">
       <w:rPr>
-        <w:color w:val="ffffff" w:themeColor="background1"/>
+        <w:color w:themeColor="background1"/>
       </w:rPr>
       <w:tblPr/>
       <w:tcPr>
@@ -6669,7 +6827,7 @@
       <w:rPr>
         <w:b/>
         <w:bCs/>
-        <w:color w:val="ffffff" w:themeColor="background1"/>
+        <w:color w:themeColor="background1"/>
       </w:rPr>
       <w:tblPr/>
       <w:tcPr>
@@ -6688,7 +6846,6 @@
       <w:pPr>
         <w:spacing w:before="0" w:after="0" w:line="240" w:lineRule="auto"/>
       </w:pPr>
-      <w:rPr/>
       <w:tblPr/>
       <w:tcPr>
         <w:tcBorders>
@@ -6706,7 +6863,7 @@
       <w:rPr>
         <w:b/>
         <w:bCs/>
-        <w:color w:val="ffffff" w:themeColor="background1"/>
+        <w:color w:themeColor="background1"/>
       </w:rPr>
       <w:tblPr/>
       <w:tcPr>
@@ -6725,7 +6882,7 @@
       <w:rPr>
         <w:b/>
         <w:bCs/>
-        <w:color w:val="ffffff" w:themeColor="background1"/>
+        <w:color w:themeColor="background1"/>
       </w:rPr>
       <w:tblPr/>
       <w:tcPr>
@@ -6771,7 +6928,7 @@
     </w:tblStylePr>
     <w:tblStylePr w:type="nwCell">
       <w:rPr>
-        <w:color w:val="ffffff" w:themeColor="background1"/>
+        <w:color w:themeColor="background1"/>
       </w:rPr>
       <w:tblPr/>
       <w:tcPr>
@@ -6815,7 +6972,7 @@
       <w:rPr>
         <w:b/>
         <w:bCs/>
-        <w:color w:val="ffffff" w:themeColor="background1"/>
+        <w:color w:themeColor="background1"/>
       </w:rPr>
       <w:tblPr/>
       <w:tcPr>
@@ -6834,7 +6991,6 @@
       <w:pPr>
         <w:spacing w:before="0" w:after="0" w:line="240" w:lineRule="auto"/>
       </w:pPr>
-      <w:rPr/>
       <w:tblPr/>
       <w:tcPr>
         <w:tcBorders>
@@ -6852,7 +7008,7 @@
       <w:rPr>
         <w:b/>
         <w:bCs/>
-        <w:color w:val="ffffff" w:themeColor="background1"/>
+        <w:color w:themeColor="background1"/>
       </w:rPr>
       <w:tblPr/>
       <w:tcPr>
@@ -6871,7 +7027,7 @@
       <w:rPr>
         <w:b/>
         <w:bCs/>
-        <w:color w:val="ffffff" w:themeColor="background1"/>
+        <w:color w:themeColor="background1"/>
       </w:rPr>
       <w:tblPr/>
       <w:tcPr>
@@ -6917,7 +7073,7 @@
     </w:tblStylePr>
     <w:tblStylePr w:type="nwCell">
       <w:rPr>
-        <w:color w:val="ffffff" w:themeColor="background1"/>
+        <w:color w:themeColor="background1"/>
       </w:rPr>
       <w:tblPr/>
       <w:tcPr>
@@ -6941,7 +7097,7 @@
       <w:spacing w:after="0" w:line="240" w:lineRule="auto"/>
     </w:pPr>
     <w:rPr>
-      <w:color w:val="000000" w:themeColor="text1"/>
+      <w:color w:themeColor="text1"/>
     </w:rPr>
     <w:tblPr>
       <w:tblStyleRowBandSize w:val="1"/>
@@ -6973,7 +7129,7 @@
       <w:rPr>
         <w:b/>
         <w:bCs/>
-        <w:color w:val="1f497d" w:themeColor="text2"/>
+        <w:color w:themeColor="text2"/>
       </w:rPr>
       <w:tblPr/>
       <w:tcPr>
@@ -7025,7 +7181,7 @@
       <w:spacing w:after="0" w:line="240" w:lineRule="auto"/>
     </w:pPr>
     <w:rPr>
-      <w:color w:val="000000" w:themeColor="text1"/>
+      <w:color w:themeColor="text1"/>
     </w:rPr>
     <w:tblPr>
       <w:tblStyleRowBandSize w:val="1"/>
@@ -7057,7 +7213,7 @@
       <w:rPr>
         <w:b/>
         <w:bCs/>
-        <w:color w:val="1f497d" w:themeColor="text2"/>
+        <w:color w:themeColor="text2"/>
       </w:rPr>
       <w:tblPr/>
       <w:tcPr>
@@ -7109,7 +7265,7 @@
       <w:spacing w:after="0" w:line="240" w:lineRule="auto"/>
     </w:pPr>
     <w:rPr>
-      <w:color w:val="000000" w:themeColor="text1"/>
+      <w:color w:themeColor="text1"/>
     </w:rPr>
     <w:tblPr>
       <w:tblStyleRowBandSize w:val="1"/>
@@ -7141,7 +7297,7 @@
       <w:rPr>
         <w:b/>
         <w:bCs/>
-        <w:color w:val="1f497d" w:themeColor="text2"/>
+        <w:color w:themeColor="text2"/>
       </w:rPr>
       <w:tblPr/>
       <w:tcPr>
@@ -7193,7 +7349,7 @@
       <w:spacing w:after="0" w:line="240" w:lineRule="auto"/>
     </w:pPr>
     <w:rPr>
-      <w:color w:val="000000" w:themeColor="text1"/>
+      <w:color w:themeColor="text1"/>
     </w:rPr>
     <w:tblPr>
       <w:tblStyleRowBandSize w:val="1"/>
@@ -7225,7 +7381,7 @@
       <w:rPr>
         <w:b/>
         <w:bCs/>
-        <w:color w:val="1f497d" w:themeColor="text2"/>
+        <w:color w:themeColor="text2"/>
       </w:rPr>
       <w:tblPr/>
       <w:tcPr>
@@ -7277,7 +7433,7 @@
       <w:spacing w:after="0" w:line="240" w:lineRule="auto"/>
     </w:pPr>
     <w:rPr>
-      <w:color w:val="000000" w:themeColor="text1"/>
+      <w:color w:themeColor="text1"/>
     </w:rPr>
     <w:tblPr>
       <w:tblStyleRowBandSize w:val="1"/>
@@ -7309,7 +7465,7 @@
       <w:rPr>
         <w:b/>
         <w:bCs/>
-        <w:color w:val="1f497d" w:themeColor="text2"/>
+        <w:color w:themeColor="text2"/>
       </w:rPr>
       <w:tblPr/>
       <w:tcPr>
@@ -7361,7 +7517,7 @@
       <w:spacing w:after="0" w:line="240" w:lineRule="auto"/>
     </w:pPr>
     <w:rPr>
-      <w:color w:val="000000" w:themeColor="text1"/>
+      <w:color w:themeColor="text1"/>
     </w:rPr>
     <w:tblPr>
       <w:tblStyleRowBandSize w:val="1"/>
@@ -7393,7 +7549,7 @@
       <w:rPr>
         <w:b/>
         <w:bCs/>
-        <w:color w:val="1f497d" w:themeColor="text2"/>
+        <w:color w:themeColor="text2"/>
       </w:rPr>
       <w:tblPr/>
       <w:tcPr>
@@ -7445,7 +7601,7 @@
       <w:spacing w:after="0" w:line="240" w:lineRule="auto"/>
     </w:pPr>
     <w:rPr>
-      <w:color w:val="000000" w:themeColor="text1"/>
+      <w:color w:themeColor="text1"/>
     </w:rPr>
     <w:tblPr>
       <w:tblStyleRowBandSize w:val="1"/>
@@ -7477,7 +7633,7 @@
       <w:rPr>
         <w:b/>
         <w:bCs/>
-        <w:color w:val="1f497d" w:themeColor="text2"/>
+        <w:color w:themeColor="text2"/>
       </w:rPr>
       <w:tblPr/>
       <w:tcPr>
@@ -7530,7 +7686,7 @@
     </w:pPr>
     <w:rPr>
       <w:rFonts w:asciiTheme="majorHAnsi" w:hAnsiTheme="majorHAnsi" w:eastAsiaTheme="majorEastAsia" w:cstheme="majorBidi"/>
-      <w:color w:val="000000" w:themeColor="text1"/>
+      <w:color w:themeColor="text1"/>
     </w:rPr>
     <w:tblPr>
       <w:tblStyleRowBandSize w:val="1"/>
@@ -7657,7 +7813,7 @@
     </w:pPr>
     <w:rPr>
       <w:rFonts w:asciiTheme="majorHAnsi" w:hAnsiTheme="majorHAnsi" w:eastAsiaTheme="majorEastAsia" w:cstheme="majorBidi"/>
-      <w:color w:val="000000" w:themeColor="text1"/>
+      <w:color w:themeColor="text1"/>
     </w:rPr>
     <w:tblPr>
       <w:tblStyleRowBandSize w:val="1"/>
@@ -7784,7 +7940,7 @@
     </w:pPr>
     <w:rPr>
       <w:rFonts w:asciiTheme="majorHAnsi" w:hAnsiTheme="majorHAnsi" w:eastAsiaTheme="majorEastAsia" w:cstheme="majorBidi"/>
-      <w:color w:val="000000" w:themeColor="text1"/>
+      <w:color w:themeColor="text1"/>
     </w:rPr>
     <w:tblPr>
       <w:tblStyleRowBandSize w:val="1"/>
@@ -7911,7 +8067,7 @@
     </w:pPr>
     <w:rPr>
       <w:rFonts w:asciiTheme="majorHAnsi" w:hAnsiTheme="majorHAnsi" w:eastAsiaTheme="majorEastAsia" w:cstheme="majorBidi"/>
-      <w:color w:val="000000" w:themeColor="text1"/>
+      <w:color w:themeColor="text1"/>
     </w:rPr>
     <w:tblPr>
       <w:tblStyleRowBandSize w:val="1"/>
@@ -8038,7 +8194,7 @@
     </w:pPr>
     <w:rPr>
       <w:rFonts w:asciiTheme="majorHAnsi" w:hAnsiTheme="majorHAnsi" w:eastAsiaTheme="majorEastAsia" w:cstheme="majorBidi"/>
-      <w:color w:val="000000" w:themeColor="text1"/>
+      <w:color w:themeColor="text1"/>
     </w:rPr>
     <w:tblPr>
       <w:tblStyleRowBandSize w:val="1"/>
@@ -8165,7 +8321,7 @@
     </w:pPr>
     <w:rPr>
       <w:rFonts w:asciiTheme="majorHAnsi" w:hAnsiTheme="majorHAnsi" w:eastAsiaTheme="majorEastAsia" w:cstheme="majorBidi"/>
-      <w:color w:val="000000" w:themeColor="text1"/>
+      <w:color w:themeColor="text1"/>
     </w:rPr>
     <w:tblPr>
       <w:tblStyleRowBandSize w:val="1"/>
@@ -8292,7 +8448,7 @@
     </w:pPr>
     <w:rPr>
       <w:rFonts w:asciiTheme="majorHAnsi" w:hAnsiTheme="majorHAnsi" w:eastAsiaTheme="majorEastAsia" w:cstheme="majorBidi"/>
-      <w:color w:val="000000" w:themeColor="text1"/>
+      <w:color w:themeColor="text1"/>
     </w:rPr>
     <w:tblPr>
       <w:tblStyleRowBandSize w:val="1"/>
@@ -8944,7 +9100,7 @@
     </w:pPr>
     <w:rPr>
       <w:rFonts w:asciiTheme="majorHAnsi" w:hAnsiTheme="majorHAnsi" w:eastAsiaTheme="majorEastAsia" w:cstheme="majorBidi"/>
-      <w:color w:val="000000" w:themeColor="text1"/>
+      <w:color w:themeColor="text1"/>
     </w:rPr>
     <w:tblPr>
       <w:tblStyleRowBandSize w:val="1"/>
@@ -8971,7 +9127,7 @@
       <w:rPr>
         <w:b/>
         <w:bCs/>
-        <w:color w:val="000000" w:themeColor="text1"/>
+        <w:color w:themeColor="text1"/>
       </w:rPr>
       <w:tblPr/>
       <w:tcPr>
@@ -8982,7 +9138,7 @@
       <w:rPr>
         <w:b/>
         <w:bCs/>
-        <w:color w:val="000000" w:themeColor="text1"/>
+        <w:color w:themeColor="text1"/>
       </w:rPr>
       <w:tblPr/>
       <w:tcPr>
@@ -9001,7 +9157,7 @@
       <w:rPr>
         <w:b/>
         <w:bCs/>
-        <w:color w:val="000000" w:themeColor="text1"/>
+        <w:color w:themeColor="text1"/>
       </w:rPr>
       <w:tblPr/>
       <w:tcPr>
@@ -9020,7 +9176,7 @@
       <w:rPr>
         <w:b w:val="0"/>
         <w:bCs w:val="0"/>
-        <w:color w:val="000000" w:themeColor="text1"/>
+        <w:color w:themeColor="text1"/>
       </w:rPr>
       <w:tblPr/>
       <w:tcPr>
@@ -9068,7 +9224,7 @@
     </w:pPr>
     <w:rPr>
       <w:rFonts w:asciiTheme="majorHAnsi" w:hAnsiTheme="majorHAnsi" w:eastAsiaTheme="majorEastAsia" w:cstheme="majorBidi"/>
-      <w:color w:val="000000" w:themeColor="text1"/>
+      <w:color w:themeColor="text1"/>
     </w:rPr>
     <w:tblPr>
       <w:tblStyleRowBandSize w:val="1"/>
@@ -9095,7 +9251,7 @@
       <w:rPr>
         <w:b/>
         <w:bCs/>
-        <w:color w:val="000000" w:themeColor="text1"/>
+        <w:color w:themeColor="text1"/>
       </w:rPr>
       <w:tblPr/>
       <w:tcPr>
@@ -9106,7 +9262,7 @@
       <w:rPr>
         <w:b/>
         <w:bCs/>
-        <w:color w:val="000000" w:themeColor="text1"/>
+        <w:color w:themeColor="text1"/>
       </w:rPr>
       <w:tblPr/>
       <w:tcPr>
@@ -9125,7 +9281,7 @@
       <w:rPr>
         <w:b/>
         <w:bCs/>
-        <w:color w:val="000000" w:themeColor="text1"/>
+        <w:color w:themeColor="text1"/>
       </w:rPr>
       <w:tblPr/>
       <w:tcPr>
@@ -9144,7 +9300,7 @@
       <w:rPr>
         <w:b w:val="0"/>
         <w:bCs w:val="0"/>
-        <w:color w:val="000000" w:themeColor="text1"/>
+        <w:color w:themeColor="text1"/>
       </w:rPr>
       <w:tblPr/>
       <w:tcPr>
@@ -9192,7 +9348,7 @@
     </w:pPr>
     <w:rPr>
       <w:rFonts w:asciiTheme="majorHAnsi" w:hAnsiTheme="majorHAnsi" w:eastAsiaTheme="majorEastAsia" w:cstheme="majorBidi"/>
-      <w:color w:val="000000" w:themeColor="text1"/>
+      <w:color w:themeColor="text1"/>
     </w:rPr>
     <w:tblPr>
       <w:tblStyleRowBandSize w:val="1"/>
@@ -9219,7 +9375,7 @@
       <w:rPr>
         <w:b/>
         <w:bCs/>
-        <w:color w:val="000000" w:themeColor="text1"/>
+        <w:color w:themeColor="text1"/>
       </w:rPr>
       <w:tblPr/>
       <w:tcPr>
@@ -9230,7 +9386,7 @@
       <w:rPr>
         <w:b/>
         <w:bCs/>
-        <w:color w:val="000000" w:themeColor="text1"/>
+        <w:color w:themeColor="text1"/>
       </w:rPr>
       <w:tblPr/>
       <w:tcPr>
@@ -9249,7 +9405,7 @@
       <w:rPr>
         <w:b/>
         <w:bCs/>
-        <w:color w:val="000000" w:themeColor="text1"/>
+        <w:color w:themeColor="text1"/>
       </w:rPr>
       <w:tblPr/>
       <w:tcPr>
@@ -9268,7 +9424,7 @@
       <w:rPr>
         <w:b w:val="0"/>
         <w:bCs w:val="0"/>
-        <w:color w:val="000000" w:themeColor="text1"/>
+        <w:color w:themeColor="text1"/>
       </w:rPr>
       <w:tblPr/>
       <w:tcPr>
@@ -9316,7 +9472,7 @@
     </w:pPr>
     <w:rPr>
       <w:rFonts w:asciiTheme="majorHAnsi" w:hAnsiTheme="majorHAnsi" w:eastAsiaTheme="majorEastAsia" w:cstheme="majorBidi"/>
-      <w:color w:val="000000" w:themeColor="text1"/>
+      <w:color w:themeColor="text1"/>
     </w:rPr>
     <w:tblPr>
       <w:tblStyleRowBandSize w:val="1"/>
@@ -9343,7 +9499,7 @@
       <w:rPr>
         <w:b/>
         <w:bCs/>
-        <w:color w:val="000000" w:themeColor="text1"/>
+        <w:color w:themeColor="text1"/>
       </w:rPr>
       <w:tblPr/>
       <w:tcPr>
@@ -9354,7 +9510,7 @@
       <w:rPr>
         <w:b/>
         <w:bCs/>
-        <w:color w:val="000000" w:themeColor="text1"/>
+        <w:color w:themeColor="text1"/>
       </w:rPr>
       <w:tblPr/>
       <w:tcPr>
@@ -9373,7 +9529,7 @@
       <w:rPr>
         <w:b/>
         <w:bCs/>
-        <w:color w:val="000000" w:themeColor="text1"/>
+        <w:color w:themeColor="text1"/>
       </w:rPr>
       <w:tblPr/>
       <w:tcPr>
@@ -9392,7 +9548,7 @@
       <w:rPr>
         <w:b w:val="0"/>
         <w:bCs w:val="0"/>
-        <w:color w:val="000000" w:themeColor="text1"/>
+        <w:color w:themeColor="text1"/>
       </w:rPr>
       <w:tblPr/>
       <w:tcPr>
@@ -9440,7 +9596,7 @@
     </w:pPr>
     <w:rPr>
       <w:rFonts w:asciiTheme="majorHAnsi" w:hAnsiTheme="majorHAnsi" w:eastAsiaTheme="majorEastAsia" w:cstheme="majorBidi"/>
-      <w:color w:val="000000" w:themeColor="text1"/>
+      <w:color w:themeColor="text1"/>
     </w:rPr>
     <w:tblPr>
       <w:tblStyleRowBandSize w:val="1"/>
@@ -9467,7 +9623,7 @@
       <w:rPr>
         <w:b/>
         <w:bCs/>
-        <w:color w:val="000000" w:themeColor="text1"/>
+        <w:color w:themeColor="text1"/>
       </w:rPr>
       <w:tblPr/>
       <w:tcPr>
@@ -9478,7 +9634,7 @@
       <w:rPr>
         <w:b/>
         <w:bCs/>
-        <w:color w:val="000000" w:themeColor="text1"/>
+        <w:color w:themeColor="text1"/>
       </w:rPr>
       <w:tblPr/>
       <w:tcPr>
@@ -9497,7 +9653,7 @@
       <w:rPr>
         <w:b/>
         <w:bCs/>
-        <w:color w:val="000000" w:themeColor="text1"/>
+        <w:color w:themeColor="text1"/>
       </w:rPr>
       <w:tblPr/>
       <w:tcPr>
@@ -9516,7 +9672,7 @@
       <w:rPr>
         <w:b w:val="0"/>
         <w:bCs w:val="0"/>
-        <w:color w:val="000000" w:themeColor="text1"/>
+        <w:color w:themeColor="text1"/>
       </w:rPr>
       <w:tblPr/>
       <w:tcPr>
@@ -9564,7 +9720,7 @@
     </w:pPr>
     <w:rPr>
       <w:rFonts w:asciiTheme="majorHAnsi" w:hAnsiTheme="majorHAnsi" w:eastAsiaTheme="majorEastAsia" w:cstheme="majorBidi"/>
-      <w:color w:val="000000" w:themeColor="text1"/>
+      <w:color w:themeColor="text1"/>
     </w:rPr>
     <w:tblPr>
       <w:tblStyleRowBandSize w:val="1"/>
@@ -9591,7 +9747,7 @@
       <w:rPr>
         <w:b/>
         <w:bCs/>
-        <w:color w:val="000000" w:themeColor="text1"/>
+        <w:color w:themeColor="text1"/>
       </w:rPr>
       <w:tblPr/>
       <w:tcPr>
@@ -9602,7 +9758,7 @@
       <w:rPr>
         <w:b/>
         <w:bCs/>
-        <w:color w:val="000000" w:themeColor="text1"/>
+        <w:color w:themeColor="text1"/>
       </w:rPr>
       <w:tblPr/>
       <w:tcPr>
@@ -9621,7 +9777,7 @@
       <w:rPr>
         <w:b/>
         <w:bCs/>
-        <w:color w:val="000000" w:themeColor="text1"/>
+        <w:color w:themeColor="text1"/>
       </w:rPr>
       <w:tblPr/>
       <w:tcPr>
@@ -9640,7 +9796,7 @@
       <w:rPr>
         <w:b w:val="0"/>
         <w:bCs w:val="0"/>
-        <w:color w:val="000000" w:themeColor="text1"/>
+        <w:color w:themeColor="text1"/>
       </w:rPr>
       <w:tblPr/>
       <w:tcPr>
@@ -9688,7 +9844,7 @@
     </w:pPr>
     <w:rPr>
       <w:rFonts w:asciiTheme="majorHAnsi" w:hAnsiTheme="majorHAnsi" w:eastAsiaTheme="majorEastAsia" w:cstheme="majorBidi"/>
-      <w:color w:val="000000" w:themeColor="text1"/>
+      <w:color w:themeColor="text1"/>
     </w:rPr>
     <w:tblPr>
       <w:tblStyleRowBandSize w:val="1"/>
@@ -9715,7 +9871,7 @@
       <w:rPr>
         <w:b/>
         <w:bCs/>
-        <w:color w:val="000000" w:themeColor="text1"/>
+        <w:color w:themeColor="text1"/>
       </w:rPr>
       <w:tblPr/>
       <w:tcPr>
@@ -9726,7 +9882,7 @@
       <w:rPr>
         <w:b/>
         <w:bCs/>
-        <w:color w:val="000000" w:themeColor="text1"/>
+        <w:color w:themeColor="text1"/>
       </w:rPr>
       <w:tblPr/>
       <w:tcPr>
@@ -9745,7 +9901,7 @@
       <w:rPr>
         <w:b/>
         <w:bCs/>
-        <w:color w:val="000000" w:themeColor="text1"/>
+        <w:color w:themeColor="text1"/>
       </w:rPr>
       <w:tblPr/>
       <w:tcPr>
@@ -9764,7 +9920,7 @@
       <w:rPr>
         <w:b w:val="0"/>
         <w:bCs w:val="0"/>
-        <w:color w:val="000000" w:themeColor="text1"/>
+        <w:color w:themeColor="text1"/>
       </w:rPr>
       <w:tblPr/>
       <w:tcPr>
@@ -9836,7 +9992,7 @@
         <w:b/>
         <w:bCs/>
         <w:i w:val="0"/>
-        <w:color w:val="ffffff" w:themeColor="background1"/>
+        <w:color w:themeColor="background1"/>
       </w:rPr>
       <w:tblPr/>
       <w:tcPr>
@@ -9856,7 +10012,7 @@
         <w:b/>
         <w:bCs/>
         <w:i w:val="0"/>
-        <w:color w:val="ffffff" w:themeColor="background1"/>
+        <w:color w:themeColor="background1"/>
       </w:rPr>
       <w:tblPr/>
       <w:tcPr>
@@ -9876,7 +10032,7 @@
         <w:b/>
         <w:bCs/>
         <w:i w:val="0"/>
-        <w:color w:val="ffffff" w:themeColor="background1"/>
+        <w:color w:themeColor="background1"/>
       </w:rPr>
       <w:tblPr/>
       <w:tcPr>
@@ -9894,7 +10050,7 @@
         <w:b/>
         <w:bCs/>
         <w:i w:val="0"/>
-        <w:color w:val="ffffff" w:themeColor="background1"/>
+        <w:color w:themeColor="background1"/>
       </w:rPr>
       <w:tblPr/>
       <w:tcPr>
@@ -9972,7 +10128,7 @@
         <w:b/>
         <w:bCs/>
         <w:i w:val="0"/>
-        <w:color w:val="ffffff" w:themeColor="background1"/>
+        <w:color w:themeColor="background1"/>
       </w:rPr>
       <w:tblPr/>
       <w:tcPr>
@@ -9992,7 +10148,7 @@
         <w:b/>
         <w:bCs/>
         <w:i w:val="0"/>
-        <w:color w:val="ffffff" w:themeColor="background1"/>
+        <w:color w:themeColor="background1"/>
       </w:rPr>
       <w:tblPr/>
       <w:tcPr>
@@ -10012,7 +10168,7 @@
         <w:b/>
         <w:bCs/>
         <w:i w:val="0"/>
-        <w:color w:val="ffffff" w:themeColor="background1"/>
+        <w:color w:themeColor="background1"/>
       </w:rPr>
       <w:tblPr/>
       <w:tcPr>
@@ -10030,7 +10186,7 @@
         <w:b/>
         <w:bCs/>
         <w:i w:val="0"/>
-        <w:color w:val="ffffff" w:themeColor="background1"/>
+        <w:color w:themeColor="background1"/>
       </w:rPr>
       <w:tblPr/>
       <w:tcPr>
@@ -10108,7 +10264,7 @@
         <w:b/>
         <w:bCs/>
         <w:i w:val="0"/>
-        <w:color w:val="ffffff" w:themeColor="background1"/>
+        <w:color w:themeColor="background1"/>
       </w:rPr>
       <w:tblPr/>
       <w:tcPr>
@@ -10128,7 +10284,7 @@
         <w:b/>
         <w:bCs/>
         <w:i w:val="0"/>
-        <w:color w:val="ffffff" w:themeColor="background1"/>
+        <w:color w:themeColor="background1"/>
       </w:rPr>
       <w:tblPr/>
       <w:tcPr>
@@ -10148,7 +10304,7 @@
         <w:b/>
         <w:bCs/>
         <w:i w:val="0"/>
-        <w:color w:val="ffffff" w:themeColor="background1"/>
+        <w:color w:themeColor="background1"/>
       </w:rPr>
       <w:tblPr/>
       <w:tcPr>
@@ -10166,7 +10322,7 @@
         <w:b/>
         <w:bCs/>
         <w:i w:val="0"/>
-        <w:color w:val="ffffff" w:themeColor="background1"/>
+        <w:color w:themeColor="background1"/>
       </w:rPr>
       <w:tblPr/>
       <w:tcPr>
@@ -10244,7 +10400,7 @@
         <w:b/>
         <w:bCs/>
         <w:i w:val="0"/>
-        <w:color w:val="ffffff" w:themeColor="background1"/>
+        <w:color w:themeColor="background1"/>
       </w:rPr>
       <w:tblPr/>
       <w:tcPr>
@@ -10264,7 +10420,7 @@
         <w:b/>
         <w:bCs/>
         <w:i w:val="0"/>
-        <w:color w:val="ffffff" w:themeColor="background1"/>
+        <w:color w:themeColor="background1"/>
       </w:rPr>
       <w:tblPr/>
       <w:tcPr>
@@ -10284,7 +10440,7 @@
         <w:b/>
         <w:bCs/>
         <w:i w:val="0"/>
-        <w:color w:val="ffffff" w:themeColor="background1"/>
+        <w:color w:themeColor="background1"/>
       </w:rPr>
       <w:tblPr/>
       <w:tcPr>
@@ -10302,7 +10458,7 @@
         <w:b/>
         <w:bCs/>
         <w:i w:val="0"/>
-        <w:color w:val="ffffff" w:themeColor="background1"/>
+        <w:color w:themeColor="background1"/>
       </w:rPr>
       <w:tblPr/>
       <w:tcPr>
@@ -10380,7 +10536,7 @@
         <w:b/>
         <w:bCs/>
         <w:i w:val="0"/>
-        <w:color w:val="ffffff" w:themeColor="background1"/>
+        <w:color w:themeColor="background1"/>
       </w:rPr>
       <w:tblPr/>
       <w:tcPr>
@@ -10400,7 +10556,7 @@
         <w:b/>
         <w:bCs/>
         <w:i w:val="0"/>
-        <w:color w:val="ffffff" w:themeColor="background1"/>
+        <w:color w:themeColor="background1"/>
       </w:rPr>
       <w:tblPr/>
       <w:tcPr>
@@ -10420,7 +10576,7 @@
         <w:b/>
         <w:bCs/>
         <w:i w:val="0"/>
-        <w:color w:val="ffffff" w:themeColor="background1"/>
+        <w:color w:themeColor="background1"/>
       </w:rPr>
       <w:tblPr/>
       <w:tcPr>
@@ -10438,7 +10594,7 @@
         <w:b/>
         <w:bCs/>
         <w:i w:val="0"/>
-        <w:color w:val="ffffff" w:themeColor="background1"/>
+        <w:color w:themeColor="background1"/>
       </w:rPr>
       <w:tblPr/>
       <w:tcPr>
@@ -10516,7 +10672,7 @@
         <w:b/>
         <w:bCs/>
         <w:i w:val="0"/>
-        <w:color w:val="ffffff" w:themeColor="background1"/>
+        <w:color w:themeColor="background1"/>
       </w:rPr>
       <w:tblPr/>
       <w:tcPr>
@@ -10536,7 +10692,7 @@
         <w:b/>
         <w:bCs/>
         <w:i w:val="0"/>
-        <w:color w:val="ffffff" w:themeColor="background1"/>
+        <w:color w:themeColor="background1"/>
       </w:rPr>
       <w:tblPr/>
       <w:tcPr>
@@ -10556,7 +10712,7 @@
         <w:b/>
         <w:bCs/>
         <w:i w:val="0"/>
-        <w:color w:val="ffffff" w:themeColor="background1"/>
+        <w:color w:themeColor="background1"/>
       </w:rPr>
       <w:tblPr/>
       <w:tcPr>
@@ -10574,7 +10730,7 @@
         <w:b/>
         <w:bCs/>
         <w:i w:val="0"/>
-        <w:color w:val="ffffff" w:themeColor="background1"/>
+        <w:color w:themeColor="background1"/>
       </w:rPr>
       <w:tblPr/>
       <w:tcPr>
@@ -10652,7 +10808,7 @@
         <w:b/>
         <w:bCs/>
         <w:i w:val="0"/>
-        <w:color w:val="ffffff" w:themeColor="background1"/>
+        <w:color w:themeColor="background1"/>
       </w:rPr>
       <w:tblPr/>
       <w:tcPr>
@@ -10672,7 +10828,7 @@
         <w:b/>
         <w:bCs/>
         <w:i w:val="0"/>
-        <w:color w:val="ffffff" w:themeColor="background1"/>
+        <w:color w:themeColor="background1"/>
       </w:rPr>
       <w:tblPr/>
       <w:tcPr>
@@ -10692,7 +10848,7 @@
         <w:b/>
         <w:bCs/>
         <w:i w:val="0"/>
-        <w:color w:val="ffffff" w:themeColor="background1"/>
+        <w:color w:themeColor="background1"/>
       </w:rPr>
       <w:tblPr/>
       <w:tcPr>
@@ -10710,7 +10866,7 @@
         <w:b/>
         <w:bCs/>
         <w:i w:val="0"/>
-        <w:color w:val="ffffff" w:themeColor="background1"/>
+        <w:color w:themeColor="background1"/>
       </w:rPr>
       <w:tblPr/>
       <w:tcPr>
@@ -10763,7 +10919,7 @@
       <w:spacing w:after="0" w:line="240" w:lineRule="auto"/>
     </w:pPr>
     <w:rPr>
-      <w:color w:val="ffffff" w:themeColor="background1"/>
+      <w:color w:themeColor="background1"/>
     </w:rPr>
     <w:tblPr>
       <w:tblStyleRowBandSize w:val="1"/>
@@ -10876,7 +11032,7 @@
       <w:spacing w:after="0" w:line="240" w:lineRule="auto"/>
     </w:pPr>
     <w:rPr>
-      <w:color w:val="ffffff" w:themeColor="background1"/>
+      <w:color w:themeColor="background1"/>
     </w:rPr>
     <w:tblPr>
       <w:tblStyleRowBandSize w:val="1"/>
@@ -10989,7 +11145,7 @@
       <w:spacing w:after="0" w:line="240" w:lineRule="auto"/>
     </w:pPr>
     <w:rPr>
-      <w:color w:val="ffffff" w:themeColor="background1"/>
+      <w:color w:themeColor="background1"/>
     </w:rPr>
     <w:tblPr>
       <w:tblStyleRowBandSize w:val="1"/>
@@ -11102,7 +11258,7 @@
       <w:spacing w:after="0" w:line="240" w:lineRule="auto"/>
     </w:pPr>
     <w:rPr>
-      <w:color w:val="ffffff" w:themeColor="background1"/>
+      <w:color w:themeColor="background1"/>
     </w:rPr>
     <w:tblPr>
       <w:tblStyleRowBandSize w:val="1"/>
@@ -11215,7 +11371,7 @@
       <w:spacing w:after="0" w:line="240" w:lineRule="auto"/>
     </w:pPr>
     <w:rPr>
-      <w:color w:val="ffffff" w:themeColor="background1"/>
+      <w:color w:themeColor="background1"/>
     </w:rPr>
     <w:tblPr>
       <w:tblStyleRowBandSize w:val="1"/>
@@ -11328,7 +11484,7 @@
       <w:spacing w:after="0" w:line="240" w:lineRule="auto"/>
     </w:pPr>
     <w:rPr>
-      <w:color w:val="ffffff" w:themeColor="background1"/>
+      <w:color w:themeColor="background1"/>
     </w:rPr>
     <w:tblPr>
       <w:tblStyleRowBandSize w:val="1"/>
@@ -11441,7 +11597,7 @@
       <w:spacing w:after="0" w:line="240" w:lineRule="auto"/>
     </w:pPr>
     <w:rPr>
-      <w:color w:val="ffffff" w:themeColor="background1"/>
+      <w:color w:themeColor="background1"/>
     </w:rPr>
     <w:tblPr>
       <w:tblStyleRowBandSize w:val="1"/>
@@ -11554,7 +11710,7 @@
       <w:spacing w:after="0" w:line="240" w:lineRule="auto"/>
     </w:pPr>
     <w:rPr>
-      <w:color w:val="000000" w:themeColor="text1"/>
+      <w:color w:themeColor="text1"/>
     </w:rPr>
     <w:tblPr>
       <w:tblStyleRowBandSize w:val="1"/>
@@ -11599,7 +11755,7 @@
       <w:rPr>
         <w:b/>
         <w:bCs/>
-        <w:color w:val="ffffff" w:themeColor="background1"/>
+        <w:color w:themeColor="background1"/>
       </w:rPr>
       <w:tblPr/>
       <w:tcPr>
@@ -11611,7 +11767,7 @@
     </w:tblStylePr>
     <w:tblStylePr w:type="firstCol">
       <w:rPr>
-        <w:color w:val="ffffff" w:themeColor="background1"/>
+        <w:color w:themeColor="background1"/>
       </w:rPr>
       <w:tblPr/>
       <w:tcPr>
@@ -11628,7 +11784,7 @@
     </w:tblStylePr>
     <w:tblStylePr w:type="lastCol">
       <w:rPr>
-        <w:color w:val="ffffff" w:themeColor="background1"/>
+        <w:color w:themeColor="background1"/>
       </w:rPr>
       <w:tblPr/>
       <w:tcPr>
@@ -11657,13 +11813,13 @@
     </w:tblStylePr>
     <w:tblStylePr w:type="neCell">
       <w:rPr>
-        <w:color w:val="000000" w:themeColor="text1"/>
+        <w:color w:themeColor="text1"/>
       </w:rPr>
       <w:tblPr/>
     </w:tblStylePr>
     <w:tblStylePr w:type="nwCell">
       <w:rPr>
-        <w:color w:val="000000" w:themeColor="text1"/>
+        <w:color w:themeColor="text1"/>
       </w:rPr>
       <w:tblPr/>
     </w:tblStylePr>
@@ -11677,7 +11833,7 @@
       <w:spacing w:after="0" w:line="240" w:lineRule="auto"/>
     </w:pPr>
     <w:rPr>
-      <w:color w:val="000000" w:themeColor="text1"/>
+      <w:color w:themeColor="text1"/>
     </w:rPr>
     <w:tblPr>
       <w:tblStyleRowBandSize w:val="1"/>
@@ -11722,7 +11878,7 @@
       <w:rPr>
         <w:b/>
         <w:bCs/>
-        <w:color w:val="ffffff" w:themeColor="background1"/>
+        <w:color w:themeColor="background1"/>
       </w:rPr>
       <w:tblPr/>
       <w:tcPr>
@@ -11734,7 +11890,7 @@
     </w:tblStylePr>
     <w:tblStylePr w:type="firstCol">
       <w:rPr>
-        <w:color w:val="ffffff" w:themeColor="background1"/>
+        <w:color w:themeColor="background1"/>
       </w:rPr>
       <w:tblPr/>
       <w:tcPr>
@@ -11751,7 +11907,7 @@
     </w:tblStylePr>
     <w:tblStylePr w:type="lastCol">
       <w:rPr>
-        <w:color w:val="ffffff" w:themeColor="background1"/>
+        <w:color w:themeColor="background1"/>
       </w:rPr>
       <w:tblPr/>
       <w:tcPr>
@@ -11780,13 +11936,13 @@
     </w:tblStylePr>
     <w:tblStylePr w:type="neCell">
       <w:rPr>
-        <w:color w:val="000000" w:themeColor="text1"/>
+        <w:color w:themeColor="text1"/>
       </w:rPr>
       <w:tblPr/>
     </w:tblStylePr>
     <w:tblStylePr w:type="nwCell">
       <w:rPr>
-        <w:color w:val="000000" w:themeColor="text1"/>
+        <w:color w:themeColor="text1"/>
       </w:rPr>
       <w:tblPr/>
     </w:tblStylePr>
@@ -11800,7 +11956,7 @@
       <w:spacing w:after="0" w:line="240" w:lineRule="auto"/>
     </w:pPr>
     <w:rPr>
-      <w:color w:val="000000" w:themeColor="text1"/>
+      <w:color w:themeColor="text1"/>
     </w:rPr>
     <w:tblPr>
       <w:tblStyleRowBandSize w:val="1"/>
@@ -11845,7 +12001,7 @@
       <w:rPr>
         <w:b/>
         <w:bCs/>
-        <w:color w:val="ffffff" w:themeColor="background1"/>
+        <w:color w:themeColor="background1"/>
       </w:rPr>
       <w:tblPr/>
       <w:tcPr>
@@ -11857,7 +12013,7 @@
     </w:tblStylePr>
     <w:tblStylePr w:type="firstCol">
       <w:rPr>
-        <w:color w:val="ffffff" w:themeColor="background1"/>
+        <w:color w:themeColor="background1"/>
       </w:rPr>
       <w:tblPr/>
       <w:tcPr>
@@ -11874,7 +12030,7 @@
     </w:tblStylePr>
     <w:tblStylePr w:type="lastCol">
       <w:rPr>
-        <w:color w:val="ffffff" w:themeColor="background1"/>
+        <w:color w:themeColor="background1"/>
       </w:rPr>
       <w:tblPr/>
       <w:tcPr>
@@ -11903,13 +12059,13 @@
     </w:tblStylePr>
     <w:tblStylePr w:type="neCell">
       <w:rPr>
-        <w:color w:val="000000" w:themeColor="text1"/>
+        <w:color w:themeColor="text1"/>
       </w:rPr>
       <w:tblPr/>
     </w:tblStylePr>
     <w:tblStylePr w:type="nwCell">
       <w:rPr>
-        <w:color w:val="000000" w:themeColor="text1"/>
+        <w:color w:themeColor="text1"/>
       </w:rPr>
       <w:tblPr/>
     </w:tblStylePr>
@@ -11923,7 +12079,7 @@
       <w:spacing w:after="0" w:line="240" w:lineRule="auto"/>
     </w:pPr>
     <w:rPr>
-      <w:color w:val="000000" w:themeColor="text1"/>
+      <w:color w:themeColor="text1"/>
     </w:rPr>
     <w:tblPr>
       <w:tblStyleRowBandSize w:val="1"/>
@@ -11968,7 +12124,7 @@
       <w:rPr>
         <w:b/>
         <w:bCs/>
-        <w:color w:val="ffffff" w:themeColor="background1"/>
+        <w:color w:themeColor="background1"/>
       </w:rPr>
       <w:tblPr/>
       <w:tcPr>
@@ -11980,7 +12136,7 @@
     </w:tblStylePr>
     <w:tblStylePr w:type="firstCol">
       <w:rPr>
-        <w:color w:val="ffffff" w:themeColor="background1"/>
+        <w:color w:themeColor="background1"/>
       </w:rPr>
       <w:tblPr/>
       <w:tcPr>
@@ -11997,7 +12153,7 @@
     </w:tblStylePr>
     <w:tblStylePr w:type="lastCol">
       <w:rPr>
-        <w:color w:val="ffffff" w:themeColor="background1"/>
+        <w:color w:themeColor="background1"/>
       </w:rPr>
       <w:tblPr/>
       <w:tcPr>
@@ -12034,7 +12190,7 @@
       <w:spacing w:after="0" w:line="240" w:lineRule="auto"/>
     </w:pPr>
     <w:rPr>
-      <w:color w:val="000000" w:themeColor="text1"/>
+      <w:color w:themeColor="text1"/>
     </w:rPr>
     <w:tblPr>
       <w:tblStyleRowBandSize w:val="1"/>
@@ -12079,7 +12235,7 @@
       <w:rPr>
         <w:b/>
         <w:bCs/>
-        <w:color w:val="ffffff" w:themeColor="background1"/>
+        <w:color w:themeColor="background1"/>
       </w:rPr>
       <w:tblPr/>
       <w:tcPr>
@@ -12091,7 +12247,7 @@
     </w:tblStylePr>
     <w:tblStylePr w:type="firstCol">
       <w:rPr>
-        <w:color w:val="ffffff" w:themeColor="background1"/>
+        <w:color w:themeColor="background1"/>
       </w:rPr>
       <w:tblPr/>
       <w:tcPr>
@@ -12108,7 +12264,7 @@
     </w:tblStylePr>
     <w:tblStylePr w:type="lastCol">
       <w:rPr>
-        <w:color w:val="ffffff" w:themeColor="background1"/>
+        <w:color w:themeColor="background1"/>
       </w:rPr>
       <w:tblPr/>
       <w:tcPr>
@@ -12137,13 +12293,13 @@
     </w:tblStylePr>
     <w:tblStylePr w:type="neCell">
       <w:rPr>
-        <w:color w:val="000000" w:themeColor="text1"/>
+        <w:color w:themeColor="text1"/>
       </w:rPr>
       <w:tblPr/>
     </w:tblStylePr>
     <w:tblStylePr w:type="nwCell">
       <w:rPr>
-        <w:color w:val="000000" w:themeColor="text1"/>
+        <w:color w:themeColor="text1"/>
       </w:rPr>
       <w:tblPr/>
     </w:tblStylePr>
@@ -12157,7 +12313,7 @@
       <w:spacing w:after="0" w:line="240" w:lineRule="auto"/>
     </w:pPr>
     <w:rPr>
-      <w:color w:val="000000" w:themeColor="text1"/>
+      <w:color w:themeColor="text1"/>
     </w:rPr>
     <w:tblPr>
       <w:tblStyleRowBandSize w:val="1"/>
@@ -12202,7 +12358,7 @@
       <w:rPr>
         <w:b/>
         <w:bCs/>
-        <w:color w:val="ffffff" w:themeColor="background1"/>
+        <w:color w:themeColor="background1"/>
       </w:rPr>
       <w:tblPr/>
       <w:tcPr>
@@ -12214,7 +12370,7 @@
     </w:tblStylePr>
     <w:tblStylePr w:type="firstCol">
       <w:rPr>
-        <w:color w:val="ffffff" w:themeColor="background1"/>
+        <w:color w:themeColor="background1"/>
       </w:rPr>
       <w:tblPr/>
       <w:tcPr>
@@ -12231,7 +12387,7 @@
     </w:tblStylePr>
     <w:tblStylePr w:type="lastCol">
       <w:rPr>
-        <w:color w:val="ffffff" w:themeColor="background1"/>
+        <w:color w:themeColor="background1"/>
       </w:rPr>
       <w:tblPr/>
       <w:tcPr>
@@ -12260,13 +12416,13 @@
     </w:tblStylePr>
     <w:tblStylePr w:type="neCell">
       <w:rPr>
-        <w:color w:val="000000" w:themeColor="text1"/>
+        <w:color w:themeColor="text1"/>
       </w:rPr>
       <w:tblPr/>
     </w:tblStylePr>
     <w:tblStylePr w:type="nwCell">
       <w:rPr>
-        <w:color w:val="000000" w:themeColor="text1"/>
+        <w:color w:themeColor="text1"/>
       </w:rPr>
       <w:tblPr/>
     </w:tblStylePr>
@@ -12280,7 +12436,7 @@
       <w:spacing w:after="0" w:line="240" w:lineRule="auto"/>
     </w:pPr>
     <w:rPr>
-      <w:color w:val="000000" w:themeColor="text1"/>
+      <w:color w:themeColor="text1"/>
     </w:rPr>
     <w:tblPr>
       <w:tblStyleRowBandSize w:val="1"/>
@@ -12325,7 +12481,7 @@
       <w:rPr>
         <w:b/>
         <w:bCs/>
-        <w:color w:val="ffffff" w:themeColor="background1"/>
+        <w:color w:themeColor="background1"/>
       </w:rPr>
       <w:tblPr/>
       <w:tcPr>
@@ -12337,7 +12493,7 @@
     </w:tblStylePr>
     <w:tblStylePr w:type="firstCol">
       <w:rPr>
-        <w:color w:val="ffffff" w:themeColor="background1"/>
+        <w:color w:themeColor="background1"/>
       </w:rPr>
       <w:tblPr/>
       <w:tcPr>
@@ -12354,7 +12510,7 @@
     </w:tblStylePr>
     <w:tblStylePr w:type="lastCol">
       <w:rPr>
-        <w:color w:val="ffffff" w:themeColor="background1"/>
+        <w:color w:themeColor="background1"/>
       </w:rPr>
       <w:tblPr/>
       <w:tcPr>
@@ -12383,13 +12539,13 @@
     </w:tblStylePr>
     <w:tblStylePr w:type="neCell">
       <w:rPr>
-        <w:color w:val="000000" w:themeColor="text1"/>
+        <w:color w:themeColor="text1"/>
       </w:rPr>
       <w:tblPr/>
     </w:tblStylePr>
     <w:tblStylePr w:type="nwCell">
       <w:rPr>
-        <w:color w:val="000000" w:themeColor="text1"/>
+        <w:color w:themeColor="text1"/>
       </w:rPr>
       <w:tblPr/>
     </w:tblStylePr>
@@ -12403,7 +12559,7 @@
       <w:spacing w:after="0" w:line="240" w:lineRule="auto"/>
     </w:pPr>
     <w:rPr>
-      <w:color w:val="000000" w:themeColor="text1"/>
+      <w:color w:themeColor="text1"/>
     </w:rPr>
     <w:tblPr>
       <w:tblStyleRowBandSize w:val="1"/>
@@ -12422,7 +12578,7 @@
       <w:rPr>
         <w:b/>
         <w:bCs/>
-        <w:color w:val="ffffff" w:themeColor="background1"/>
+        <w:color w:themeColor="background1"/>
       </w:rPr>
       <w:tblPr/>
       <w:tcPr>
@@ -12436,7 +12592,7 @@
       <w:rPr>
         <w:b/>
         <w:bCs/>
-        <w:color w:val="9e3a38" w:themeColor="accent2" w:themeShade="cc"/>
+        <w:color w:themeColor="accent2" w:themeShade="cc"/>
       </w:rPr>
       <w:tblPr/>
       <w:tcPr>
@@ -12490,7 +12646,7 @@
       <w:spacing w:after="0" w:line="240" w:lineRule="auto"/>
     </w:pPr>
     <w:rPr>
-      <w:color w:val="000000" w:themeColor="text1"/>
+      <w:color w:themeColor="text1"/>
     </w:rPr>
     <w:tblPr>
       <w:tblStyleRowBandSize w:val="1"/>
@@ -12509,7 +12665,7 @@
       <w:rPr>
         <w:b/>
         <w:bCs/>
-        <w:color w:val="ffffff" w:themeColor="background1"/>
+        <w:color w:themeColor="background1"/>
       </w:rPr>
       <w:tblPr/>
       <w:tcPr>
@@ -12523,7 +12679,7 @@
       <w:rPr>
         <w:b/>
         <w:bCs/>
-        <w:color w:val="9e3a38" w:themeColor="accent2" w:themeShade="cc"/>
+        <w:color w:themeColor="accent2" w:themeShade="cc"/>
       </w:rPr>
       <w:tblPr/>
       <w:tcPr>
@@ -12577,7 +12733,7 @@
       <w:spacing w:after="0" w:line="240" w:lineRule="auto"/>
     </w:pPr>
     <w:rPr>
-      <w:color w:val="000000" w:themeColor="text1"/>
+      <w:color w:themeColor="text1"/>
     </w:rPr>
     <w:tblPr>
       <w:tblStyleRowBandSize w:val="1"/>
@@ -12596,7 +12752,7 @@
       <w:rPr>
         <w:b/>
         <w:bCs/>
-        <w:color w:val="ffffff" w:themeColor="background1"/>
+        <w:color w:themeColor="background1"/>
       </w:rPr>
       <w:tblPr/>
       <w:tcPr>
@@ -12610,7 +12766,7 @@
       <w:rPr>
         <w:b/>
         <w:bCs/>
-        <w:color w:val="9e3a38" w:themeColor="accent2" w:themeShade="cc"/>
+        <w:color w:themeColor="accent2" w:themeShade="cc"/>
       </w:rPr>
       <w:tblPr/>
       <w:tcPr>
@@ -12664,7 +12820,7 @@
       <w:spacing w:after="0" w:line="240" w:lineRule="auto"/>
     </w:pPr>
     <w:rPr>
-      <w:color w:val="000000" w:themeColor="text1"/>
+      <w:color w:themeColor="text1"/>
     </w:rPr>
     <w:tblPr>
       <w:tblStyleRowBandSize w:val="1"/>
@@ -12683,7 +12839,7 @@
       <w:rPr>
         <w:b/>
         <w:bCs/>
-        <w:color w:val="ffffff" w:themeColor="background1"/>
+        <w:color w:themeColor="background1"/>
       </w:rPr>
       <w:tblPr/>
       <w:tcPr>
@@ -12697,7 +12853,7 @@
       <w:rPr>
         <w:b/>
         <w:bCs/>
-        <w:color w:val="664e82" w:themeColor="accent4" w:themeShade="cc"/>
+        <w:color w:themeColor="accent4" w:themeShade="cc"/>
       </w:rPr>
       <w:tblPr/>
       <w:tcPr>
@@ -12751,7 +12907,7 @@
       <w:spacing w:after="0" w:line="240" w:lineRule="auto"/>
     </w:pPr>
     <w:rPr>
-      <w:color w:val="000000" w:themeColor="text1"/>
+      <w:color w:themeColor="text1"/>
     </w:rPr>
     <w:tblPr>
       <w:tblStyleRowBandSize w:val="1"/>
@@ -12770,7 +12926,7 @@
       <w:rPr>
         <w:b/>
         <w:bCs/>
-        <w:color w:val="ffffff" w:themeColor="background1"/>
+        <w:color w:themeColor="background1"/>
       </w:rPr>
       <w:tblPr/>
       <w:tcPr>
@@ -12784,7 +12940,7 @@
       <w:rPr>
         <w:b/>
         <w:bCs/>
-        <w:color w:val="7e9c40" w:themeColor="accent3" w:themeShade="cc"/>
+        <w:color w:themeColor="accent3" w:themeShade="cc"/>
       </w:rPr>
       <w:tblPr/>
       <w:tcPr>
@@ -12838,7 +12994,7 @@
       <w:spacing w:after="0" w:line="240" w:lineRule="auto"/>
     </w:pPr>
     <w:rPr>
-      <w:color w:val="000000" w:themeColor="text1"/>
+      <w:color w:themeColor="text1"/>
     </w:rPr>
     <w:tblPr>
       <w:tblStyleRowBandSize w:val="1"/>
@@ -12857,7 +13013,7 @@
       <w:rPr>
         <w:b/>
         <w:bCs/>
-        <w:color w:val="ffffff" w:themeColor="background1"/>
+        <w:color w:themeColor="background1"/>
       </w:rPr>
       <w:tblPr/>
       <w:tcPr>
@@ -12871,7 +13027,7 @@
       <w:rPr>
         <w:b/>
         <w:bCs/>
-        <w:color w:val="f2730a" w:themeColor="accent6" w:themeShade="cc"/>
+        <w:color w:themeColor="accent6" w:themeShade="cc"/>
       </w:rPr>
       <w:tblPr/>
       <w:tcPr>
@@ -12925,7 +13081,7 @@
       <w:spacing w:after="0" w:line="240" w:lineRule="auto"/>
     </w:pPr>
     <w:rPr>
-      <w:color w:val="000000" w:themeColor="text1"/>
+      <w:color w:themeColor="text1"/>
     </w:rPr>
     <w:tblPr>
       <w:tblStyleRowBandSize w:val="1"/>
@@ -12944,7 +13100,7 @@
       <w:rPr>
         <w:b/>
         <w:bCs/>
-        <w:color w:val="ffffff" w:themeColor="background1"/>
+        <w:color w:themeColor="background1"/>
       </w:rPr>
       <w:tblPr/>
       <w:tcPr>
@@ -12958,7 +13114,7 @@
       <w:rPr>
         <w:b/>
         <w:bCs/>
-        <w:color w:val="348da5" w:themeColor="accent5" w:themeShade="cc"/>
+        <w:color w:themeColor="accent5" w:themeShade="cc"/>
       </w:rPr>
       <w:tblPr/>
       <w:tcPr>
@@ -13012,7 +13168,7 @@
       <w:spacing w:after="0" w:line="240" w:lineRule="auto"/>
     </w:pPr>
     <w:rPr>
-      <w:color w:val="000000" w:themeColor="text1"/>
+      <w:color w:themeColor="text1"/>
     </w:rPr>
     <w:tblPr>
       <w:tblStyleRowBandSize w:val="1"/>
@@ -13044,7 +13200,7 @@
       <w:rPr>
         <w:b/>
         <w:bCs/>
-        <w:color w:val="000000" w:themeColor="text1"/>
+        <w:color w:themeColor="text1"/>
       </w:rPr>
       <w:tblPr/>
       <w:tcPr>
@@ -13053,7 +13209,7 @@
     </w:tblStylePr>
     <w:tblStylePr w:type="firstCol">
       <w:rPr>
-        <w:color w:val="ffffff" w:themeColor="background1"/>
+        <w:color w:themeColor="background1"/>
       </w:rPr>
       <w:tblPr/>
       <w:tcPr>
@@ -13062,7 +13218,7 @@
     </w:tblStylePr>
     <w:tblStylePr w:type="lastCol">
       <w:rPr>
-        <w:color w:val="ffffff" w:themeColor="background1"/>
+        <w:color w:themeColor="background1"/>
       </w:rPr>
       <w:tblPr/>
       <w:tcPr>
@@ -13091,7 +13247,7 @@
       <w:spacing w:after="0" w:line="240" w:lineRule="auto"/>
     </w:pPr>
     <w:rPr>
-      <w:color w:val="000000" w:themeColor="text1"/>
+      <w:color w:themeColor="text1"/>
     </w:rPr>
     <w:tblPr>
       <w:tblStyleRowBandSize w:val="1"/>
@@ -13123,7 +13279,7 @@
       <w:rPr>
         <w:b/>
         <w:bCs/>
-        <w:color w:val="000000" w:themeColor="text1"/>
+        <w:color w:themeColor="text1"/>
       </w:rPr>
       <w:tblPr/>
       <w:tcPr>
@@ -13132,7 +13288,7 @@
     </w:tblStylePr>
     <w:tblStylePr w:type="firstCol">
       <w:rPr>
-        <w:color w:val="ffffff" w:themeColor="background1"/>
+        <w:color w:themeColor="background1"/>
       </w:rPr>
       <w:tblPr/>
       <w:tcPr>
@@ -13141,7 +13297,7 @@
     </w:tblStylePr>
     <w:tblStylePr w:type="lastCol">
       <w:rPr>
-        <w:color w:val="ffffff" w:themeColor="background1"/>
+        <w:color w:themeColor="background1"/>
       </w:rPr>
       <w:tblPr/>
       <w:tcPr>
@@ -13170,7 +13326,7 @@
       <w:spacing w:after="0" w:line="240" w:lineRule="auto"/>
     </w:pPr>
     <w:rPr>
-      <w:color w:val="000000" w:themeColor="text1"/>
+      <w:color w:themeColor="text1"/>
     </w:rPr>
     <w:tblPr>
       <w:tblStyleRowBandSize w:val="1"/>
@@ -13202,7 +13358,7 @@
       <w:rPr>
         <w:b/>
         <w:bCs/>
-        <w:color w:val="000000" w:themeColor="text1"/>
+        <w:color w:themeColor="text1"/>
       </w:rPr>
       <w:tblPr/>
       <w:tcPr>
@@ -13211,7 +13367,7 @@
     </w:tblStylePr>
     <w:tblStylePr w:type="firstCol">
       <w:rPr>
-        <w:color w:val="ffffff" w:themeColor="background1"/>
+        <w:color w:themeColor="background1"/>
       </w:rPr>
       <w:tblPr/>
       <w:tcPr>
@@ -13220,7 +13376,7 @@
     </w:tblStylePr>
     <w:tblStylePr w:type="lastCol">
       <w:rPr>
-        <w:color w:val="ffffff" w:themeColor="background1"/>
+        <w:color w:themeColor="background1"/>
       </w:rPr>
       <w:tblPr/>
       <w:tcPr>
@@ -13249,7 +13405,7 @@
       <w:spacing w:after="0" w:line="240" w:lineRule="auto"/>
     </w:pPr>
     <w:rPr>
-      <w:color w:val="000000" w:themeColor="text1"/>
+      <w:color w:themeColor="text1"/>
     </w:rPr>
     <w:tblPr>
       <w:tblStyleRowBandSize w:val="1"/>
@@ -13281,7 +13437,7 @@
       <w:rPr>
         <w:b/>
         <w:bCs/>
-        <w:color w:val="000000" w:themeColor="text1"/>
+        <w:color w:themeColor="text1"/>
       </w:rPr>
       <w:tblPr/>
       <w:tcPr>
@@ -13290,7 +13446,7 @@
     </w:tblStylePr>
     <w:tblStylePr w:type="firstCol">
       <w:rPr>
-        <w:color w:val="ffffff" w:themeColor="background1"/>
+        <w:color w:themeColor="background1"/>
       </w:rPr>
       <w:tblPr/>
       <w:tcPr>
@@ -13299,7 +13455,7 @@
     </w:tblStylePr>
     <w:tblStylePr w:type="lastCol">
       <w:rPr>
-        <w:color w:val="ffffff" w:themeColor="background1"/>
+        <w:color w:themeColor="background1"/>
       </w:rPr>
       <w:tblPr/>
       <w:tcPr>
@@ -13328,7 +13484,7 @@
       <w:spacing w:after="0" w:line="240" w:lineRule="auto"/>
     </w:pPr>
     <w:rPr>
-      <w:color w:val="000000" w:themeColor="text1"/>
+      <w:color w:themeColor="text1"/>
     </w:rPr>
     <w:tblPr>
       <w:tblStyleRowBandSize w:val="1"/>
@@ -13360,7 +13516,7 @@
       <w:rPr>
         <w:b/>
         <w:bCs/>
-        <w:color w:val="000000" w:themeColor="text1"/>
+        <w:color w:themeColor="text1"/>
       </w:rPr>
       <w:tblPr/>
       <w:tcPr>
@@ -13369,7 +13525,7 @@
     </w:tblStylePr>
     <w:tblStylePr w:type="firstCol">
       <w:rPr>
-        <w:color w:val="ffffff" w:themeColor="background1"/>
+        <w:color w:themeColor="background1"/>
       </w:rPr>
       <w:tblPr/>
       <w:tcPr>
@@ -13378,7 +13534,7 @@
     </w:tblStylePr>
     <w:tblStylePr w:type="lastCol">
       <w:rPr>
-        <w:color w:val="ffffff" w:themeColor="background1"/>
+        <w:color w:themeColor="background1"/>
       </w:rPr>
       <w:tblPr/>
       <w:tcPr>
@@ -13407,7 +13563,7 @@
       <w:spacing w:after="0" w:line="240" w:lineRule="auto"/>
     </w:pPr>
     <w:rPr>
-      <w:color w:val="000000" w:themeColor="text1"/>
+      <w:color w:themeColor="text1"/>
     </w:rPr>
     <w:tblPr>
       <w:tblStyleRowBandSize w:val="1"/>
@@ -13439,7 +13595,7 @@
       <w:rPr>
         <w:b/>
         <w:bCs/>
-        <w:color w:val="000000" w:themeColor="text1"/>
+        <w:color w:themeColor="text1"/>
       </w:rPr>
       <w:tblPr/>
       <w:tcPr>
@@ -13448,7 +13604,7 @@
     </w:tblStylePr>
     <w:tblStylePr w:type="firstCol">
       <w:rPr>
-        <w:color w:val="ffffff" w:themeColor="background1"/>
+        <w:color w:themeColor="background1"/>
       </w:rPr>
       <w:tblPr/>
       <w:tcPr>
@@ -13457,7 +13613,7 @@
     </w:tblStylePr>
     <w:tblStylePr w:type="lastCol">
       <w:rPr>
-        <w:color w:val="ffffff" w:themeColor="background1"/>
+        <w:color w:themeColor="background1"/>
       </w:rPr>
       <w:tblPr/>
       <w:tcPr>
@@ -13486,7 +13642,7 @@
       <w:spacing w:after="0" w:line="240" w:lineRule="auto"/>
     </w:pPr>
     <w:rPr>
-      <w:color w:val="000000" w:themeColor="text1"/>
+      <w:color w:themeColor="text1"/>
     </w:rPr>
     <w:tblPr>
       <w:tblStyleRowBandSize w:val="1"/>
@@ -13518,7 +13674,7 @@
       <w:rPr>
         <w:b/>
         <w:bCs/>
-        <w:color w:val="000000" w:themeColor="text1"/>
+        <w:color w:themeColor="text1"/>
       </w:rPr>
       <w:tblPr/>
       <w:tcPr>
@@ -13527,7 +13683,7 @@
     </w:tblStylePr>
     <w:tblStylePr w:type="firstCol">
       <w:rPr>
-        <w:color w:val="ffffff" w:themeColor="background1"/>
+        <w:color w:themeColor="background1"/>
       </w:rPr>
       <w:tblPr/>
       <w:tcPr>
@@ -13536,7 +13692,7 @@
     </w:tblStylePr>
     <w:tblStylePr w:type="lastCol">
       <w:rPr>
-        <w:color w:val="ffffff" w:themeColor="background1"/>
+        <w:color w:themeColor="background1"/>
       </w:rPr>
       <w:tblPr/>
       <w:tcPr>
@@ -13567,34 +13723,34 @@
         <a:srgbClr val="000000"/>
       </a:dk1>
       <a:lt1>
-        <a:srgbClr val="FFFFFF"/>
+        <a:srgbClr val="ffffff"/>
       </a:lt1>
       <a:dk2>
-        <a:srgbClr val="1F497D"/>
+        <a:srgbClr val="1f497d"/>
       </a:dk2>
       <a:lt2>
-        <a:srgbClr val="EEECE1"/>
+        <a:srgbClr val="eeece1"/>
       </a:lt2>
       <a:accent1>
-        <a:srgbClr val="4F81BD"/>
+        <a:srgbClr val="4f81bd"/>
       </a:accent1>
       <a:accent2>
-        <a:srgbClr val="C0504D"/>
+        <a:srgbClr val="c0504d"/>
       </a:accent2>
       <a:accent3>
-        <a:srgbClr val="9BBB59"/>
+        <a:srgbClr val="9bbb59"/>
       </a:accent3>
       <a:accent4>
-        <a:srgbClr val="8064A2"/>
+        <a:srgbClr val="8064a2"/>
       </a:accent4>
       <a:accent5>
-        <a:srgbClr val="4BACC6"/>
+        <a:srgbClr val="4bacc6"/>
       </a:accent5>
       <a:accent6>
-        <a:srgbClr val="F79646"/>
+        <a:srgbClr val="f79646"/>
       </a:accent6>
       <a:hlink>
-        <a:srgbClr val="0000FF"/>
+        <a:srgbClr val="0000ff"/>
       </a:hlink>
       <a:folHlink>
         <a:srgbClr val="800080"/>

</xml_diff>